<commit_message>
Actualizar inicio de materia en 7mo EGB a Orígenes de la escritura (Pág 12, DCD LL.3.1.1) y secuencia completa de Unidad 1
</commit_message>
<xml_diff>
--- a/PLANIFICACION_MICROCURRICULAR_7MO_LENGUA_1ER_TRIMESTRE.docx
+++ b/PLANIFICACION_MICROCURRICULAR_7MO_LENGUA_1ER_TRIMESTRE.docx
@@ -1639,10 +1639,7 @@
           </w:tcPr>
           <w:p>
             <w:r>
-              <w:t>LL.3.3.5. Valorar los aspectos de forma y el contenido de un texto, a partir de criterios preestablecidos.</w:t>
-              <w:br/>
-              <w:br/>
-              <w:t>LL.3.3.8. Leer con fluidez y entonación en diversos contextos y con diferentes propósitos.</w:t>
+              <w:t>LL.3.1.1. Participar en contextos y situaciones que evidencien la funcionalidad de la lengua escrita como herramienta cultural.</w:t>
             </w:r>
           </w:p>
         </w:tc>
@@ -1654,20 +1651,18 @@
           </w:tcPr>
           <w:p>
             <w:r>
-              <w:t>Tema: Leo para acercarme a la ciencia (textos de divulgación científica) y Uso de la biblioteca escolar</w:t>
+              <w:t>Tema: Lengua y Cultura: Orígenes de la escritura (de las pinturas rupestres a la era digital)</w:t>
               <w:br/>
               <w:br/>
               <w:t>Materiales:</w:t>
               <w:br/>
-              <w:t>Texto de Lengua 7mo (Páginas 26 a 37)</w:t>
+              <w:t>Texto de Lengua 7mo (Páginas 12 a 18)</w:t>
               <w:br/>
               <w:t>Pizarra y marcadores de colores</w:t>
               <w:br/>
-              <w:t>Cuadernos</w:t>
-              <w:br/>
-              <w:t>Fichas de préstamo de biblioteca escolar</w:t>
-              <w:br/>
-              <w:t>Guía Docente pág. 12-14</w:t>
+              <w:t>Cuadernos de trabajo</w:t>
+              <w:br/>
+              <w:t>Guía Docente Maya/MinEduc pág. 12</w:t>
             </w:r>
           </w:p>
         </w:tc>
@@ -1732,7 +1727,9 @@
                 <w:b w:val="0"/>
                 <w:sz w:val="20"/>
               </w:rPr>
-              <w:t>El docente solicita a los estudiantes abrir el libro en la página 26 y observar la ilustración de apertura ("Leo para acercarme a la ciencia: huellas del pasado y fósiles"). Lee en voz alta un fragmento sobre hallazgos paleontológicos y plantea preguntas: ¿Qué estudia la paleontología?, ¿cómo sabemos que existieron los dinosaurios?, ¿dónde encontramos artículos científicos confiables?</w:t>
+              <w:t>El docente solicita a los estudiantes abrir el libro en la página 12 y observar las imágenes iniciales: pinturas rupestres con cazadores y fauna, alfabetos primitivos, jeroglíficos, escriba egipcio, caligrafía del abecedario y un estudiante frente a una computadora moderna.</w:t>
+              <w:br/>
+              <w:t>Preguntas detonantes de la sección "Mi experiencia": ¿Qué conoces sobre las primeras formas de escritura?, ¿cómo ha evolucionado la escritura en el tiempo?, ¿en tu cotidianidad, para qué usas la palabra escrita?, ¿crees que actualmente la palabra escrita tiene más valor que la palabra oral? ¿Por qué?</w:t>
             </w:r>
           </w:p>
           <w:p>
@@ -1758,7 +1755,7 @@
                 <w:b w:val="0"/>
                 <w:sz w:val="20"/>
               </w:rPr>
-              <w:t>El docente reflexiona con los estudiantes sobre la honestidad académica, el valor de la verdad científica frente a noticias falsas (fake news) y el respeto a la propiedad intelectual al consultar fuentes bibliográficas.</w:t>
+              <w:t>Reflexión sobre el valor de la palabra escrita para preservar la memoria, los acuerdos comunitarios, las leyes y los derechos humanos a lo largo de la historia de los pueblos.</w:t>
             </w:r>
           </w:p>
           <w:p>
@@ -1784,11 +1781,11 @@
                 <w:b w:val="0"/>
                 <w:sz w:val="20"/>
               </w:rPr>
-              <w:t>Representación: ilustración del texto pág. 26, lectura modelo guiada con entonación y paratextos.</w:t>
-              <w:br/>
-              <w:t>Acción/expresión: lluvia de ideas oral, comentarios sobre fósiles y documentales.</w:t>
-              <w:br/>
-              <w:t>Motivación: curiosidad científica y activación de saberes previos del entorno natural.</w:t>
+              <w:t>Representación: ilustración paratextual histórica de la pág. 12, lectura en voz alta comentada.</w:t>
+              <w:br/>
+              <w:t>Acción/expresión: participación oral y lluvia de ideas sobre situaciones donde usamos la escritura hoy.</w:t>
+              <w:br/>
+              <w:t>Motivación: curiosidad sobre cómo se comunicaban los seres humanos hace miles de años.</w:t>
             </w:r>
           </w:p>
           <w:p>
@@ -1814,7 +1811,7 @@
                 <w:b w:val="0"/>
                 <w:sz w:val="20"/>
               </w:rPr>
-              <w:t>El docente guía la lectura comentada del artículo de divulgación científica de las páginas 28 a 31. Formula preguntas de análisis: ¿Cuál es el propósito comunicativo de un texto de divulgación?, ¿en qué se diferencia de un cuento o mito?, ¿qué vocabulario técnico utiliza? Los estudiantes identifican que no todos los textos comunican lo mismo y que los textos científicos buscan informar con rigor.</w:t>
+              <w:t>El docente guía la lectura y diálogo de la situación comunicativa inicial: ¿Por qué sintió el ser humano la necesidad de crear un sistema gráfico si ya existía la comunicación oral? Los estudiantes deducen que las palabras orales se las lleva el viento, mientras que la escritura permite registrar cosechas, leyes, transacciones y conocimientos sin que se deformen con el paso de los siglos.</w:t>
             </w:r>
           </w:p>
           <w:p>
@@ -1840,11 +1837,11 @@
                 <w:b w:val="0"/>
                 <w:sz w:val="20"/>
               </w:rPr>
-              <w:t>Representación: lectura paratextual (títulos, subtítulos, fotografías, pies de foto, glosario).</w:t>
-              <w:br/>
-              <w:t>Acción/expresión: respuestas a preguntas inferenciales de la pág. 32.</w:t>
-              <w:br/>
-              <w:t>Motivación: debate grupal sobre descubrimientos fósiles en el Ecuador y América Latina.</w:t>
+              <w:t>Representación: preguntas de análisis proyectadas y anotadas en pizarra.</w:t>
+              <w:br/>
+              <w:t>Acción/expresión: debate moderado en parejas y exposición de conclusiones.</w:t>
+              <w:br/>
+              <w:t>Motivación: descubrimiento reflexivo de la utilidad social de la escritura.</w:t>
             </w:r>
           </w:p>
           <w:p>
@@ -1870,17 +1867,19 @@
                 <w:b w:val="0"/>
                 <w:sz w:val="20"/>
               </w:rPr>
-              <w:t>Con la mediación del docente, los estudiantes identifican la silueta y estructura del artículo científico: título, introducción, desarrollo con datos comprobables, conclusiones y fuentes consultadas (pág. 33).</w:t>
-              <w:br/>
-              <w:t>En la pizarra se construye un organizador gráfico (esquema de llaves) que los estudiantes completan en sus cuadernos:</w:t>
-              <w:br/>
-              <w:t>1. Definición de texto de divulgación científica.</w:t>
-              <w:br/>
-              <w:t>2. Características (claridad, objetividad, rigor científico).</w:t>
-              <w:br/>
-              <w:t>3. Estructura textual.</w:t>
-              <w:br/>
-              <w:t>4. Uso y normas de la biblioteca escolar y fichas de préstamo (pág. 37).</w:t>
+              <w:t>Lectura analítica guiada de las páginas 13 a 17 del texto escolar sobre la evolución histórica de los soportes y sistemas de escritura:</w:t>
+              <w:br/>
+              <w:t>1. Arte rupestre y pictogramas.</w:t>
+              <w:br/>
+              <w:t>2. Escritura cuneiforme en tablillas de arcilla (Sumeria).</w:t>
+              <w:br/>
+              <w:t>3. Jeroglíficos y el papiro egipcio.</w:t>
+              <w:br/>
+              <w:t>4. Invención del alfabeto fenicio, griego y latino.</w:t>
+              <w:br/>
+              <w:t>5. El pergamino, el papel de trapo, la imprenta de Gutenberg y los medios digitales.</w:t>
+              <w:br/>
+              <w:t>Construcción en la pizarra de un organizador gráfico (Línea de Tiempo Ilustrada) que los estudiantes completan en sus cuadernos.</w:t>
             </w:r>
           </w:p>
           <w:p>
@@ -1906,11 +1905,11 @@
                 <w:b w:val="0"/>
                 <w:sz w:val="20"/>
               </w:rPr>
-              <w:t>Representación: organizador gráfico estructurado en pizarra con marcadores de colores.</w:t>
-              <w:br/>
-              <w:t>Acción/expresión: registro ordenado en el cuaderno y elaboración de una ficha modelo de préstamo bibliotecario.</w:t>
-              <w:br/>
-              <w:t>Motivación: rol activo como pequeños investigadores científicos.</w:t>
+              <w:t>Representación: organizador gráfico cronológico en pizarra con marcadores de colores.</w:t>
+              <w:br/>
+              <w:t>Acción/expresión: registro ordenado en el cuaderno con glosario de términos (pictograma, ideograma, cuneiforme).</w:t>
+              <w:br/>
+              <w:t>Motivación: visión histórica integral de la evolución cultural humana.</w:t>
             </w:r>
           </w:p>
           <w:p>
@@ -1936,9 +1935,13 @@
                 <w:b w:val="0"/>
                 <w:sz w:val="20"/>
               </w:rPr>
-              <w:t>Los estudiantes resuelven las actividades de comprensión lectora y valoración crítica de las páginas 34 a 36 del libro.</w:t>
-              <w:br/>
-              <w:t>En parejas, seleccionan un libro informativo de la biblioteca escolar del aula y llenan una ficha de registro bibliotecario (pág. 37). Coevaluación guiada y socialización en plenaria. (Nota: Viernes 09 de Octubre: Feriado por la Independencia de Guayaquil).</w:t>
+              <w:t>Los estudiantes resuelven de forma autónoma el taller de aplicación de la página 18 del texto escolar:</w:t>
+              <w:br/>
+              <w:t>- Descifran el mensaje secreto utilizando el código de sustitución alfabética.</w:t>
+              <w:br/>
+              <w:t>- Escriben en su cuaderno un párrafo reflexivo respondiendo: "¿Por qué la lengua escrita es una herramienta cultural imprescindible en mi vida escolar y familiar?"</w:t>
+              <w:br/>
+              <w:t>Coevaluación en parejas y socialización. (Nota: Viernes 09 de Octubre: Feriado por la Independencia de Guayaquil).</w:t>
             </w:r>
           </w:p>
           <w:p>
@@ -1964,11 +1967,11 @@
                 <w:b w:val="0"/>
                 <w:sz w:val="20"/>
               </w:rPr>
-              <w:t>Representación: consignas impresas del texto y plantilla de ficha bibliográfica.</w:t>
-              <w:br/>
-              <w:t>Acción/expresión: trabajo cooperativo en parejas, redacción de respuestas y socialización.</w:t>
-              <w:br/>
-              <w:t>Motivación: autogestión y fomento del hábito lector autónomo.</w:t>
+              <w:t>Representación: actividad lúdica de criptografía y descifrado de códigos en pág. 18.</w:t>
+              <w:br/>
+              <w:t>Acción/expresión: redacción breve en el cuaderno y retroalimentación entre pares.</w:t>
+              <w:br/>
+              <w:t>Motivación: reto lúdico de resolución y afianzamiento del aprendizaje.</w:t>
             </w:r>
           </w:p>
         </w:tc>
@@ -1984,7 +1987,7 @@
           </w:tcPr>
           <w:p>
             <w:r>
-              <w:t>Realiza inferencias fundamentales y proyectivo-valorativas, valora los contenidos y aspectos de forma a partir de criterios preestablecidos, al monitorear y autorregular su comprensión mediante el uso de estrategias cognitivas. I.LL.3.3.2.</w:t>
+              <w:t>Reconoce la funcionalidad de la lengua escrita como manifestación cultural y de identidad en diferentes contextos y situaciones, atendiendo a la diversidad lingüística del Ecuador. I.LL.3.1.1.</w:t>
             </w:r>
           </w:p>
         </w:tc>
@@ -1999,9 +2002,9 @@
           </w:tcPr>
           <w:p>
             <w:r>
-              <w:t>Técnica: Análisis del desempeño y observación directa.</w:t>
-              <w:br/>
-              <w:t>Instrumento: Rúbrica de comprensión lectora y ficha de préstamo bibliotecario evaluada (actividades págs. 34-37).</w:t>
+              <w:t>• Instrumentos: Rúbrica de participación oral y taller de aplicación del texto (pág. 18).</w:t>
+              <w:br/>
+              <w:t>• Actividades: Descifrado de códigos, línea de tiempo en el cuaderno y respuestas a preguntas reflexivas.</w:t>
             </w:r>
           </w:p>
         </w:tc>
@@ -2018,10 +2021,7 @@
           </w:tcPr>
           <w:p>
             <w:r>
-              <w:t>LL.3.4.1. Relatar textos con secuencia lógica, manejo de conectores y coherencia en el uso de la persona y el tiempo verbal.</w:t>
-              <w:br/>
-              <w:br/>
-              <w:t>LL.3.4.6. Autorregular la producción escrita mediante el uso habitual del proceso de planificación, redacción y revisión.</w:t>
+              <w:t>LL.3.2.1. Escuchar discursos orales y formular juicios de valor con respecto a su contenido y forma, y participar de manera respetuosa frente a las intervenciones de los demás.</w:t>
             </w:r>
           </w:p>
         </w:tc>
@@ -2033,18 +2033,18 @@
           </w:tcPr>
           <w:p>
             <w:r>
-              <w:t>Tema: Escribo una nota científica (estructura, planificación y redacción) y El verbo (persona, número, tiempo)</w:t>
+              <w:t>Tema: Comunicación Oral: Discursos y juicios de valor / Taller: "Hoy me convertiré en vendedor de sueños"</w:t>
               <w:br/>
               <w:br/>
               <w:t>Materiales:</w:t>
               <w:br/>
-              <w:t>Texto de Lengua 7mo (Páginas 38 a 47)</w:t>
+              <w:t>Texto de Lengua 7mo (Páginas 19 a 25)</w:t>
               <w:br/>
               <w:t>Pizarra y marcadores de colores</w:t>
               <w:br/>
+              <w:t>Guía Docente pág. 13</w:t>
+              <w:br/>
               <w:t>Cuadernos</w:t>
-              <w:br/>
-              <w:t>Fichas de planificación textual</w:t>
             </w:r>
           </w:p>
         </w:tc>
@@ -2109,20 +2109,20 @@
                 <w:b w:val="0"/>
                 <w:sz w:val="20"/>
               </w:rPr>
-              <w:t>El docente ambienta la clase motivando al grupo a imaginar la preparación de una revista escolar para la Feria de Ciencias (pág. 38). Plantea preguntas: ¿Sobre qué fenómeno natural o avance tecnológico les gustaría informar?, ¿qué pasos seguimos antes de escribir un artículo para que sea claro y confiable?</w:t>
-            </w:r>
-          </w:p>
-          <w:p>
-            <w:pPr>
-              <w:spacing w:after="40" w:before="20"/>
-            </w:pPr>
-            <w:r>
-              <w:rPr>
-                <w:rFonts w:ascii="Times New Roman" w:hAnsi="Times New Roman"/>
-                <w:b/>
-                <w:sz w:val="20"/>
-              </w:rPr>
-              <w:t>Inserción Educación para la Seguridad Vial y Movilidad Sostenible:</w:t>
+              <w:t>El docente invita a observar la escena de la página 19 ("¿Prepararon ya su discurso para la Semana de la Expresión Oral?"). Preguntas detonantes: ¿Cómo te sientes cuando hablas en público?, ¿qué es lo más importante al expresar tus ideas ante otras personas?, ¿qué oradores históricos conoces? (ej. Martin Luther King, Manuela Espejo).</w:t>
+            </w:r>
+          </w:p>
+          <w:p>
+            <w:pPr>
+              <w:spacing w:after="40" w:before="20"/>
+            </w:pPr>
+            <w:r>
+              <w:rPr>
+                <w:rFonts w:ascii="Times New Roman" w:hAnsi="Times New Roman"/>
+                <w:b/>
+                <w:sz w:val="20"/>
+              </w:rPr>
+              <w:t>Inserción Educación Socioemocional:</w:t>
             </w:r>
           </w:p>
           <w:p>
@@ -2135,7 +2135,7 @@
                 <w:b w:val="0"/>
                 <w:sz w:val="20"/>
               </w:rPr>
-              <w:t>Se propone como tema modelo de indagación científica el impacto del uso de la bicicleta y los vehículos de cero emisiones en la reducción de la huella de carbono y la movilidad activa en la ciudad.</w:t>
+              <w:t>Superación del miedo escénico, seguridad personal, respiración diafragmática y empatía hacia los compañeros que exponen sus opiniones.</w:t>
             </w:r>
           </w:p>
           <w:p>
@@ -2161,11 +2161,11 @@
                 <w:b w:val="0"/>
                 <w:sz w:val="20"/>
               </w:rPr>
-              <w:t>Representación: modelo de nota científica breve en el texto pág. 39.</w:t>
-              <w:br/>
-              <w:t>Acción/expresión: lluvia de ideas oral sobre innovaciones sostenibles.</w:t>
-              <w:br/>
-              <w:t>Motivación: vinculación con la ecología y el cuidado del planeta.</w:t>
+              <w:t>Representación: viñeta dialogada del libro pág. 19 y audición del fragmento del discurso "Yo tengo un sueño".</w:t>
+              <w:br/>
+              <w:t>Acción/expresión: lluvia de ideas oral sobre experiencias al hablar ante un auditorio.</w:t>
+              <w:br/>
+              <w:t>Motivación: identificación con los personajes que expresan dudas y anhelos.</w:t>
             </w:r>
           </w:p>
           <w:p>
@@ -2191,7 +2191,7 @@
                 <w:b w:val="0"/>
                 <w:sz w:val="20"/>
               </w:rPr>
-              <w:t>El docente analiza junto a los estudiantes el esquema de planificación de la página 40: propósito, destinatario, tipo de lenguaje y recopilación de datos objetivos. Se reflexiona sobre el papel del verbo en la redacción: ¿Qué palabras expresan las acciones y descubrimientos en una investigación? (ej: descubrieron, investigan, transformará).</w:t>
+              <w:t>Lectura y análisis del "Discurso de un niño" (págs. 20-21). Preguntas de reflexión crítica: ¿Cuál es el mensaje principal del emisor?, ¿qué tono utiliza?, ¿cómo influyen los gestos, la mirada y la modulación de la voz para conmover o convencer al público? Se analiza qué es un juicio de valor respetuoso sin ofender.</w:t>
             </w:r>
           </w:p>
           <w:p>
@@ -2217,11 +2217,11 @@
                 <w:b w:val="0"/>
                 <w:sz w:val="20"/>
               </w:rPr>
-              <w:t>Representación: tabla guía de planificación textual del texto.</w:t>
-              <w:br/>
-              <w:t>Acción/expresión: debate y selección del tema individual o en parejas.</w:t>
-              <w:br/>
-              <w:t>Motivación: libertad de elección temática con relevancia escolar.</w:t>
+              <w:t>Representación: texto del discurso adaptado y preguntas de comprensión inferencial.</w:t>
+              <w:br/>
+              <w:t>Acción/expresión: discusión guiada sobre cómo distinguir argumentos de simples opiniones.</w:t>
+              <w:br/>
+              <w:t>Motivación: valorar la voz infantil en temas de interés social.</w:t>
             </w:r>
           </w:p>
           <w:p>
@@ -2247,15 +2247,15 @@
                 <w:b w:val="0"/>
                 <w:sz w:val="20"/>
               </w:rPr>
-              <w:t>Explicación gramatical del verbo y sus accidentes gramaticales (págs. 42-45):</w:t>
-              <w:br/>
-              <w:t>- Persona (primera, segunda, tercera).</w:t>
-              <w:br/>
-              <w:t>- Número (singular y plural).</w:t>
-              <w:br/>
-              <w:t>- Tiempo (presente, pretérito/pasado, futuro).</w:t>
-              <w:br/>
-              <w:t>En la pizarra se construye un organizador gráfico (mapa conceptual y cuadro de doble entrada de conjugación verbal) que los estudiantes transcriben a sus cuadernos, identificando raíz y desinencia verbal.</w:t>
+              <w:t>El docente expone la estructura formal de un discurso oral (págs. 22-24):</w:t>
+              <w:br/>
+              <w:t>1. Introducción (saludo, captación de atención y presentación del tema).</w:t>
+              <w:br/>
+              <w:t>2. Desarrollo (argumentos fundamentados, anécdotas y evidencias claras).</w:t>
+              <w:br/>
+              <w:t>3. Conclusión (resumen de la idea central, llamada a la acción y despedida).</w:t>
+              <w:br/>
+              <w:t>Elaboración de un esquema resumen en el cuaderno con las pautas para emitir juicios de valor respetuosos.</w:t>
             </w:r>
           </w:p>
           <w:p>
@@ -2281,11 +2281,11 @@
                 <w:b w:val="0"/>
                 <w:sz w:val="20"/>
               </w:rPr>
-              <w:t>Representación: esquemas cromáticos en pizarra que diferencian raíz y terminaciones.</w:t>
-              <w:br/>
-              <w:t>Acción/expresión: completar tablas de conjugación y ejercicios de identificación de verbos.</w:t>
-              <w:br/>
-              <w:t>Motivación: dinámica lúdica "detectives de verbos".</w:t>
+              <w:t>Representación: mapa conceptual en pizarra que desglosa las tres partes del discurso.</w:t>
+              <w:br/>
+              <w:t>Acción/expresión: registro ordenado en cuadernos y formulación de juicios de valor orales modelo.</w:t>
+              <w:br/>
+              <w:t>Motivación: preparación para el rol activo de orador escolar.</w:t>
             </w:r>
           </w:p>
           <w:p>
@@ -2311,7 +2311,7 @@
                 <w:b w:val="0"/>
                 <w:sz w:val="20"/>
               </w:rPr>
-              <w:t>Los estudiantes redactan el primer borrador de su nota científica (págs. 46-47) aplicando la concordancia obligatoria entre sujeto y verbo. Desarrollan la revisión en parejas con una lista de cotejo básica (título claro, párrafos ordenados, verbos en tiempo adecuado).</w:t>
+              <w:t>Desarrollo del Taller de Comunicación Oral "Hoy me convertiré en vendedor de sueños" (pág. 25). En parejas, los estudiantes seleccionan un tema social o escolar, redactan un borrador breve con introducción, desarrollo y conclusión, y presentan una disertación de 2 minutos ante la clase aplicando contacto visual y modulación vocal. Coevaluación con escala estimativa.</w:t>
             </w:r>
           </w:p>
           <w:p>
@@ -2337,11 +2337,11 @@
                 <w:b w:val="0"/>
                 <w:sz w:val="20"/>
               </w:rPr>
-              <w:t>Representación: plantilla estructurada de redacción en 3 párrafos.</w:t>
-              <w:br/>
-              <w:t>Acción/expresión: producción escrita individual y coevaluación formativa.</w:t>
-              <w:br/>
-              <w:t>Motivación: satisfacción de crear un texto científico propio.</w:t>
+              <w:t>Representación: pauta paso a paso de la pág. 25 para organizar la exposición.</w:t>
+              <w:br/>
+              <w:t>Acción/expresión: presentación oral en parejas y retroalimentación positiva de la clase.</w:t>
+              <w:br/>
+              <w:t>Motivación: satisfacción de comunicar ideas propias y ser escuchados con respeto.</w:t>
             </w:r>
           </w:p>
         </w:tc>
@@ -2357,7 +2357,7 @@
           </w:tcPr>
           <w:p>
             <w:r>
-              <w:t>Produce textos informativos utilizando el proceso de escritura, elementos gramaticales apropiados (verbos en tiempo y persona adecuados) y estructura lógica. I.LL.3.6.1.</w:t>
+              <w:t>Escucha discursos orales, parafrasea su contenido, formula juicios de valor sobre su forma y participa de manera respetuosa frente a las intervenciones de los demás. I.LL.3.2.1.</w:t>
             </w:r>
           </w:p>
         </w:tc>
@@ -2372,9 +2372,9 @@
           </w:tcPr>
           <w:p>
             <w:r>
-              <w:t>Técnica: Análisis de la producción escrita.</w:t>
-              <w:br/>
-              <w:t>Instrumento: Lista de cotejo de planificación y borrador de la nota científica (págs. 40-47).</w:t>
+              <w:t>• Instrumentos: Rúbrica de expresión oral y lista de cotejo de juicios de valor.</w:t>
+              <w:br/>
+              <w:t>• Actividades: Presentación del taller "Vendedor de sueños" y análisis crítico del discurso leído.</w:t>
             </w:r>
           </w:p>
         </w:tc>
@@ -2391,10 +2391,10 @@
           </w:tcPr>
           <w:p>
             <w:r>
-              <w:t>LL.3.4.10. Expresar sus ideas con precisión e integrar en las producciones escritas los diferentes tipos de verbo, modos y tiempos.</w:t>
-              <w:br/>
-              <w:br/>
-              <w:t>LL.3.4.12. Comunicar ideas con eficiencia a partir de la aplicación de las reglas de puntuación (uso del punto y coma).</w:t>
+              <w:t>LL.3.3.5. Valorar los aspectos de forma y el contenido de un texto científico, a partir de criterios preestablecidos.</w:t>
+              <w:br/>
+              <w:br/>
+              <w:t>LL.3.3.8. Leer con fluidez y entonación en diversos contextos y con diferentes propósitos.</w:t>
             </w:r>
           </w:p>
         </w:tc>
@@ -2406,18 +2406,18 @@
           </w:tcPr>
           <w:p>
             <w:r>
-              <w:t>Tema: Modos verbales (indicativo, subjuntivo, imperativo), tiempos compuestos y Uso del punto y coma (;)</w:t>
+              <w:t>Tema: Lectura: Leo para acercarme a la ciencia (textos de divulgación científica) y Uso de la biblioteca escolar</w:t>
               <w:br/>
               <w:br/>
               <w:t>Materiales:</w:t>
               <w:br/>
-              <w:t>Texto de Lengua 7mo (Páginas 48 a 53)</w:t>
+              <w:t>Texto de Lengua 7mo (Páginas 26 a 37)</w:t>
               <w:br/>
               <w:t>Pizarra y marcadores</w:t>
               <w:br/>
-              <w:t>Tarjetas didácticas de conjugación</w:t>
-              <w:br/>
               <w:t>Cuadernos</w:t>
+              <w:br/>
+              <w:t>Fichas de biblioteca escolar</w:t>
             </w:r>
           </w:p>
         </w:tc>
@@ -2482,20 +2482,20 @@
                 <w:b w:val="0"/>
                 <w:sz w:val="20"/>
               </w:rPr>
-              <w:t>El docente escribe 3 oraciones en la pizarra con diferentes intenciones: "Los científicos estudian el clima" (certeza), "Ojalá encontremos soluciones al cambio climático" (deseo/duda), "Cuiden los recursos naturales del aula" (orden/exhortación). Plantea preguntas: ¿Qué actitud refleja el emisor en cada oración?, ¿en cuál afirma un hecho real?, ¿en cuál expresa un deseo?</w:t>
-            </w:r>
-          </w:p>
-          <w:p>
-            <w:pPr>
-              <w:spacing w:after="40" w:before="20"/>
-            </w:pPr>
-            <w:r>
-              <w:rPr>
-                <w:rFonts w:ascii="Times New Roman" w:hAnsi="Times New Roman"/>
-                <w:b/>
-                <w:sz w:val="20"/>
-              </w:rPr>
-              <w:t>Inserción Educación Socioemocional:</w:t>
+              <w:t>El docente presenta la portada del bloque de lectura (pág. 26) con ilustraciones paleontológicas y fósiles prehistóricos. Preguntas de indagación previa: ¿Qué investiga un científico paleontólogo?, ¿cómo sabemos que existieron seres vivos hace millones de años?, ¿dónde encontramos lecturas de divulgación científica?</w:t>
+            </w:r>
+          </w:p>
+          <w:p>
+            <w:pPr>
+              <w:spacing w:after="40" w:before="20"/>
+            </w:pPr>
+            <w:r>
+              <w:rPr>
+                <w:rFonts w:ascii="Times New Roman" w:hAnsi="Times New Roman"/>
+                <w:b/>
+                <w:sz w:val="20"/>
+              </w:rPr>
+              <w:t>Inserción Educación Ambiental y Curiosidad Científica:</w:t>
             </w:r>
           </w:p>
           <w:p>
@@ -2508,7 +2508,7 @@
                 <w:b w:val="0"/>
                 <w:sz w:val="20"/>
               </w:rPr>
-              <w:t>Se reflexiona sobre cómo expresamos nuestros sentimientos, metas y acuerdos en el aula empleando el modo subjuntivo ("Espero que trabajemos en equipo") y el modo indicativo con asertividad.</w:t>
+              <w:t>Fomento del pensamiento científico, cuidado de los ecosistemas actuales y comprensión de las eras geológicas del planeta Tierra.</w:t>
             </w:r>
           </w:p>
           <w:p>
@@ -2534,11 +2534,11 @@
                 <w:b w:val="0"/>
                 <w:sz w:val="20"/>
               </w:rPr>
-              <w:t>Representación: contraste visual en pizarra de las oraciones con colores distintos.</w:t>
-              <w:br/>
-              <w:t>Acción/expresión: dramatización de intenciones expresivas y respuestas orales.</w:t>
-              <w:br/>
-              <w:t>Motivación: conexión con las emociones y la comunicación respetuosa.</w:t>
+              <w:t>Representación: imágenes de fósiles de la pág. 26 y lectura modelo expresiva del docente.</w:t>
+              <w:br/>
+              <w:t>Acción/expresión: lluvia de ideas sobre películas y reportajes de ciencia.</w:t>
+              <w:br/>
+              <w:t>Motivación: asombro y fascinación por la historia natural.</w:t>
             </w:r>
           </w:p>
           <w:p>
@@ -2564,7 +2564,7 @@
                 <w:b w:val="0"/>
                 <w:sz w:val="20"/>
               </w:rPr>
-              <w:t>Los estudiantes analizan las explicaciones y oraciones modelo de las páginas 48 y 49 del libro. Diferencian entre hechos reales (indicativo), deseos/posibilidades (subjuntivo) y mandatos (imperativo). Asimismo, analizan la necesidad del punto y coma (;) para pausar oraciones compuestas extensas.</w:t>
+              <w:t>Lectura comentada y secuencial del artículo de divulgación científica de las páginas 28 a 31 ("Huellas en el tiempo: cazadores de fósiles"). Análisis de preguntas inferenciales: ¿Qué diferencia a un artículo científico de un cuento de hadas?, ¿qué función cumplen los datos cuantitativos, fechas y fotografías paratextuales?</w:t>
             </w:r>
           </w:p>
           <w:p>
@@ -2590,11 +2590,11 @@
                 <w:b w:val="0"/>
                 <w:sz w:val="20"/>
               </w:rPr>
-              <w:t>Representación: cuadros comparativos del texto pág. 50.</w:t>
-              <w:br/>
-              <w:t>Acción/expresión: transformación oral de oraciones y justificación gramatical.</w:t>
-              <w:br/>
-              <w:t>Motivación: descubrimiento inductivo de la regla sintáctica.</w:t>
+              <w:t>Representación: paratextos destacados (títulos, subtítulos, glosario al pie de página).</w:t>
+              <w:br/>
+              <w:t>Acción/expresión: subrayado de ideas principales e identificación de palabras científicas.</w:t>
+              <w:br/>
+              <w:t>Motivación: rol activo como lectores críticos de información verídica.</w:t>
             </w:r>
           </w:p>
           <w:p>
@@ -2620,13 +2620,13 @@
                 <w:b w:val="0"/>
                 <w:sz w:val="20"/>
               </w:rPr>
-              <w:t>Construcción guiada de organizadores gráficos en el cuaderno:</w:t>
-              <w:br/>
-              <w:t>1. Cuadro sinóptico de los Modos Verbales: Indicativo, Subjuntivo e Imperativo.</w:t>
-              <w:br/>
-              <w:t>2. Tiempos compuestos con el verbo auxiliar haber (pretérito perfecto compuesto, pluscuamperfecto).</w:t>
-              <w:br/>
-              <w:t>3. Reglas de uso del punto y coma (;) para separar oraciones yuxtapuestas y enumeraciones complejas (pág. 52).</w:t>
+              <w:t>Estructuración del conocimiento en el cuaderno:</w:t>
+              <w:br/>
+              <w:t>1. Concepto y características del artículo de divulgación científica (claridad, rigor, objetividad).</w:t>
+              <w:br/>
+              <w:t>2. Estructura textual: Título llamativo, introducción explicativa, cuerpo con evidencias y conclusión.</w:t>
+              <w:br/>
+              <w:t>3. Normas de uso de la biblioteca escolar y llenado técnico de fichas de préstamo bibliográfico (pág. 37).</w:t>
             </w:r>
           </w:p>
           <w:p>
@@ -2652,11 +2652,11 @@
                 <w:b w:val="0"/>
                 <w:sz w:val="20"/>
               </w:rPr>
-              <w:t>Representación: mapa conceptual estructurado con código de colores.</w:t>
-              <w:br/>
-              <w:t>Acción/expresión: elaboración de fichas síntesis en el cuaderno.</w:t>
-              <w:br/>
-              <w:t>Motivación: apropiación del conocimiento para mejorar la redacción.</w:t>
+              <w:t>Representación: organizador visual de llaves en la pizarra con tiza/marcadores de color.</w:t>
+              <w:br/>
+              <w:t>Acción/expresión: transcripción organizada en el cuaderno y diseño de una ficha de biblioteca modelo.</w:t>
+              <w:br/>
+              <w:t>Motivación: adquisición de hábitos autónomos de investigación escolar.</w:t>
             </w:r>
           </w:p>
           <w:p>
@@ -2682,7 +2682,7 @@
                 <w:b w:val="0"/>
                 <w:sz w:val="20"/>
               </w:rPr>
-              <w:t>Desarrollo de las actividades prácticas de las páginas 51 a 53 del texto escolar. Ejercicios de aplicación del punto y coma en oraciones compuestas y corrección de modos verbales en producciones escritas propias.</w:t>
+              <w:t>Resolución de las actividades de comprensión lectora, vocabulario contextual y juicio valorativo de las páginas 34 a 36 del libro escolar. En parejas, eligen un texto de la biblioteca de aula y completan su ficha de registro bibliográfico (pág. 37).</w:t>
             </w:r>
           </w:p>
           <w:p>
@@ -2708,11 +2708,11 @@
                 <w:b w:val="0"/>
                 <w:sz w:val="20"/>
               </w:rPr>
-              <w:t>Representación: ejercicios del libro y fichas de aplicación.</w:t>
-              <w:br/>
-              <w:t>Acción/expresión: resolución escrita individual y revisión cruzada entre pares.</w:t>
-              <w:br/>
-              <w:t>Motivación: autoedición y superación de errores comunes.</w:t>
+              <w:t>Representación: cuestionario estructurado del libro y plantilla de ficha bibliográfica.</w:t>
+              <w:br/>
+              <w:t>Acción/expresión: trabajo colaborativo en parejas y comprobación de respuestas.</w:t>
+              <w:br/>
+              <w:t>Motivación: enriquecimiento del léxico y satisfacción lectora.</w:t>
             </w:r>
           </w:p>
         </w:tc>
@@ -2728,7 +2728,7 @@
           </w:tcPr>
           <w:p>
             <w:r>
-              <w:t>Aplica elementos gramaticales (modos verbales, tiempos compuestos) y ortográficos (punto y coma) en producciones escritas con coherencia y cohesión. I.LL.3.6.3.</w:t>
+              <w:t>Realiza inferencias fundamentales y proyectivo-valorativas, valora los contenidos y aspectos de forma a partir de criterios preestablecidos, al monitorear su comprensión mediante el uso de estrategias cognitivas. I.LL.3.3.2.</w:t>
             </w:r>
           </w:p>
         </w:tc>
@@ -2743,9 +2743,9 @@
           </w:tcPr>
           <w:p>
             <w:r>
-              <w:t>Técnica: Pruebas escritas y observación directa.</w:t>
-              <w:br/>
-              <w:t>Instrumento: Cuestionario de aplicación de modos verbales y uso del punto y coma (actividades págs. 51-53).</w:t>
+              <w:t>• Instrumentos: Cuestionario de comprensión lectora y ficha de préstamo bibliográfico evaluada.</w:t>
+              <w:br/>
+              <w:t>• Actividades: Resolución de actividades págs. 34-37 del texto de Lengua y Literatura.</w:t>
             </w:r>
           </w:p>
         </w:tc>
@@ -2762,10 +2762,13 @@
           </w:tcPr>
           <w:p>
             <w:r>
-              <w:t>LL.3.5.1. Reconocer en un texto literario los elementos característicos que le dan sentido (personajes míticos, orígenes del mundo).</w:t>
-              <w:br/>
-              <w:br/>
-              <w:t>LL.3.4.13. Producir escritos de acuerdo con la situación comunicativa, mediante formatos diversos (historieta mitológica).</w:t>
+              <w:t>LL.3.4.1. Relatar textos con secuencia lógica, manejo de conectores y coherencia en el uso de la persona y el tiempo verbal.</w:t>
+              <w:br/>
+              <w:br/>
+              <w:t>LL.3.4.6. Autorregular la producción escrita mediante el proceso de planificación, redacción y revisión.</w:t>
+              <w:br/>
+              <w:br/>
+              <w:t>LL.3.4.10. Integrar en las producciones escritas el verbo (accidentes, modos indicativo, subjuntivo e imperativo) y uso del punto y coma (;).</w:t>
             </w:r>
           </w:p>
         </w:tc>
@@ -2777,18 +2780,18 @@
           </w:tcPr>
           <w:p>
             <w:r>
-              <w:t>Tema: Disfruto de los mitos, Escritura creativa: Historieta mitológica y Evaluación sumativa Unidad 1</w:t>
+              <w:t>Tema: Escritura: Escribo una nota científica (planificación y redacción) y Gramática: El verbo (accidentes, modos) y Uso del punto y coma (;)</w:t>
               <w:br/>
               <w:br/>
               <w:t>Materiales:</w:t>
               <w:br/>
-              <w:t>Texto de Lengua 7mo (Páginas 54 a 71)</w:t>
+              <w:t>Texto de Lengua 7mo (Páginas 38 a 53)</w:t>
               <w:br/>
               <w:t>Pizarra y marcadores</w:t>
               <w:br/>
-              <w:t>Cartulinas y lápices de colores</w:t>
-              <w:br/>
-              <w:t>Rúbrica de evaluación sumativa</w:t>
+              <w:t>Cuadernos de trabajo</w:t>
+              <w:br/>
+              <w:t>Plantilla de redacción</w:t>
             </w:r>
           </w:p>
         </w:tc>
@@ -2853,20 +2856,20 @@
                 <w:b w:val="0"/>
                 <w:sz w:val="20"/>
               </w:rPr>
-              <w:t>El docente narra brevemente el mito de la creación del Sol y la Luna (pág. 54). Plantea preguntas detonantes: ¿Por qué las civilizaciones antiguas creaban mitos?, ¿qué fenómenos intentaban explicar?, ¿conocen mitos de los pueblos originarios del Ecuador (ej: mito Cañari de la Guacamaya)?</w:t>
-            </w:r>
-          </w:p>
-          <w:p>
-            <w:pPr>
-              <w:spacing w:after="40" w:before="20"/>
-            </w:pPr>
-            <w:r>
-              <w:rPr>
-                <w:rFonts w:ascii="Times New Roman" w:hAnsi="Times New Roman"/>
-                <w:b/>
-                <w:sz w:val="20"/>
-              </w:rPr>
-              <w:t>Inserción Educación Cívica, Ética e Integridad:</w:t>
+              <w:t>El docente propone simular la edición de un boletín escolar científico (pág. 38). Observan una muestra de nota científica sobre innovaciones ecológicas. Se plantean interrogantes: ¿Cómo se redacta un texto claro para compartir un descubrimiento?, ¿qué palabras indican las acciones y hallazgos en una investigación?</w:t>
+            </w:r>
+          </w:p>
+          <w:p>
+            <w:pPr>
+              <w:spacing w:after="40" w:before="20"/>
+            </w:pPr>
+            <w:r>
+              <w:rPr>
+                <w:rFonts w:ascii="Times New Roman" w:hAnsi="Times New Roman"/>
+                <w:b/>
+                <w:sz w:val="20"/>
+              </w:rPr>
+              <w:t>Inserción Educación para la Seguridad Vial y Movilidad Sostenible:</w:t>
             </w:r>
           </w:p>
           <w:p>
@@ -2879,7 +2882,7 @@
                 <w:b w:val="0"/>
                 <w:sz w:val="20"/>
               </w:rPr>
-              <w:t>Valoración de la memoria ancestral, cosmovisión de las culturas andinas y amazónicas, y respeto profundo a la diversidad intercultural del Ecuador.</w:t>
+              <w:t>Propuesta de temática científica: La evolución de los sistemas de transporte ecológico y el respeto al peatón y al ciclista en las ciudades.</w:t>
             </w:r>
           </w:p>
           <w:p>
@@ -2905,11 +2908,11 @@
                 <w:b w:val="0"/>
                 <w:sz w:val="20"/>
               </w:rPr>
-              <w:t>Representación: narración oral con modulación de voz e ilustraciones del libro págs. 54-55.</w:t>
-              <w:br/>
-              <w:t>Acción/expresión: participación oral comentando relatos transmitidos por sus familias.</w:t>
-              <w:br/>
-              <w:t>Motivación: fascinación por los relatos cosmogónicos y legendarios.</w:t>
+              <w:t>Representación: modelo visual de una nota informativa en pág. 39.</w:t>
+              <w:br/>
+              <w:t>Acción/expresión: lluvia de ideas de temas de interés.</w:t>
+              <w:br/>
+              <w:t>Motivación: utilidad práctica del texto para divulgar saberes.</w:t>
             </w:r>
           </w:p>
           <w:p>
@@ -2935,7 +2938,7 @@
                 <w:b w:val="0"/>
                 <w:sz w:val="20"/>
               </w:rPr>
-              <w:t>Lectura guiada y dialogada de los mitos seleccionados en las páginas 56 a 61 (mitos griegos y andinos). Los estudiantes contrastan: ¿En qué se diferencia un mito de una leyenda o un cuento común?, ¿qué poderes poseen los personajes?, ¿cómo intentaban dar sentido al universo?</w:t>
+              <w:t>Análisis de la matriz de planificación textual de la pág. 40 (propósito, destinatario, tema y fuentes). Análisis reflexivo de las oraciones: ¿Qué ocurre si cambiamos el tiempo verbal de presente a pasado o futuro? ¿Por qué es necesario usar el punto y coma (;) cuando las oraciones son largas y ya tienen comas internas?</w:t>
             </w:r>
           </w:p>
           <w:p>
@@ -2961,11 +2964,11 @@
                 <w:b w:val="0"/>
                 <w:sz w:val="20"/>
               </w:rPr>
-              <w:t>Representación: lectura coral y análisis de paratextos míticos.</w:t>
-              <w:br/>
-              <w:t>Acción/expresión: cuadro comparativo entre mito y realidad.</w:t>
-              <w:br/>
-              <w:t>Motivación: intercambio de interpretaciones personales y juicios estéticos.</w:t>
+              <w:t>Representación: oraciones modelo escritas en pizarra comparando tiempos verbales.</w:t>
+              <w:br/>
+              <w:t>Acción/expresión: deducción de reglas sintácticas mediante participación oral.</w:t>
+              <w:br/>
+              <w:t>Motivación: comprensión lógica del funcionamiento del idioma.</w:t>
             </w:r>
           </w:p>
           <w:p>
@@ -2991,15 +2994,13 @@
                 <w:b w:val="0"/>
                 <w:sz w:val="20"/>
               </w:rPr>
-              <w:t>Construcción de un organizador gráfico en la pizarra:</w:t>
-              <w:br/>
-              <w:t>1. Definición de Mito.</w:t>
-              <w:br/>
-              <w:t>2. Tipos de mitos: cosmogónicos, teogónicos y etiológicos.</w:t>
-              <w:br/>
-              <w:t>3. Elementos del cómic o historieta (viñetas, bocadillos de diálogo, cartelas, onomatopeyas) pág. 68.</w:t>
-              <w:br/>
-              <w:t>Registro en el cuaderno con esquemas creativos ilustrados.</w:t>
+              <w:t>Construcción guiada en el cuaderno de:</w:t>
+              <w:br/>
+              <w:t>1. Proceso de escritura: Planificación, redacción del borrador, revisión y publicación (págs. 40-41).</w:t>
+              <w:br/>
+              <w:t>2. Gramática del Verbo: Raíz y desinencia, accidentes (persona: 1ra, 2da, 3ra; número: singular, plural; tiempo: presente, pretérito, futuro; modos: indicativo, subjuntivo e imperativo) págs. 42-45.</w:t>
+              <w:br/>
+              <w:t>3. Reglas ortográficas del punto y coma (;) en oraciones yuxtapuestas y enumeraciones complejas (pág. 52).</w:t>
             </w:r>
           </w:p>
           <w:p>
@@ -3025,11 +3026,11 @@
                 <w:b w:val="0"/>
                 <w:sz w:val="20"/>
               </w:rPr>
-              <w:t>Representación: esquema conceptual y modelos visuales de viñetas de cómic.</w:t>
-              <w:br/>
-              <w:t>Acción/expresión: síntesis teórica en cuaderno y bocetos de personajes.</w:t>
-              <w:br/>
-              <w:t>Motivación: integración de la plástica visual con el lenguaje literario.</w:t>
+              <w:t>Representación: tablas de conjugación cromáticas y mapa conceptual de modos verbales.</w:t>
+              <w:br/>
+              <w:t>Acción/expresión: elaboración de resúmenes estructurados en cuadernos.</w:t>
+              <w:br/>
+              <w:t>Motivación: dominar herramientas lingüísticas para redactar con exactitud.</w:t>
             </w:r>
           </w:p>
           <w:p>
@@ -3055,9 +3056,7 @@
                 <w:b w:val="0"/>
                 <w:sz w:val="20"/>
               </w:rPr>
-              <w:t>Taller creativo: En parejas, los estudiantes adaptan un mito a una historieta ilustrada de 4 a 6 viñetas (págs. 68-69).</w:t>
-              <w:br/>
-              <w:t>Aplicación de la Evaluación Sumativa estructurada de la Unidad 1 (págs. 70-71) para consolidar los aprendizajes del primer bloque temático.</w:t>
+              <w:t>Los estudiantes planifican y redactan el borrador de su nota científica (págs. 46-47) aplicando la conjugación verbal coherente y el uso del punto y coma (;). Realizan coevaluación con la lista de cotejo del texto y resuelven las actividades prácticas de las páginas 50 a 53.</w:t>
             </w:r>
           </w:p>
           <w:p>
@@ -3083,11 +3082,11 @@
                 <w:b w:val="0"/>
                 <w:sz w:val="20"/>
               </w:rPr>
-              <w:t>Representación: rúbrica de autoevaluación pág. 71 y formatos de historietas.</w:t>
-              <w:br/>
-              <w:t>Acción/expresión: creación plástica y textual, resolución de prueba sumativa.</w:t>
-              <w:br/>
-              <w:t>Motivación: exposición en el mural del aula ("Galería Mitológica").</w:t>
+              <w:t>Representación: plantilla de producción textual estructurada en 3 párrafos.</w:t>
+              <w:br/>
+              <w:t>Acción/expresión: redacción individual, corrección entre pares y ejercicios gramaticales.</w:t>
+              <w:br/>
+              <w:t>Motivación: orgullo de publicar un artículo con rigor gramatical.</w:t>
             </w:r>
           </w:p>
         </w:tc>
@@ -3103,7 +3102,7 @@
           </w:tcPr>
           <w:p>
             <w:r>
-              <w:t>Reconoce en textos de la literatura oral y escrita los elementos característicos que les dan sentido; recrea textos literarios mediante adaptaciones creativas (historietas). I.LL.3.7.1.</w:t>
+              <w:t>Produce textos informativos utilizando el proceso de escritura, elementos gramaticales apropiados (verbos, modos y tiempos) y signos de puntuación (punto y coma). I.LL.3.6.1. / I.LL.3.6.3.</w:t>
             </w:r>
           </w:p>
         </w:tc>
@@ -3118,9 +3117,9 @@
           </w:tcPr>
           <w:p>
             <w:r>
-              <w:t>Técnica: Análisis de producciones artísticas/escritas y prueba sumativa.</w:t>
-              <w:br/>
-              <w:t>Instrumento: Rúbrica de la Historieta Mitológica y Prueba sumativa de Unidad 1 (págs. 70-71).</w:t>
+              <w:t>• Instrumentos: Rúbrica de producción escrita y prueba de aplicación gramatical.</w:t>
+              <w:br/>
+              <w:t>• Actividades: Redacción de la nota científica y resolución de talleres págs. 46-53 del texto.</w:t>
             </w:r>
           </w:p>
         </w:tc>
@@ -3137,7 +3136,7 @@
           </w:tcPr>
           <w:p>
             <w:r>
-              <w:t>LL.3.1.2. Indagar sobre las influencias lingüísticas y culturales que explican los dialectos del castellano en el Ecuador, y valorar la diversidad lingüística del país.</w:t>
+              <w:t>LL.3.5.1. Reconocer en un texto literario los elementos característicos que le dan sentido (personajes míticos, orígenes del mundo, cosmovisión).</w:t>
             </w:r>
           </w:p>
         </w:tc>
@@ -3149,18 +3148,18 @@
           </w:tcPr>
           <w:p>
             <w:r>
-              <w:t>Tema: Unidad 2: Los dialectos del Ecuador (variedades lingüísticas de Costa, Sierra y Amazonía) y Quichuismos</w:t>
+              <w:t>Tema: Literatura: Disfruto de los mitos (concepto, características, mitos de creación, dioses y héroes)</w:t>
               <w:br/>
               <w:br/>
               <w:t>Materiales:</w:t>
               <w:br/>
-              <w:t>Texto de Lengua 7mo (Páginas 74 a 79)</w:t>
+              <w:t>Texto de Lengua 7mo (Páginas 54 a 65)</w:t>
               <w:br/>
               <w:t>Pizarra y marcadores</w:t>
               <w:br/>
-              <w:t>Mapa lingüístico del Ecuador</w:t>
-              <w:br/>
-              <w:t>Guía Docente pág. 15</w:t>
+              <w:t>Cuadernos</w:t>
+              <w:br/>
+              <w:t>Antología de mitos andinos y universales</w:t>
             </w:r>
           </w:p>
         </w:tc>
@@ -3225,20 +3224,20 @@
                 <w:b w:val="0"/>
                 <w:sz w:val="20"/>
               </w:rPr>
-              <w:t>El docente inicia la clase reproduciendo expresiones y giros lingüísticos de diferentes regiones del país ("¡Qué bacán la caleta!", "Pásame la llacta, guagua", "Vamos a la chagra"). Plantea preguntas: ¿Por qué en la Costa, en la Sierra y en la Amazonía hablamos el castellano con distintos tonos y palabras?, ¿qué palabras quichuas usamos a diario en Quito?</w:t>
-            </w:r>
-          </w:p>
-          <w:p>
-            <w:pPr>
-              <w:spacing w:after="40" w:before="20"/>
-            </w:pPr>
-            <w:r>
-              <w:rPr>
-                <w:rFonts w:ascii="Times New Roman" w:hAnsi="Times New Roman"/>
-                <w:b/>
-                <w:sz w:val="20"/>
-              </w:rPr>
-              <w:t>Inserción Educación Cívica, Ética e Integridad:</w:t>
+              <w:t>El docente relata el mito de la creación del Sol y la Luna (pág. 54). Preguntas iniciales: ¿Por qué las culturas antiguas crearon relatos sobre seres sobrenaturales?, ¿qué intentaban explicar?, ¿conocen mitos ecuatorianos como el del volcán Chimborazo y la Mama Tungurahua o el mito Cañari de las Guacamayas?</w:t>
+            </w:r>
+          </w:p>
+          <w:p>
+            <w:pPr>
+              <w:spacing w:after="40" w:before="20"/>
+            </w:pPr>
+            <w:r>
+              <w:rPr>
+                <w:rFonts w:ascii="Times New Roman" w:hAnsi="Times New Roman"/>
+                <w:b/>
+                <w:sz w:val="20"/>
+              </w:rPr>
+              <w:t>Inserción Educación Cívica e Interculturalidad:</w:t>
             </w:r>
           </w:p>
           <w:p>
@@ -3251,7 +3250,7 @@
                 <w:b w:val="0"/>
                 <w:sz w:val="20"/>
               </w:rPr>
-              <w:t>Convivencia armónica, erradicación de la discriminación por motivos de acento o procedencia geográfica, y orgullo de nuestra identidad ecuatoriana pluricultural.</w:t>
+              <w:t>Valoración de la cosmovisión andina, amazónica y universal, promoviendo el respeto por la memoria ancestral de nuestros pueblos originarios.</w:t>
             </w:r>
           </w:p>
           <w:p>
@@ -3277,11 +3276,11 @@
                 <w:b w:val="0"/>
                 <w:sz w:val="20"/>
               </w:rPr>
-              <w:t>Representación: dramatización de diálogos regionales e ilustraciones del mapa pág. 74.</w:t>
-              <w:br/>
-              <w:t>Acción/expresión: los estudiantes identifican giros lingüísticos que escuchan en su entorno.</w:t>
-              <w:br/>
-              <w:t>Motivación: conexión con sus raíces familiares e identidad comunitaria.</w:t>
+              <w:t>Representación: narración oral ambientada e imágenes míticas del texto págs. 54-55.</w:t>
+              <w:br/>
+              <w:t>Acción/expresión: lluvia de ideas sobre relatos escuchados en la familia.</w:t>
+              <w:br/>
+              <w:t>Motivación: fascinación por lo fantástico y el misterio del universo.</w:t>
             </w:r>
           </w:p>
           <w:p>
@@ -3307,7 +3306,7 @@
                 <w:b w:val="0"/>
                 <w:sz w:val="20"/>
               </w:rPr>
-              <w:t>Análisis de la lectura del texto págs. 75-76 sobre cómo la historia y las lenguas originarias enriquecieron el castellano. Reflexión guiada: ¿Un dialecto es un castellano "mal hablado"? (Superación de prejuicios lingüísticos). ¿Cómo términos como achachay, arrarray, guambra o chapa enriquecen nuestro lenguaje?</w:t>
+              <w:t>Lectura compartida y dramatizada de los mitos griegos y andinos seleccionados en las páginas 56 a 61. Análisis grupal: ¿En qué se diferencia un mito de una leyenda histórica o de un cuento común?, ¿qué virtudes o debilidades representan los dioses y héroes?, ¿qué valores humanos transmiten?</w:t>
             </w:r>
           </w:p>
           <w:p>
@@ -3333,11 +3332,11 @@
                 <w:b w:val="0"/>
                 <w:sz w:val="20"/>
               </w:rPr>
-              <w:t>Representación: glosario de términos quichuas incorporados al castellano.</w:t>
-              <w:br/>
-              <w:t>Acción/expresión: discusión socrática en asamblea de aula.</w:t>
-              <w:br/>
-              <w:t>Motivación: valoración de los saberes ancestrales y respeto intercultural.</w:t>
+              <w:t>Representación: lectura por roles con entonación expresiva.</w:t>
+              <w:br/>
+              <w:t>Acción/expresión: cuadro comparativo entre mito, fábula y cuento.</w:t>
+              <w:br/>
+              <w:t>Motivación: debate de interpretaciones sobre la moral y las fuerzas de la naturaleza.</w:t>
             </w:r>
           </w:p>
           <w:p>
@@ -3363,19 +3362,15 @@
                 <w:b w:val="0"/>
                 <w:sz w:val="20"/>
               </w:rPr>
-              <w:t>Explicación docente sobre las variedades diatópicas del castellano ecuatoriano.</w:t>
-              <w:br/>
-              <w:t>Elaboración en la pizarra de un organizador gráfico (matriz comparativa regional):</w:t>
-              <w:br/>
-              <w:t>1. Dialecto costeño (características fonéticas y léxicas).</w:t>
-              <w:br/>
-              <w:t>2. Dialecto serrano (influencia quichua, entonación).</w:t>
-              <w:br/>
-              <w:t>3. Dialecto amazónico (influencia shuar, kichwa y lenguas locales).</w:t>
-              <w:br/>
-              <w:t>4. Decálogo del respeto a la diversidad lingüística del Ecuador.</w:t>
-              <w:br/>
-              <w:t>Los estudiantes copian y enriquecen la matriz en sus cuadernos.</w:t>
+              <w:t>Sistematización de conceptos en el cuaderno de trabajo:</w:t>
+              <w:br/>
+              <w:t>1. Definición del Mito como relato sagrado tradicional.</w:t>
+              <w:br/>
+              <w:t>2. Características (tiempo primordial, dioses, semidioses, fenómenos explicados mediante símbolos).</w:t>
+              <w:br/>
+              <w:t>3. Clasificación básica: cosmogónicos (origen del mundo), teogónicos (origen de los dioses) y etiológicos (origen de seres y cosas).</w:t>
+              <w:br/>
+              <w:t>Elaboración de un mapa mental ilustrado en los cuadernos.</w:t>
             </w:r>
           </w:p>
           <w:p>
@@ -3401,11 +3396,11 @@
                 <w:b w:val="0"/>
                 <w:sz w:val="20"/>
               </w:rPr>
-              <w:t>Representación: mapa conceptual visual con el mapa del Ecuador y flechas regionales.</w:t>
-              <w:br/>
-              <w:t>Acción/expresión: transcripción creativa en el cuaderno.</w:t>
-              <w:br/>
-              <w:t>Motivación: sentido de pertenencia y riqueza cultural nacional.</w:t>
+              <w:t>Representación: organizador mental en pizarra con ramificaciones visuales.</w:t>
+              <w:br/>
+              <w:t>Acción/expresión: síntesis teórica en el cuaderno acompañada de un dibujo simbólico.</w:t>
+              <w:br/>
+              <w:t>Motivación: integración del arte visual con la literatura.</w:t>
             </w:r>
           </w:p>
           <w:p>
@@ -3431,9 +3426,7 @@
                 <w:b w:val="0"/>
                 <w:sz w:val="20"/>
               </w:rPr>
-              <w:t>Resolución de las actividades de indagación de las páginas 77 a 79 del texto escolar.</w:t>
-              <w:br/>
-              <w:t>Creación en parejas del "Mini Diccionario Ilustrado de Ecuatorianismos", definiendo 5 palabras regionales con su significado y una oración contextualizada. Puesta en común en plenaria. (Nota: Lunes 02 y Martes 03 de Noviembre: Feriados por Día de Difuntos e Independencia de Cuenca).</w:t>
+              <w:t>Los estudiantes resuelven los talleres de comprensión, interpretación de personajes y análisis de símbolos de las páginas 62 a 65 del texto de Lengua. Puesta en común de respuestas. (Nota: Lunes 02 y Martes 03 de Noviembre: Feriados por Día de Difuntos e Independencia de Cuenca).</w:t>
             </w:r>
           </w:p>
           <w:p>
@@ -3459,11 +3452,11 @@
                 <w:b w:val="0"/>
                 <w:sz w:val="20"/>
               </w:rPr>
-              <w:t>Representación: fichas léxicas ilustradas y preguntas del texto.</w:t>
-              <w:br/>
-              <w:t>Acción/expresión: elaboración manual del mini diccionario y exposición oral.</w:t>
-              <w:br/>
-              <w:t>Motivación: trabajo cooperativo formativo y lúdico.</w:t>
+              <w:t>Representación: preguntas de análisis del libro y guías de discusión.</w:t>
+              <w:br/>
+              <w:t>Acción/expresión: trabajo individual y socialización en asamblea de aula.</w:t>
+              <w:br/>
+              <w:t>Motivación: disfrute estético de la lectura literaria.</w:t>
             </w:r>
           </w:p>
         </w:tc>
@@ -3479,7 +3472,7 @@
           </w:tcPr>
           <w:p>
             <w:r>
-              <w:t>Indaga sobre las influencias lingüísticas y culturales que explican los diferentes dialectos del castellano en el Ecuador, valorando la diversidad lingüística como factor de identidad. I.LL.3.1.2.</w:t>
+              <w:t>Reconoce en textos de la literatura oral y escrita (mitos) los elementos característicos que les dan sentido; participa en discusiones sobre textos literarios aportando interpretaciones personales. I.LL.3.7.1.</w:t>
             </w:r>
           </w:p>
         </w:tc>
@@ -3494,9 +3487,9 @@
           </w:tcPr>
           <w:p>
             <w:r>
-              <w:t>Técnica: Análisis del desempeño y observación directa.</w:t>
-              <w:br/>
-              <w:t>Instrumento: Mini Diccionario de Ecuatorianismos evaluado con escala estimativa y actividades del texto págs. 77-79.</w:t>
+              <w:t>• Instrumentos: Rúbrica de análisis literario y cuadro comparativo de mitos.</w:t>
+              <w:br/>
+              <w:t>• Actividades: Resolución de actividades págs. 62-65 del libro y participación en debates literarios.</w:t>
             </w:r>
           </w:p>
         </w:tc>
@@ -3513,7 +3506,10 @@
           </w:tcPr>
           <w:p>
             <w:r>
-              <w:t>LL.3.2.2. Proponer intervenciones orales con una intención comunicativa, organizar el discurso según las estructuras de la lengua oral y utilizar vocabulario adecuado.</w:t>
+              <w:t>LL.3.5.1. Recrear textos literarios leídos o escuchados mediante el uso de diversos formatos.</w:t>
+              <w:br/>
+              <w:br/>
+              <w:t>LL.3.4.13. Producir textos de acuerdo con la situación comunicativa en formatos variados (historieta mitológica).</w:t>
             </w:r>
           </w:p>
         </w:tc>
@@ -3525,20 +3521,18 @@
           </w:tcPr>
           <w:p>
             <w:r>
-              <w:t>Tema: Unidad 2: Diálogo formal, escucha activa, búsqueda de acuerdos y Taller: Participemos de un cine-foro</w:t>
+              <w:t>Tema: Escritura creativa: Historieta mitológica y Evaluación sumativa de la Unidad 1</w:t>
               <w:br/>
               <w:br/>
               <w:t>Materiales:</w:t>
               <w:br/>
-              <w:t>Texto de Lengua 7mo (Páginas 80 a 87)</w:t>
+              <w:t>Texto de Lengua 7mo (Páginas 66 a 71)</w:t>
+              <w:br/>
+              <w:t>Cartulinas, reglas y lápices de colores</w:t>
               <w:br/>
               <w:t>Pizarra y marcadores</w:t>
               <w:br/>
-              <w:t>Cortometraje o fragmento audiovisual formativo</w:t>
-              <w:br/>
-              <w:t>Proyector / Audio</w:t>
-              <w:br/>
-              <w:t>Cuadernos</w:t>
+              <w:t>Cuestionario sumativo de Unidad 1</w:t>
             </w:r>
           </w:p>
         </w:tc>
@@ -3603,20 +3597,20 @@
                 <w:b w:val="0"/>
                 <w:sz w:val="20"/>
               </w:rPr>
-              <w:t>El docente ambienta el aula como una sala de cine-foro ("Cine-Club Calderón 2"). Se proyecta un cortometraje breve sobre resolución pacífica de conflictos y empatía escolar. Plantea preguntas exploratorias: ¿Qué mensaje nos transmite la historia?, ¿cómo reaccionaron los personajes frente a las diferencias?, ¿es fácil escuchar a quien piensa distinto?</w:t>
-            </w:r>
-          </w:p>
-          <w:p>
-            <w:pPr>
-              <w:spacing w:after="40" w:before="20"/>
-            </w:pPr>
-            <w:r>
-              <w:rPr>
-                <w:rFonts w:ascii="Times New Roman" w:hAnsi="Times New Roman"/>
-                <w:b/>
-                <w:sz w:val="20"/>
-              </w:rPr>
-              <w:t>Inserción Educación Socioemocional y Cívica:</w:t>
+              <w:t>El docente presenta muestras de historietas y cómics clásicos y contemporáneos (pág. 66). Se exploran saberes previos: ¿Cómo cuenta una historia el lenguaje del cómic?, ¿qué elementos visuales hacen que un cómic sea emocionante de leer?</w:t>
+            </w:r>
+          </w:p>
+          <w:p>
+            <w:pPr>
+              <w:spacing w:after="40" w:before="20"/>
+            </w:pPr>
+            <w:r>
+              <w:rPr>
+                <w:rFonts w:ascii="Times New Roman" w:hAnsi="Times New Roman"/>
+                <w:b/>
+                <w:sz w:val="20"/>
+              </w:rPr>
+              <w:t>Inserción Educación Socioemocional y Creatividad:</w:t>
             </w:r>
           </w:p>
           <w:p>
@@ -3629,7 +3623,7 @@
                 <w:b w:val="0"/>
                 <w:sz w:val="20"/>
               </w:rPr>
-              <w:t>Autorregulación emocional, empatía, escucha activa sin interrupciones y búsqueda de consensos pacíficos a través del diálogo civilizado.</w:t>
+              <w:t>Desarrollo de la imaginación, trabajo perseverante, expresión de emociones a través del arte y superación de la frustración en la creación gráfica.</w:t>
             </w:r>
           </w:p>
           <w:p>
@@ -3655,11 +3649,11 @@
                 <w:b w:val="0"/>
                 <w:sz w:val="20"/>
               </w:rPr>
-              <w:t>Representación: cortometraje proyectado con audio claro y subtítulos.</w:t>
-              <w:br/>
-              <w:t>Acción/expresión: respuestas orales libres expresando sentimientos e ideas.</w:t>
-              <w:br/>
-              <w:t>Motivación: ambiente lúdico del cine-foro y relevancia cotidiana.</w:t>
+              <w:t>Representación: modelos visuales de tiras cómicas e historietas míticas en págs. 66-67.</w:t>
+              <w:br/>
+              <w:t>Acción/expresión: análisis oral de viñetas, bocadillos y onomatopeyas.</w:t>
+              <w:br/>
+              <w:t>Motivación: entusiasmo infantil por el formato de la historieta.</w:t>
             </w:r>
           </w:p>
           <w:p>
@@ -3685,7 +3679,7 @@
                 <w:b w:val="0"/>
                 <w:sz w:val="20"/>
               </w:rPr>
-              <w:t>El docente guía el análisis de la escena y preguntas de las páginas 80 y 81 del libro. Los estudiantes reflexionan sobre los elementos del diálogo constructivo: contacto visual, modulación de la voz, respeto a los turnos de habla y fórmulas de cortesía. Contrastan situaciones de imposición frente a acuerdos dialogados.</w:t>
+              <w:t>Análisis guiado de los elementos de la historieta (págs. 67-68): viñetas, planos visuales, bocadillos de diálogo (globo de diálogo, susurro, pensamiento, grito), cartelas del narrador y onomatopeyas sonoras. ¿Cómo transformar un mito leído en una secuencia de 4 a 6 viñetas?</w:t>
             </w:r>
           </w:p>
           <w:p>
@@ -3711,11 +3705,11 @@
                 <w:b w:val="0"/>
                 <w:sz w:val="20"/>
               </w:rPr>
-              <w:t>Representación: preguntas orientadoras en pizarra y texto.</w:t>
-              <w:br/>
-              <w:t>Acción/expresión: debate moderado por turnos.</w:t>
-              <w:br/>
-              <w:t>Motivación: aula como espacio seguro de opinión respetuosa.</w:t>
+              <w:t>Representación: cuadro tipológico de globos de diálogo y onomatopeyas.</w:t>
+              <w:br/>
+              <w:t>Acción/expresión: diseño del guion gráfico previo (storyboard) en borrador.</w:t>
+              <w:br/>
+              <w:t>Motivación: aprendizaje dinámico de la narrativa secuencial gráfica.</w:t>
             </w:r>
           </w:p>
           <w:p>
@@ -3741,15 +3735,15 @@
                 <w:b w:val="0"/>
                 <w:sz w:val="20"/>
               </w:rPr>
-              <w:t>El docente explica la metodología del Cine-foro y las fases de un diálogo formal o debate (págs. 82-84):</w:t>
-              <w:br/>
-              <w:t>1. Rol del moderador y del auditorio.</w:t>
-              <w:br/>
-              <w:t>2. Argumentos fundamentados frente a opiniones sin sustento.</w:t>
-              <w:br/>
-              <w:t>3. Estructura de la intervención oral (saludo, postura, argumento y propuesta de acuerdo).</w:t>
-              <w:br/>
-              <w:t>Construcción en pizarra de un organizador gráfico (esquema del Diálogo Asertivo y Cine-foro) que los estudiantes registran en sus cuadernos.</w:t>
+              <w:t>Sistematización de las fases para la creación de una historieta mitológica:</w:t>
+              <w:br/>
+              <w:t>1. Selección del mito y delimitación de personajes principales.</w:t>
+              <w:br/>
+              <w:t>2. Redacción del guion por viñeta (inicio, nudo, desenlace).</w:t>
+              <w:br/>
+              <w:t>3. Dibujo de personajes, rotulado de textos y coloreado.</w:t>
+              <w:br/>
+              <w:t>Repaso de los contenidos clave de la Unidad 1 para la evaluación sumativa (lengua y cultura, discursos, divulgación científica, el verbo y mitos).</w:t>
             </w:r>
           </w:p>
           <w:p>
@@ -3775,11 +3769,11 @@
                 <w:b w:val="0"/>
                 <w:sz w:val="20"/>
               </w:rPr>
-              <w:t>Representación: esquema conceptual con recomendaciones para hablar en público.</w:t>
-              <w:br/>
-              <w:t>Acción/expresión: completar esquema y redactar fichas de argumentos breves.</w:t>
-              <w:br/>
-              <w:t>Motivación: desarrollo de habilidades de oratoria y seguridad personal.</w:t>
+              <w:t>Representación: esquema secuencial del proceso creativo y repaso en pizarra.</w:t>
+              <w:br/>
+              <w:t>Acción/expresión: bosquejo ordenado en cuaderno y aclaración de dudas.</w:t>
+              <w:br/>
+              <w:t>Motivación: consolidación de los aprendizajes del bloque.</w:t>
             </w:r>
           </w:p>
           <w:p>
@@ -3805,7 +3799,9 @@
                 <w:b w:val="0"/>
                 <w:sz w:val="20"/>
               </w:rPr>
-              <w:t>Desarrollo del taller práctico "Participemos de un Cine-foro" (págs. 86-87). Los estudiantes participan por turnos expresando su juicio crítico sobre el cortometraje, aplicando las fórmulas de cortesía aprendidas y consensuando un acuerdo grupal de convivencia. Coevaluación mediante rúbrica de expresión oral. (Cierre oficial de la Planificación Microcurricular: 13 de Noviembre de 2026).</w:t>
+              <w:t>En parejas o de forma individual, los estudiantes elaboran su Historieta Mitológica final (págs. 68-69) en cartulina y la exponen en el mural del aula ("Galería Mitológica de 7mo").</w:t>
+              <w:br/>
+              <w:t>Aplicación de la Evaluación Sumativa estructurada de la Unidad 1 (págs. 70-71) para verificar el dominio de las destrezas priorizadas. (Cierre de la Planificación Microcurricular: 13 de Noviembre de 2026).</w:t>
             </w:r>
           </w:p>
           <w:p>
@@ -3831,11 +3827,11 @@
                 <w:b w:val="0"/>
                 <w:sz w:val="20"/>
               </w:rPr>
-              <w:t>Representación: rúbrica visual de autoevaluación y coevaluación oral.</w:t>
-              <w:br/>
-              <w:t>Acción/expresión: intervención oral en el cine-foro y registro de compromisos.</w:t>
-              <w:br/>
-              <w:t>Motivación: celebración del cierre del ciclo microcurricular de 6 semanas.</w:t>
+              <w:t>Representación: formato de evaluación sumativa del texto págs. 70-71.</w:t>
+              <w:br/>
+              <w:t>Acción/expresión: creación artística de la historieta y resolución de la prueba escrita.</w:t>
+              <w:br/>
+              <w:t>Motivación: celebración del cierre exitoso de la Unidad 1.</w:t>
             </w:r>
           </w:p>
         </w:tc>
@@ -3851,7 +3847,7 @@
           </w:tcPr>
           <w:p>
             <w:r>
-              <w:t>Propone intervenciones orales organizadas con intención comunicativa, adapta el vocabulario, respeta turnos de habla y busca acuerdos en cine-foros o debates. I.LL.3.2.2.</w:t>
+              <w:t>Recrea textos literarios leídos mediante adaptaciones creativas (historieta) y demuestra el dominio de destrezas comunicativas de la Unidad 1. I.LL.3.7.2. / I.LL.3.6.1.</w:t>
             </w:r>
           </w:p>
         </w:tc>
@@ -3866,9 +3862,9 @@
           </w:tcPr>
           <w:p>
             <w:r>
-              <w:t>Técnica: Observación directa y registro del desempeño oral.</w:t>
-              <w:br/>
-              <w:t>Instrumento: Rúbrica de participación en el Cine-foro y Diálogo formal (actividades pág. 87).</w:t>
+              <w:t>• Instrumentos: Rúbrica de la Historieta Mitológica y Evaluación sumativa de Unidad 1 (págs. 70-71).</w:t>
+              <w:br/>
+              <w:t>• Actividades: Exposición de la historieta en el mural y prueba escrita de base estructurada.</w:t>
             </w:r>
           </w:p>
         </w:tc>
@@ -4237,9 +4233,9 @@
           </w:tcPr>
           <w:p>
             <w:r>
-              <w:t>Técnica: Evaluación auténtica de proyectos y observación estructurada.</w:t>
-              <w:br/>
-              <w:t>Instrumento: Rúbrica oficial ministerial del Proyecto Integrador (30% sumativo del proyecto).</w:t>
+              <w:t>• Instrumentos: Rúbrica oficial ministerial del Proyecto Integrador (30% sumativo del proyecto).</w:t>
+              <w:br/>
+              <w:t>• Actividades: Sustentación oral del producto final y exposición en feria de aula.</w:t>
             </w:r>
           </w:p>
         </w:tc>
@@ -4256,7 +4252,7 @@
           </w:tcPr>
           <w:p>
             <w:r>
-              <w:t>Evaluación sumativa de las destrezas con criterio de desempeño priorizadas trabajadas en la Unidad 1 y Bloque inicial de Unidad 2 de Lengua y Literatura para 7mo EGB.</w:t>
+              <w:t>Evaluación sumativa de las destrezas con criterio de desempeño priorizadas trabajadas en la Unidad 1 de Lengua y Literatura para 7mo EGB (LL.3.1.1., LL.3.2.1., LL.3.3.5., LL.3.4.1., LL.3.4.10., LL.3.5.1.).</w:t>
             </w:r>
           </w:p>
         </w:tc>
@@ -4480,7 +4476,7 @@
                 <w:b w:val="0"/>
                 <w:sz w:val="20"/>
               </w:rPr>
-              <w:t>Consolidación y evocación de los aprendizajes desarrollados en el trimestre: identificación de artículos científicos, el verbo y sus accidentes, modos verbales, puntuación con punto y coma, el mito, los dialectos del Ecuador y las normas del diálogo formal.</w:t>
+              <w:t>Consolidación y evocación de los aprendizajes desarrollados en la Unidad 1: orígenes y funcionalidad de la escritura, estructura del discurso oral, lectura y valoración de artículos de divulgación científica, conjugación y modos verbales, uso del punto y coma, y características del mito.</w:t>
             </w:r>
           </w:p>
           <w:p>
@@ -4582,7 +4578,7 @@
           </w:tcPr>
           <w:p>
             <w:r>
-              <w:t>Demuestra el dominio de los indicadores de evaluación prioritarios de Lengua y Literatura del subnivel Media: I.LL.3.1.2., I.LL.3.2.2., I.LL.3.3.2., I.LL.3.6.1., I.LL.3.6.3., I.LL.3.7.1.</w:t>
+              <w:t>Demuestra el dominio de los indicadores de evaluación prioritarios de la Unidad 1 de Lengua y Literatura: I.LL.3.1.1., I.LL.3.2.1., I.LL.3.3.2., I.LL.3.6.1., I.LL.3.6.3., I.LL.3.7.1.</w:t>
             </w:r>
           </w:p>
         </w:tc>
@@ -4597,9 +4593,9 @@
           </w:tcPr>
           <w:p>
             <w:r>
-              <w:t>Técnica: Pruebas estructuradas formales.</w:t>
-              <w:br/>
-              <w:t>Instrumento: Cuestionario trimestral de base estructurada aprobado por Vicerrectorado (30% sumativo institucional).</w:t>
+              <w:t>• Instrumentos: Cuestionario trimestral de base estructurada aprobado por Vicerrectorado (30% sumativo institucional).</w:t>
+              <w:br/>
+              <w:t>• Actividades: Aplicación de la evaluación trimestral y consolidación del informe de calificaciones.</w:t>
             </w:r>
           </w:p>
         </w:tc>

</xml_diff>

<commit_message>
Actualizar planificacion microcurricular: corregir pagina 17 en Semana 1 y paralelos A-E
</commit_message>
<xml_diff>
--- a/PLANIFICACION_MICROCURRICULAR_7MO_LENGUA_1ER_TRIMESTRE.docx
+++ b/PLANIFICACION_MICROCURRICULAR_7MO_LENGUA_1ER_TRIMESTRE.docx
@@ -1,6 +1,6 @@
 
 <file path=word/document.xml><?xml version="1.0" encoding="utf-8"?>
-<w:document xmlns:wpc="http://schemas.microsoft.com/office/word/2010/wordprocessingCanvas" xmlns:cx="http://schemas.microsoft.com/office/drawing/2014/chartex" xmlns:mc="http://schemas.openxmlformats.org/markup-compatibility/2006" xmlns:o="urn:schemas-microsoft-com:office:office" xmlns:r="http://schemas.openxmlformats.org/officeDocument/2006/relationships" xmlns:m="http://schemas.openxmlformats.org/officeDocument/2006/math" xmlns:v="urn:schemas-microsoft-com:vml" xmlns:wp14="http://schemas.microsoft.com/office/word/2010/wordprocessingDrawing" xmlns:wp="http://schemas.openxmlformats.org/drawingml/2006/wordprocessingDrawing" xmlns:w10="urn:schemas-microsoft-com:office:word" xmlns:w="http://schemas.openxmlformats.org/wordprocessingml/2006/main" xmlns:w14="http://schemas.microsoft.com/office/word/2010/wordml" xmlns:w15="http://schemas.microsoft.com/office/word/2012/wordml" xmlns:w16se="http://schemas.microsoft.com/office/word/2015/wordml/symex" xmlns:wpg="http://schemas.microsoft.com/office/word/2010/wordprocessingGroup" xmlns:wpi="http://schemas.microsoft.com/office/word/2010/wordprocessingInk" xmlns:wne="http://schemas.microsoft.com/office/word/2006/wordml" xmlns:wps="http://schemas.microsoft.com/office/word/2010/wordprocessingShape" mc:Ignorable="w14 w15 w16se wp14">
+<w:document xmlns:wpc="http://schemas.microsoft.com/office/word/2010/wordprocessingCanvas" xmlns:cx="http://schemas.microsoft.com/office/drawing/2014/chartex" xmlns:cx1="http://schemas.microsoft.com/office/drawing/2015/9/8/chartex" xmlns:cx2="http://schemas.microsoft.com/office/drawing/2015/10/21/chartex" xmlns:cx3="http://schemas.microsoft.com/office/drawing/2016/5/9/chartex" xmlns:cx4="http://schemas.microsoft.com/office/drawing/2016/5/10/chartex" xmlns:cx5="http://schemas.microsoft.com/office/drawing/2016/5/11/chartex" xmlns:cx6="http://schemas.microsoft.com/office/drawing/2016/5/12/chartex" xmlns:cx7="http://schemas.microsoft.com/office/drawing/2016/5/13/chartex" xmlns:cx8="http://schemas.microsoft.com/office/drawing/2016/5/14/chartex" xmlns:mc="http://schemas.openxmlformats.org/markup-compatibility/2006" xmlns:aink="http://schemas.microsoft.com/office/drawing/2016/ink" xmlns:am3d="http://schemas.microsoft.com/office/drawing/2017/model3d" xmlns:o="urn:schemas-microsoft-com:office:office" xmlns:r="http://schemas.openxmlformats.org/officeDocument/2006/relationships" xmlns:m="http://schemas.openxmlformats.org/officeDocument/2006/math" xmlns:v="urn:schemas-microsoft-com:vml" xmlns:wp14="http://schemas.microsoft.com/office/word/2010/wordprocessingDrawing" xmlns:wp="http://schemas.openxmlformats.org/drawingml/2006/wordprocessingDrawing" xmlns:w10="urn:schemas-microsoft-com:office:word" xmlns:w="http://schemas.openxmlformats.org/wordprocessingml/2006/main" xmlns:w14="http://schemas.microsoft.com/office/word/2010/wordml" xmlns:w15="http://schemas.microsoft.com/office/word/2012/wordml" xmlns:w16cex="http://schemas.microsoft.com/office/word/2018/wordml/cex" xmlns:w16cid="http://schemas.microsoft.com/office/word/2016/wordml/cid" xmlns:w16="http://schemas.microsoft.com/office/word/2018/wordml" xmlns:w16sdtdh="http://schemas.microsoft.com/office/word/2020/wordml/sdtdatahash" xmlns:w16se="http://schemas.microsoft.com/office/word/2015/wordml/symex" xmlns:wpg="http://schemas.microsoft.com/office/word/2010/wordprocessingGroup" xmlns:wpi="http://schemas.microsoft.com/office/word/2010/wordprocessingInk" xmlns:wne="http://schemas.microsoft.com/office/word/2006/wordml" xmlns:wps="http://schemas.microsoft.com/office/word/2010/wordprocessingShape" mc:Ignorable="w14 w15 w16se w16cid w16 w16cex w16sdtdh wp14">
   <w:body>
     <w:tbl>
       <w:tblPr>
@@ -75,7 +75,7 @@
               <mc:AlternateContent>
                 <mc:Choice Requires="wps">
                   <w:drawing>
-                    <wp:anchor distT="0" distB="0" distL="114300" distR="114300" simplePos="0" relativeHeight="251659264" behindDoc="0" locked="0" layoutInCell="1" allowOverlap="1" wp14:anchorId="4BBEB859" wp14:editId="6EB31415">
+                    <wp:anchor distT="0" distB="0" distL="114300" distR="114300" simplePos="0" relativeHeight="251659264" behindDoc="0" locked="0" layoutInCell="1" allowOverlap="1" wp14:anchorId="265C34EB" wp14:editId="3A66D717">
                       <wp:simplePos x="0" y="0"/>
                       <wp:positionH relativeFrom="column">
                         <wp:posOffset>44450</wp:posOffset>
@@ -123,7 +123,7 @@
                                       <w:lang w:val="en-US" w:eastAsia="en-US"/>
                                     </w:rPr>
                                     <w:drawing>
-                                      <wp:inline distT="0" distB="0" distL="0" distR="0" wp14:anchorId="63E3BA15" wp14:editId="32669C09">
+                                      <wp:inline distT="0" distB="0" distL="0" distR="0" wp14:anchorId="3EF5A6B2" wp14:editId="7108BD93">
                                         <wp:extent cx="898643" cy="736691"/>
                                         <wp:effectExtent l="0" t="0" r="0" b="6350"/>
                                         <wp:docPr id="59" name="Imagen 59"/>
@@ -196,7 +196,7 @@
                 </mc:Choice>
                 <mc:Fallback>
                   <w:pict>
-                    <v:shapetype w14:anchorId="4BBEB859" id="_x0000_t202" coordsize="21600,21600" o:spt="202" path="m,l,21600r21600,l21600,xe">
+                    <v:shapetype w14:anchorId="265C34EB" id="_x0000_t202" coordsize="21600,21600" o:spt="202" path="m,l,21600r21600,l21600,xe">
                       <v:stroke joinstyle="miter"/>
                       <v:path gradientshapeok="t" o:connecttype="rect"/>
                     </v:shapetype>
@@ -213,7 +213,7 @@
                                 <w:lang w:val="en-US" w:eastAsia="en-US"/>
                               </w:rPr>
                               <w:drawing>
-                                <wp:inline distT="0" distB="0" distL="0" distR="0" wp14:anchorId="63E3BA15" wp14:editId="32669C09">
+                                <wp:inline distT="0" distB="0" distL="0" distR="0" wp14:anchorId="3EF5A6B2" wp14:editId="7108BD93">
                                   <wp:extent cx="898643" cy="736691"/>
                                   <wp:effectExtent l="0" t="0" r="0" b="6350"/>
                                   <wp:docPr id="59" name="Imagen 59"/>
@@ -293,11 +293,13 @@
               </w:rPr>
             </w:pPr>
             <w:r>
-              <w:t>UNIDAD EDUCATIVA FISCAL “CALDERÓN 2”</w:t>
-              <w:br/>
+              <w:rPr>
+                <w:rFonts w:ascii="Times New Roman" w:hAnsi="Times New Roman" w:cs="Times New Roman"/>
+                <w:b/>
+                <w:sz w:val="36"/>
+                <w:lang w:eastAsia="en-US"/>
+              </w:rPr>
               <w:t>PLANIFICACIÓN MICROCURRICULAR TRIMESTRAL</w:t>
-              <w:br/>
-              <w:t>2026 – 2027</w:t>
             </w:r>
           </w:p>
           <w:p>
@@ -405,7 +407,10 @@
           </w:tcPr>
           <w:p>
             <w:r>
-              <w:t>LIC. KLEVER YANEZ / MSC. MERY DÍAZ / LIC. MONICA VINUEZA / LIC. ROCIO CHAUCA / MSC. EDGAR SARANGO</w:t>
+              <w:t xml:space="preserve">LIC. KLEVER YANEZ / MSC. MERY DÍAZ / LIC. MONICA VINUEZA / LIC. </w:t>
+            </w:r>
+            <w:r>
+              <w:t>ROCIO CHAUCA / MSC. EDGAR SARANGO</w:t>
             </w:r>
           </w:p>
         </w:tc>
@@ -628,7 +633,7 @@
           </w:tcPr>
           <w:p>
             <w:r>
-              <w:t>A, B, C, D Y E (Asignado: 7mo "C")</w:t>
+              <w:t xml:space="preserve">A, B, C, D Y E </w:t>
             </w:r>
           </w:p>
         </w:tc>
@@ -857,12 +862,26 @@
           <w:p>
             <w:r>
               <w:t>O.LL.3.1. Interactuar con diversas expresiones culturales para acceder, participar y apropiarse de la cultura escrita.</w:t>
+            </w:r>
+            <w:r>
               <w:br/>
-              <w:t>O.LL.3.3. Comprender discursos orales en diversos contextos de la actividad social y cultural y analizarlos con sentido crítico.</w:t>
+              <w:t xml:space="preserve">O.LL.3.3. Comprender discursos orales en diversos contextos de la actividad social y </w:t>
+            </w:r>
+            <w:r>
+              <w:t>cultural y analizarlos con sentido crítico.</w:t>
+            </w:r>
+            <w:r>
               <w:br/>
               <w:t>O.LL.3.6. Leer de manera autónoma textos no literarios, con fines de recreación, información y aprendizaje, y aplicar estrategias cognitivas de comprensión.</w:t>
+            </w:r>
+            <w:r>
               <w:br/>
-              <w:t>O.LL.3.8. Escribir relatos y textos expositivos, descriptivos e instructivos, adecuados a una situación comunicativa determinada para aprender y comunicarse.</w:t>
+              <w:t>O.LL.3.8. Escribir relatos y textos expositivos, descri</w:t>
+            </w:r>
+            <w:r>
+              <w:t>ptivos e instructivos, adecuados a una situación comunicativa determinada para aprender y comunicarse.</w:t>
+            </w:r>
+            <w:r>
               <w:br/>
               <w:t>O.LL.3.11. Seleccionar y disfrutar textos literarios para realizar interpretaciones personales y construir significados compartidos con otros lectores.</w:t>
             </w:r>
@@ -986,7 +1005,7 @@
                 <w:lang w:val="en-US" w:eastAsia="en-US"/>
               </w:rPr>
               <w:drawing>
-                <wp:inline distT="0" distB="0" distL="0" distR="0" wp14:anchorId="67165D17" wp14:editId="5FFE381C">
+                <wp:inline distT="0" distB="0" distL="0" distR="0" wp14:anchorId="16565E48" wp14:editId="0A6BAA3B">
                   <wp:extent cx="561975" cy="352425"/>
                   <wp:effectExtent l="0" t="0" r="9525" b="9525"/>
                   <wp:docPr id="1" name="Imagen 1"/>
@@ -1084,7 +1103,7 @@
                 <w:lang w:val="en-US" w:eastAsia="en-US"/>
               </w:rPr>
               <w:drawing>
-                <wp:inline distT="0" distB="0" distL="0" distR="0" wp14:anchorId="36BB7492" wp14:editId="5073DC2E">
+                <wp:inline distT="0" distB="0" distL="0" distR="0" wp14:anchorId="5F6E4424" wp14:editId="24390773">
                   <wp:extent cx="514350" cy="342900"/>
                   <wp:effectExtent l="0" t="0" r="0" b="0"/>
                   <wp:docPr id="4" name="Imagen 4"/>
@@ -1181,7 +1200,7 @@
                 <w:lang w:val="en-US" w:eastAsia="en-US"/>
               </w:rPr>
               <w:drawing>
-                <wp:inline distT="0" distB="0" distL="0" distR="0" wp14:anchorId="07D2B412" wp14:editId="3952C479">
+                <wp:inline distT="0" distB="0" distL="0" distR="0" wp14:anchorId="3ADF8F9C" wp14:editId="2D951C6E">
                   <wp:extent cx="478290" cy="352425"/>
                   <wp:effectExtent l="0" t="0" r="0" b="0"/>
                   <wp:docPr id="5" name="Imagen 5"/>
@@ -1268,7 +1287,7 @@
                 <w:lang w:val="en-US" w:eastAsia="en-US"/>
               </w:rPr>
               <w:drawing>
-                <wp:inline distT="0" distB="0" distL="0" distR="0" wp14:anchorId="374816B2" wp14:editId="639B821B">
+                <wp:inline distT="0" distB="0" distL="0" distR="0" wp14:anchorId="4C7069BF" wp14:editId="0F95B0A9">
                   <wp:extent cx="641916" cy="352425"/>
                   <wp:effectExtent l="0" t="0" r="6350" b="0"/>
                   <wp:docPr id="7" name="Imagen 7"/>
@@ -1477,8 +1496,23 @@
             <w:shd w:val="clear" w:color="auto" w:fill="auto"/>
           </w:tcPr>
           <w:p>
-            <w:r>
-              <w:t>LL.3.1.1. Participar en contextos y situaciones que evidencien la funcionalidad de la lengua escrita como herramienta cultural.</w:t>
+            <w:pPr>
+              <w:rPr>
+                <w:rFonts w:ascii="Times New Roman" w:hAnsi="Times New Roman" w:cs="Times New Roman"/>
+              </w:rPr>
+            </w:pPr>
+            <w:r>
+              <w:rPr>
+                <w:rFonts w:ascii="Times New Roman" w:hAnsi="Times New Roman" w:cs="Times New Roman"/>
+              </w:rPr>
+              <w:lastRenderedPageBreak/>
+              <w:t xml:space="preserve">LL.3.1.1. Participar en contextos y situaciones que evidencien la </w:t>
+            </w:r>
+            <w:r>
+              <w:rPr>
+                <w:rFonts w:ascii="Times New Roman" w:hAnsi="Times New Roman" w:cs="Times New Roman"/>
+              </w:rPr>
+              <w:t>funcionalidad de la lengua escrita como herramienta cultural.</w:t>
             </w:r>
           </w:p>
         </w:tc>
@@ -1489,19 +1523,75 @@
             <w:shd w:val="clear" w:color="auto" w:fill="auto"/>
           </w:tcPr>
           <w:p>
-            <w:r>
+            <w:pPr>
+              <w:rPr>
+                <w:rFonts w:ascii="Times New Roman" w:hAnsi="Times New Roman" w:cs="Times New Roman"/>
+              </w:rPr>
+            </w:pPr>
+            <w:r>
+              <w:rPr>
+                <w:rFonts w:ascii="Times New Roman" w:hAnsi="Times New Roman" w:cs="Times New Roman"/>
+              </w:rPr>
               <w:t>Tema: Orígenes de la escritura (de las pinturas rupestres a la era digital)</w:t>
+            </w:r>
+            <w:r>
+              <w:rPr>
+                <w:rFonts w:ascii="Times New Roman" w:hAnsi="Times New Roman" w:cs="Times New Roman"/>
+              </w:rPr>
               <w:br/>
+            </w:r>
+            <w:r>
+              <w:rPr>
+                <w:rFonts w:ascii="Times New Roman" w:hAnsi="Times New Roman" w:cs="Times New Roman"/>
+              </w:rPr>
               <w:br/>
               <w:t>Materiales:</w:t>
+            </w:r>
+            <w:r>
+              <w:rPr>
+                <w:rFonts w:ascii="Times New Roman" w:hAnsi="Times New Roman" w:cs="Times New Roman"/>
+              </w:rPr>
               <w:br/>
-              <w:t>Texto de Lengua 7mo (Páginas 12 a 18)</w:t>
+              <w:t>Texto de Lengua 7mo (Páginas 12 a 1</w:t>
+            </w:r>
+            <w:r>
+              <w:rPr>
+                <w:rFonts w:ascii="Times New Roman" w:hAnsi="Times New Roman" w:cs="Times New Roman"/>
+              </w:rPr>
+              <w:t>7</w:t>
+            </w:r>
+            <w:r>
+              <w:rPr>
+                <w:rFonts w:ascii="Times New Roman" w:hAnsi="Times New Roman" w:cs="Times New Roman"/>
+              </w:rPr>
+              <w:t>)</w:t>
+            </w:r>
+            <w:r>
+              <w:rPr>
+                <w:rFonts w:ascii="Times New Roman" w:hAnsi="Times New Roman" w:cs="Times New Roman"/>
+              </w:rPr>
               <w:br/>
               <w:t>Pizarra y marcadores de colores</w:t>
+            </w:r>
+            <w:r>
+              <w:rPr>
+                <w:rFonts w:ascii="Times New Roman" w:hAnsi="Times New Roman" w:cs="Times New Roman"/>
+              </w:rPr>
               <w:br/>
               <w:t>Cuadernos de trabajo</w:t>
+            </w:r>
+            <w:r>
+              <w:rPr>
+                <w:rFonts w:ascii="Times New Roman" w:hAnsi="Times New Roman" w:cs="Times New Roman"/>
+              </w:rPr>
               <w:br/>
-              <w:t>Guía Docente Maya/MinEduc pág. 12</w:t>
+              <w:t>Guía Docente M</w:t>
+            </w:r>
+            <w:r>
+              <w:rPr>
+                <w:rFonts w:ascii="Times New Roman" w:hAnsi="Times New Roman" w:cs="Times New Roman"/>
+              </w:rPr>
+              <w:t>aya/MinEduc pág. 12</w:t>
             </w:r>
           </w:p>
         </w:tc>
@@ -1515,98 +1605,179 @@
             <w:shd w:val="clear" w:color="auto" w:fill="auto"/>
           </w:tcPr>
           <w:p>
-            <w:r/>
-          </w:p>
-          <w:p>
             <w:pPr>
               <w:spacing w:before="40" w:after="40"/>
-            </w:pPr>
-            <w:r>
-              <w:rPr>
-                <w:rFonts w:ascii="Times New Roman" w:hAnsi="Times New Roman"/>
-                <w:b/>
-                <w:sz w:val="22"/>
-              </w:rPr>
-              <w:t>SEMANA 6 (05/10 al 09/10/2026) · LENGUA Y CULTURA</w:t>
+              <w:rPr>
+                <w:rFonts w:ascii="Times New Roman" w:hAnsi="Times New Roman" w:cs="Times New Roman"/>
+              </w:rPr>
+            </w:pPr>
+            <w:r>
+              <w:rPr>
+                <w:rFonts w:ascii="Times New Roman" w:hAnsi="Times New Roman" w:cs="Times New Roman"/>
+                <w:b/>
+              </w:rPr>
+              <w:t xml:space="preserve">                                </w:t>
+            </w:r>
+            <w:r>
+              <w:rPr>
+                <w:rFonts w:ascii="Times New Roman" w:hAnsi="Times New Roman" w:cs="Times New Roman"/>
+                <w:b/>
+              </w:rPr>
+              <w:t xml:space="preserve">SEMANA </w:t>
+            </w:r>
+            <w:r>
+              <w:rPr>
+                <w:rFonts w:ascii="Times New Roman" w:hAnsi="Times New Roman" w:cs="Times New Roman"/>
+                <w:b/>
+              </w:rPr>
+              <w:t>1</w:t>
             </w:r>
           </w:p>
           <w:p>
             <w:pPr>
               <w:spacing w:after="80"/>
-            </w:pPr>
-            <w:r>
-              <w:rPr>
-                <w:rFonts w:ascii="Times New Roman" w:hAnsi="Times New Roman"/>
-                <w:b/>
-                <w:sz w:val="21"/>
+              <w:jc w:val="center"/>
+              <w:rPr>
+                <w:rFonts w:ascii="Times New Roman" w:hAnsi="Times New Roman" w:cs="Times New Roman"/>
+                <w:b/>
+              </w:rPr>
+            </w:pPr>
+            <w:r>
+              <w:rPr>
+                <w:rFonts w:ascii="Times New Roman" w:hAnsi="Times New Roman" w:cs="Times New Roman"/>
+                <w:b/>
               </w:rPr>
               <w:t>GAMIFICACIÓN &amp; APRENDIZAJE POR DESCUBRIMIENTO</w:t>
+            </w:r>
+          </w:p>
+          <w:p>
+            <w:pPr>
+              <w:spacing w:after="80"/>
+              <w:rPr>
+                <w:rFonts w:ascii="Times New Roman" w:hAnsi="Times New Roman" w:cs="Times New Roman"/>
+              </w:rPr>
+            </w:pPr>
+            <w:r>
+              <w:rPr>
+                <w:rFonts w:ascii="Times New Roman" w:hAnsi="Times New Roman" w:cs="Times New Roman"/>
+                <w:color w:val="FF0000"/>
+              </w:rPr>
+              <w:t>Nombre de la actividad:</w:t>
+            </w:r>
+            <w:r>
+              <w:rPr>
+                <w:rFonts w:ascii="Times New Roman" w:hAnsi="Times New Roman" w:cs="Times New Roman"/>
+              </w:rPr>
               <w:br/>
-            </w:r>
-            <w:r>
-              <w:rPr>
-                <w:rFonts w:ascii="Times New Roman" w:hAnsi="Times New Roman"/>
-                <w:sz w:val="20"/>
-              </w:rPr>
-              <w:t>Nombre de la actividad:</w:t>
-              <w:br/>
-              <w:t>“Misión: Arqueólogos del Tiempo y el Enigma del Alfabeto Perdido” (Texto Pág. 12-18)</w:t>
+              <w:t>“Misión: Arqueólogos del Tiempo y el Enigma del Alfabeto Perdido” (Texto Pág. 12-1</w:t>
+            </w:r>
+            <w:r>
+              <w:rPr>
+                <w:rFonts w:ascii="Times New Roman" w:hAnsi="Times New Roman" w:cs="Times New Roman"/>
+              </w:rPr>
+              <w:t>7</w:t>
+            </w:r>
+            <w:r>
+              <w:rPr>
+                <w:rFonts w:ascii="Times New Roman" w:hAnsi="Times New Roman" w:cs="Times New Roman"/>
+              </w:rPr>
+              <w:t>)</w:t>
             </w:r>
           </w:p>
           <w:p>
             <w:pPr>
               <w:spacing w:before="60" w:after="20"/>
-            </w:pPr>
-            <w:r>
-              <w:rPr>
-                <w:rFonts w:ascii="Times New Roman" w:hAnsi="Times New Roman"/>
-                <w:b/>
-                <w:sz w:val="20"/>
-              </w:rPr>
-              <w:t>Fase 1: Motivación – “Desbloqueando la Misión Arqueológica”</w:t>
+              <w:rPr>
+                <w:rFonts w:ascii="Times New Roman" w:hAnsi="Times New Roman" w:cs="Times New Roman"/>
+              </w:rPr>
+            </w:pPr>
+            <w:r>
+              <w:rPr>
+                <w:rFonts w:ascii="Times New Roman" w:hAnsi="Times New Roman" w:cs="Times New Roman"/>
+                <w:b/>
+              </w:rPr>
+              <w:t xml:space="preserve">Fase 1: Motivación – </w:t>
+            </w:r>
+            <w:r>
+              <w:rPr>
+                <w:rFonts w:ascii="Times New Roman" w:hAnsi="Times New Roman" w:cs="Times New Roman"/>
+                <w:b/>
+              </w:rPr>
+              <w:t>“Desbloqueando la Misión Arqueológica”</w:t>
             </w:r>
           </w:p>
           <w:p>
             <w:pPr>
               <w:spacing w:after="20"/>
-            </w:pPr>
-            <w:r>
-              <w:rPr>
-                <w:rFonts w:ascii="Times New Roman" w:hAnsi="Times New Roman"/>
-                <w:b/>
-                <w:sz w:val="19"/>
+              <w:rPr>
+                <w:rFonts w:ascii="Times New Roman" w:hAnsi="Times New Roman" w:cs="Times New Roman"/>
+              </w:rPr>
+            </w:pPr>
+            <w:r>
+              <w:rPr>
+                <w:rFonts w:ascii="Times New Roman" w:hAnsi="Times New Roman" w:cs="Times New Roman"/>
+                <w:b/>
               </w:rPr>
               <w:t xml:space="preserve">Actividad: </w:t>
             </w:r>
             <w:r>
               <w:rPr>
-                <w:rFonts w:ascii="Times New Roman" w:hAnsi="Times New Roman"/>
-                <w:sz w:val="19"/>
-              </w:rPr>
-              <w:t>El docente presenta una historia gamificada a partir de las imágenes de la página 12: 'La Gran Biblioteca de Alejandría y los primeros escribas de la humanidad necesitan recuperar los mensajes ocultos que explican el nacimiento de las civilizaciones. Los estudiantes serán Arqueólogos de la Cultura Escrita y deberán descifrar enigmas para avanzar en el mapa del tiempo.' Preguntas detonantes del libro: ¿Qué conoces sobre las primeras formas de escritura? ¿Cómo ha evolucionado en el tiempo? ¿Para qué usas la palabra escrita hoy?</w:t>
+                <w:rFonts w:ascii="Times New Roman" w:hAnsi="Times New Roman" w:cs="Times New Roman"/>
+              </w:rPr>
+              <w:t>El docente presenta una historia gamificada a partir de las imágenes de la página 12: 'La Gran Biblioteca de Alejandría y los primeros escribas de la humanidad necesitan recuperar los mensajes ocultos que e</w:t>
+            </w:r>
+            <w:r>
+              <w:rPr>
+                <w:rFonts w:ascii="Times New Roman" w:hAnsi="Times New Roman" w:cs="Times New Roman"/>
+              </w:rPr>
+              <w:t>xplican el nacimiento de las civilizaciones. Los estudiantes serán Arqueólogos de la Cultura Escrita y deberán descifrar enigmas para avanzar en el mapa del tiempo.' Preguntas detonantes del libro: ¿Qué conoces sobre las primeras formas de escritura? ¿Cómo</w:t>
+            </w:r>
+            <w:r>
+              <w:rPr>
+                <w:rFonts w:ascii="Times New Roman" w:hAnsi="Times New Roman" w:cs="Times New Roman"/>
+              </w:rPr>
+              <w:t xml:space="preserve"> ha evolucionado en el tiempo? ¿Para qué usas la palabra escrita hoy?</w:t>
             </w:r>
           </w:p>
           <w:p>
             <w:pPr>
               <w:spacing w:after="40"/>
-            </w:pPr>
-            <w:r>
-              <w:rPr>
-                <w:rFonts w:ascii="Times New Roman" w:hAnsi="Times New Roman"/>
-                <w:sz w:val="19"/>
-              </w:rPr>
-              <w:t>Gamificación: Cada estudiante elige su 'Avatar Histórico' (Pintor Rupestre, Escriba Sumerio, Filósofo del Papiro o Escriba Digital) y recibe su bitácora de viaje con 100 Puntos de Sabiduría iniciales.</w:t>
+              <w:rPr>
+                <w:rFonts w:ascii="Times New Roman" w:hAnsi="Times New Roman" w:cs="Times New Roman"/>
+              </w:rPr>
+            </w:pPr>
+            <w:r>
+              <w:rPr>
+                <w:rFonts w:ascii="Times New Roman" w:hAnsi="Times New Roman" w:cs="Times New Roman"/>
+                <w:b/>
+                <w:bCs/>
+              </w:rPr>
+              <w:t>Gamificación:</w:t>
+            </w:r>
+            <w:r>
+              <w:rPr>
+                <w:rFonts w:ascii="Times New Roman" w:hAnsi="Times New Roman" w:cs="Times New Roman"/>
+              </w:rPr>
+              <w:t xml:space="preserve"> Cada estudiante elige su 'Avatar Histórico' (Pintor Rupestre, Escriba Sumerio, Filósofo del Papiro o Escriba Digital) y recibe su bitácora de viaje con 100 Puntos de Sabidu</w:t>
+            </w:r>
+            <w:r>
+              <w:rPr>
+                <w:rFonts w:ascii="Times New Roman" w:hAnsi="Times New Roman" w:cs="Times New Roman"/>
+              </w:rPr>
+              <w:t>ría iniciales.</w:t>
             </w:r>
           </w:p>
           <w:p>
             <w:pPr>
               <w:spacing w:after="20"/>
-            </w:pPr>
-            <w:r>
-              <w:rPr>
-                <w:rFonts w:ascii="Times New Roman" w:hAnsi="Times New Roman"/>
-                <w:b/>
-                <w:sz w:val="19"/>
+              <w:rPr>
+                <w:rFonts w:ascii="Times New Roman" w:hAnsi="Times New Roman" w:cs="Times New Roman"/>
+              </w:rPr>
+            </w:pPr>
+            <w:r>
+              <w:rPr>
+                <w:rFonts w:ascii="Times New Roman" w:hAnsi="Times New Roman" w:cs="Times New Roman"/>
+                <w:b/>
               </w:rPr>
               <w:t>DUA aplicado:</w:t>
             </w:r>
@@ -1614,19 +1785,20 @@
           <w:p>
             <w:pPr>
               <w:spacing w:after="20"/>
-            </w:pPr>
-            <w:r>
-              <w:rPr>
-                <w:rFonts w:ascii="Times New Roman" w:hAnsi="Times New Roman"/>
-                <w:b/>
-                <w:sz w:val="18"/>
+              <w:rPr>
+                <w:rFonts w:ascii="Times New Roman" w:hAnsi="Times New Roman" w:cs="Times New Roman"/>
+              </w:rPr>
+            </w:pPr>
+            <w:r>
+              <w:rPr>
+                <w:rFonts w:ascii="Times New Roman" w:hAnsi="Times New Roman" w:cs="Times New Roman"/>
+                <w:b/>
               </w:rPr>
               <w:t xml:space="preserve">Representación: </w:t>
             </w:r>
             <w:r>
               <w:rPr>
-                <w:rFonts w:ascii="Times New Roman" w:hAnsi="Times New Roman"/>
-                <w:sz w:val="18"/>
+                <w:rFonts w:ascii="Times New Roman" w:hAnsi="Times New Roman" w:cs="Times New Roman"/>
               </w:rPr>
               <w:t>Infografía visual de la pág. 12 con pinturas rupestres, tablillas sumerias, jeroglíficos y tecnología digital moderna.</w:t>
             </w:r>
@@ -1634,39 +1806,47 @@
           <w:p>
             <w:pPr>
               <w:spacing w:after="20"/>
-            </w:pPr>
-            <w:r>
-              <w:rPr>
-                <w:rFonts w:ascii="Times New Roman" w:hAnsi="Times New Roman"/>
-                <w:b/>
-                <w:sz w:val="18"/>
+              <w:rPr>
+                <w:rFonts w:ascii="Times New Roman" w:hAnsi="Times New Roman" w:cs="Times New Roman"/>
+              </w:rPr>
+            </w:pPr>
+            <w:r>
+              <w:rPr>
+                <w:rFonts w:ascii="Times New Roman" w:hAnsi="Times New Roman" w:cs="Times New Roman"/>
+                <w:b/>
               </w:rPr>
               <w:t xml:space="preserve">Acción y expresión: </w:t>
             </w:r>
             <w:r>
               <w:rPr>
-                <w:rFonts w:ascii="Times New Roman" w:hAnsi="Times New Roman"/>
-                <w:sz w:val="18"/>
-              </w:rPr>
-              <w:t>Selección de su avatar mediante dibujo o distintivo; participación oral en lluvia de ideas.</w:t>
+                <w:rFonts w:ascii="Times New Roman" w:hAnsi="Times New Roman" w:cs="Times New Roman"/>
+              </w:rPr>
+              <w:t xml:space="preserve">Selección de su avatar mediante dibujo o distintivo; participación oral </w:t>
+            </w:r>
+            <w:r>
+              <w:rPr>
+                <w:rFonts w:ascii="Times New Roman" w:hAnsi="Times New Roman" w:cs="Times New Roman"/>
+              </w:rPr>
+              <w:t>en lluvia de ideas.</w:t>
             </w:r>
           </w:p>
           <w:p>
             <w:pPr>
               <w:spacing w:after="20"/>
-            </w:pPr>
-            <w:r>
-              <w:rPr>
-                <w:rFonts w:ascii="Times New Roman" w:hAnsi="Times New Roman"/>
-                <w:b/>
-                <w:sz w:val="18"/>
+              <w:rPr>
+                <w:rFonts w:ascii="Times New Roman" w:hAnsi="Times New Roman" w:cs="Times New Roman"/>
+              </w:rPr>
+            </w:pPr>
+            <w:r>
+              <w:rPr>
+                <w:rFonts w:ascii="Times New Roman" w:hAnsi="Times New Roman" w:cs="Times New Roman"/>
+                <w:b/>
               </w:rPr>
               <w:t xml:space="preserve">Compromiso-Motivación: </w:t>
             </w:r>
             <w:r>
               <w:rPr>
-                <w:rFonts w:ascii="Times New Roman" w:hAnsi="Times New Roman"/>
-                <w:sz w:val="18"/>
+                <w:rFonts w:ascii="Times New Roman" w:hAnsi="Times New Roman" w:cs="Times New Roman"/>
               </w:rPr>
               <w:t>Desafío de exploración histórica inmersiva con insignias y niveles de arqueólogo.</w:t>
             </w:r>
@@ -1677,6 +1857,7 @@
               <w:tblW w:w="0" w:type="auto"/>
               <w:jc w:val="center"/>
               <w:tblLayout w:type="fixed"/>
+              <w:tblLook w:val="04A0" w:firstRow="1" w:lastRow="0" w:firstColumn="1" w:lastColumn="0" w:noHBand="0" w:noVBand="1"/>
             </w:tblPr>
             <w:tblGrid>
               <w:gridCol w:w="683"/>
@@ -1696,12 +1877,12 @@
                 <w:p>
                   <w:pPr>
                     <w:pStyle w:val="Sinespaciado"/>
+                    <w:framePr w:hSpace="141" w:wrap="around" w:vAnchor="text" w:hAnchor="margin" w:y="-138"/>
                     <w:jc w:val="center"/>
                     <w:rPr>
                       <w:rFonts w:ascii="Times New Roman" w:hAnsi="Times New Roman" w:cs="Times New Roman"/>
                       <w:b/>
                       <w:color w:val="FFFFFF"/>
-                      <w:sz w:val="20"/>
                     </w:rPr>
                   </w:pPr>
                   <w:r>
@@ -1709,7 +1890,6 @@
                       <w:rFonts w:ascii="Times New Roman" w:hAnsi="Times New Roman" w:cs="Times New Roman"/>
                       <w:b/>
                       <w:color w:val="FFFFFF"/>
-                      <w:sz w:val="20"/>
                     </w:rPr>
                     <w:t>R</w:t>
                   </w:r>
@@ -1723,12 +1903,12 @@
                 <w:p>
                   <w:pPr>
                     <w:pStyle w:val="Sinespaciado"/>
+                    <w:framePr w:hSpace="141" w:wrap="around" w:vAnchor="text" w:hAnchor="margin" w:y="-138"/>
                     <w:jc w:val="center"/>
                     <w:rPr>
                       <w:rFonts w:ascii="Times New Roman" w:hAnsi="Times New Roman" w:cs="Times New Roman"/>
                       <w:b/>
                       <w:color w:val="FFFFFF"/>
-                      <w:sz w:val="20"/>
                     </w:rPr>
                   </w:pPr>
                   <w:r>
@@ -1736,7 +1916,6 @@
                       <w:rFonts w:ascii="Times New Roman" w:hAnsi="Times New Roman" w:cs="Times New Roman"/>
                       <w:b/>
                       <w:color w:val="FFFFFF"/>
-                      <w:sz w:val="20"/>
                     </w:rPr>
                     <w:t>A-E</w:t>
                   </w:r>
@@ -1750,12 +1929,12 @@
                 <w:p>
                   <w:pPr>
                     <w:pStyle w:val="Sinespaciado"/>
+                    <w:framePr w:hSpace="141" w:wrap="around" w:vAnchor="text" w:hAnchor="margin" w:y="-138"/>
                     <w:jc w:val="center"/>
                     <w:rPr>
                       <w:rFonts w:ascii="Times New Roman" w:hAnsi="Times New Roman" w:cs="Times New Roman"/>
                       <w:b/>
                       <w:color w:val="FFFFFF"/>
-                      <w:sz w:val="20"/>
                     </w:rPr>
                   </w:pPr>
                   <w:r>
@@ -1763,7 +1942,6 @@
                       <w:rFonts w:ascii="Times New Roman" w:hAnsi="Times New Roman" w:cs="Times New Roman"/>
                       <w:b/>
                       <w:color w:val="FFFFFF"/>
-                      <w:sz w:val="20"/>
                     </w:rPr>
                     <w:t>C-M</w:t>
                   </w:r>
@@ -1774,17 +1952,22 @@
           <w:p>
             <w:pPr>
               <w:spacing w:before="40" w:after="40"/>
+              <w:rPr>
+                <w:rFonts w:ascii="Times New Roman" w:hAnsi="Times New Roman" w:cs="Times New Roman"/>
+              </w:rPr>
             </w:pPr>
           </w:p>
           <w:p>
             <w:pPr>
               <w:spacing w:before="60" w:after="20"/>
-            </w:pPr>
-            <w:r>
-              <w:rPr>
-                <w:rFonts w:ascii="Times New Roman" w:hAnsi="Times New Roman"/>
-                <w:b/>
-                <w:sz w:val="20"/>
+              <w:rPr>
+                <w:rFonts w:ascii="Times New Roman" w:hAnsi="Times New Roman" w:cs="Times New Roman"/>
+              </w:rPr>
+            </w:pPr>
+            <w:r>
+              <w:rPr>
+                <w:rFonts w:ascii="Times New Roman" w:hAnsi="Times New Roman" w:cs="Times New Roman"/>
+                <w:b/>
               </w:rPr>
               <w:t>Fase 2: Comprensión – “La Ruleta de los Soportes y la Línea del Tiempo”</w:t>
             </w:r>
@@ -1792,44 +1975,69 @@
           <w:p>
             <w:pPr>
               <w:spacing w:after="20"/>
-            </w:pPr>
-            <w:r>
-              <w:rPr>
-                <w:rFonts w:ascii="Times New Roman" w:hAnsi="Times New Roman"/>
-                <w:b/>
-                <w:sz w:val="19"/>
+              <w:rPr>
+                <w:rFonts w:ascii="Times New Roman" w:hAnsi="Times New Roman" w:cs="Times New Roman"/>
+              </w:rPr>
+            </w:pPr>
+            <w:r>
+              <w:rPr>
+                <w:rFonts w:ascii="Times New Roman" w:hAnsi="Times New Roman" w:cs="Times New Roman"/>
+                <w:b/>
               </w:rPr>
               <w:t xml:space="preserve">Actividad: </w:t>
             </w:r>
             <w:r>
               <w:rPr>
-                <w:rFonts w:ascii="Times New Roman" w:hAnsi="Times New Roman"/>
-                <w:sz w:val="19"/>
-              </w:rPr>
-              <w:t>Lectura guiada de las páginas 13 a 17 sobre los soportes de la escritura (arcilla cuneiforme, papiro egipcio, pergamino, papel de trapo, imprenta de Gutenberg y soportes digitales). Dinámica de relevos por equipos: relacionar cada material con su civilización y función social para registrar cosechas, leyes y memorias.</w:t>
+                <w:rFonts w:ascii="Times New Roman" w:hAnsi="Times New Roman" w:cs="Times New Roman"/>
+              </w:rPr>
+              <w:t>Lectura guiada de las páginas 13 a 1</w:t>
+            </w:r>
+            <w:r>
+              <w:rPr>
+                <w:rFonts w:ascii="Times New Roman" w:hAnsi="Times New Roman" w:cs="Times New Roman"/>
+              </w:rPr>
+              <w:t xml:space="preserve">7 sobre los soportes de la escritura (arcilla cuneiforme, papiro egipcio, pergamino, papel de trapo, imprenta de Gutenberg y soportes digitales). Dinámica de relevos por equipos: relacionar cada material con su civilización y función social para registrar </w:t>
+            </w:r>
+            <w:r>
+              <w:rPr>
+                <w:rFonts w:ascii="Times New Roman" w:hAnsi="Times New Roman" w:cs="Times New Roman"/>
+              </w:rPr>
+              <w:t>cosechas, leyes y memorias.</w:t>
             </w:r>
           </w:p>
           <w:p>
             <w:pPr>
               <w:spacing w:after="40"/>
-            </w:pPr>
-            <w:r>
-              <w:rPr>
-                <w:rFonts w:ascii="Times New Roman" w:hAnsi="Times New Roman"/>
-                <w:sz w:val="19"/>
-              </w:rPr>
-              <w:t>Gamificación: Cada asociación correcta otorga 10 puntos y desbloquea la carta de poder cívico 'Memoria Colectiva' (valor de la preservación de acuerdos y derechos de los pueblos).</w:t>
+              <w:rPr>
+                <w:rFonts w:ascii="Times New Roman" w:hAnsi="Times New Roman" w:cs="Times New Roman"/>
+              </w:rPr>
+            </w:pPr>
+            <w:r>
+              <w:rPr>
+                <w:rFonts w:ascii="Times New Roman" w:hAnsi="Times New Roman" w:cs="Times New Roman"/>
+                <w:b/>
+                <w:bCs/>
+              </w:rPr>
+              <w:t>Gamificación:</w:t>
+            </w:r>
+            <w:r>
+              <w:rPr>
+                <w:rFonts w:ascii="Times New Roman" w:hAnsi="Times New Roman" w:cs="Times New Roman"/>
+              </w:rPr>
+              <w:t xml:space="preserve"> Cada asociación correcta otorga 10 puntos y desbloquea la carta de poder cívico 'Memoria Colectiva' (valor de la preservación de acuerdos y derechos de los pueblos).</w:t>
             </w:r>
           </w:p>
           <w:p>
             <w:pPr>
               <w:spacing w:after="20"/>
-            </w:pPr>
-            <w:r>
-              <w:rPr>
-                <w:rFonts w:ascii="Times New Roman" w:hAnsi="Times New Roman"/>
-                <w:b/>
-                <w:sz w:val="19"/>
+              <w:rPr>
+                <w:rFonts w:ascii="Times New Roman" w:hAnsi="Times New Roman" w:cs="Times New Roman"/>
+              </w:rPr>
+            </w:pPr>
+            <w:r>
+              <w:rPr>
+                <w:rFonts w:ascii="Times New Roman" w:hAnsi="Times New Roman" w:cs="Times New Roman"/>
+                <w:b/>
               </w:rPr>
               <w:t>DUA aplicado:</w:t>
             </w:r>
@@ -1837,39 +2045,47 @@
           <w:p>
             <w:pPr>
               <w:spacing w:after="20"/>
-            </w:pPr>
-            <w:r>
-              <w:rPr>
-                <w:rFonts w:ascii="Times New Roman" w:hAnsi="Times New Roman"/>
-                <w:b/>
-                <w:sz w:val="18"/>
+              <w:rPr>
+                <w:rFonts w:ascii="Times New Roman" w:hAnsi="Times New Roman" w:cs="Times New Roman"/>
+              </w:rPr>
+            </w:pPr>
+            <w:r>
+              <w:rPr>
+                <w:rFonts w:ascii="Times New Roman" w:hAnsi="Times New Roman" w:cs="Times New Roman"/>
+                <w:b/>
               </w:rPr>
               <w:t xml:space="preserve">Representación: </w:t>
             </w:r>
             <w:r>
               <w:rPr>
-                <w:rFonts w:ascii="Times New Roman" w:hAnsi="Times New Roman"/>
-                <w:sz w:val="18"/>
-              </w:rPr>
-              <w:t>Muestras táctiles/visuales de papel, arcilla y pergamino; organizadores gráficos cromáticos en pizarra.</w:t>
+                <w:rFonts w:ascii="Times New Roman" w:hAnsi="Times New Roman" w:cs="Times New Roman"/>
+              </w:rPr>
+              <w:t xml:space="preserve">Muestras </w:t>
+            </w:r>
+            <w:r>
+              <w:rPr>
+                <w:rFonts w:ascii="Times New Roman" w:hAnsi="Times New Roman" w:cs="Times New Roman"/>
+              </w:rPr>
+              <w:t>táctiles/visuales de papel, arcilla y pergamino; organizadores gráficos cromáticos en pizarra.</w:t>
             </w:r>
           </w:p>
           <w:p>
             <w:pPr>
               <w:spacing w:after="20"/>
-            </w:pPr>
-            <w:r>
-              <w:rPr>
-                <w:rFonts w:ascii="Times New Roman" w:hAnsi="Times New Roman"/>
-                <w:b/>
-                <w:sz w:val="18"/>
+              <w:rPr>
+                <w:rFonts w:ascii="Times New Roman" w:hAnsi="Times New Roman" w:cs="Times New Roman"/>
+              </w:rPr>
+            </w:pPr>
+            <w:r>
+              <w:rPr>
+                <w:rFonts w:ascii="Times New Roman" w:hAnsi="Times New Roman" w:cs="Times New Roman"/>
+                <w:b/>
               </w:rPr>
               <w:t xml:space="preserve">Acción y expresión: </w:t>
             </w:r>
             <w:r>
               <w:rPr>
-                <w:rFonts w:ascii="Times New Roman" w:hAnsi="Times New Roman"/>
-                <w:sz w:val="18"/>
+                <w:rFonts w:ascii="Times New Roman" w:hAnsi="Times New Roman" w:cs="Times New Roman"/>
               </w:rPr>
               <w:t>Respuestas orales, construcción de una línea de tiempo cronológica en el cuaderno o dramatización rápida.</w:t>
             </w:r>
@@ -1877,21 +2093,28 @@
           <w:p>
             <w:pPr>
               <w:spacing w:after="20"/>
-            </w:pPr>
-            <w:r>
-              <w:rPr>
-                <w:rFonts w:ascii="Times New Roman" w:hAnsi="Times New Roman"/>
-                <w:b/>
-                <w:sz w:val="18"/>
+              <w:rPr>
+                <w:rFonts w:ascii="Times New Roman" w:hAnsi="Times New Roman" w:cs="Times New Roman"/>
+              </w:rPr>
+            </w:pPr>
+            <w:r>
+              <w:rPr>
+                <w:rFonts w:ascii="Times New Roman" w:hAnsi="Times New Roman" w:cs="Times New Roman"/>
+                <w:b/>
               </w:rPr>
               <w:t xml:space="preserve">Compromiso-Motivación: </w:t>
             </w:r>
             <w:r>
               <w:rPr>
-                <w:rFonts w:ascii="Times New Roman" w:hAnsi="Times New Roman"/>
-                <w:sz w:val="18"/>
-              </w:rPr>
-              <w:t>Trabajo cooperativo en clanes con metas claras y recompensas inmediatas de equipo.</w:t>
+                <w:rFonts w:ascii="Times New Roman" w:hAnsi="Times New Roman" w:cs="Times New Roman"/>
+              </w:rPr>
+              <w:t>Trabajo coop</w:t>
+            </w:r>
+            <w:r>
+              <w:rPr>
+                <w:rFonts w:ascii="Times New Roman" w:hAnsi="Times New Roman" w:cs="Times New Roman"/>
+              </w:rPr>
+              <w:t>erativo en clanes con metas claras y recompensas inmediatas de equipo.</w:t>
             </w:r>
           </w:p>
           <w:tbl>
@@ -1900,6 +2123,7 @@
               <w:tblW w:w="0" w:type="auto"/>
               <w:jc w:val="center"/>
               <w:tblLayout w:type="fixed"/>
+              <w:tblLook w:val="04A0" w:firstRow="1" w:lastRow="0" w:firstColumn="1" w:lastColumn="0" w:noHBand="0" w:noVBand="1"/>
             </w:tblPr>
             <w:tblGrid>
               <w:gridCol w:w="683"/>
@@ -1919,12 +2143,12 @@
                 <w:p>
                   <w:pPr>
                     <w:pStyle w:val="Sinespaciado"/>
+                    <w:framePr w:hSpace="141" w:wrap="around" w:vAnchor="text" w:hAnchor="margin" w:y="-138"/>
                     <w:jc w:val="center"/>
                     <w:rPr>
                       <w:rFonts w:ascii="Times New Roman" w:hAnsi="Times New Roman" w:cs="Times New Roman"/>
                       <w:b/>
                       <w:color w:val="FFFFFF"/>
-                      <w:sz w:val="20"/>
                     </w:rPr>
                   </w:pPr>
                   <w:r>
@@ -1932,7 +2156,6 @@
                       <w:rFonts w:ascii="Times New Roman" w:hAnsi="Times New Roman" w:cs="Times New Roman"/>
                       <w:b/>
                       <w:color w:val="FFFFFF"/>
-                      <w:sz w:val="20"/>
                     </w:rPr>
                     <w:t>R</w:t>
                   </w:r>
@@ -1946,12 +2169,12 @@
                 <w:p>
                   <w:pPr>
                     <w:pStyle w:val="Sinespaciado"/>
+                    <w:framePr w:hSpace="141" w:wrap="around" w:vAnchor="text" w:hAnchor="margin" w:y="-138"/>
                     <w:jc w:val="center"/>
                     <w:rPr>
                       <w:rFonts w:ascii="Times New Roman" w:hAnsi="Times New Roman" w:cs="Times New Roman"/>
                       <w:b/>
                       <w:color w:val="FFFFFF"/>
-                      <w:sz w:val="20"/>
                     </w:rPr>
                   </w:pPr>
                   <w:r>
@@ -1959,7 +2182,6 @@
                       <w:rFonts w:ascii="Times New Roman" w:hAnsi="Times New Roman" w:cs="Times New Roman"/>
                       <w:b/>
                       <w:color w:val="FFFFFF"/>
-                      <w:sz w:val="20"/>
                     </w:rPr>
                     <w:t>A-E</w:t>
                   </w:r>
@@ -1973,12 +2195,12 @@
                 <w:p>
                   <w:pPr>
                     <w:pStyle w:val="Sinespaciado"/>
+                    <w:framePr w:hSpace="141" w:wrap="around" w:vAnchor="text" w:hAnchor="margin" w:y="-138"/>
                     <w:jc w:val="center"/>
                     <w:rPr>
                       <w:rFonts w:ascii="Times New Roman" w:hAnsi="Times New Roman" w:cs="Times New Roman"/>
                       <w:b/>
                       <w:color w:val="FFFFFF"/>
-                      <w:sz w:val="20"/>
                     </w:rPr>
                   </w:pPr>
                   <w:r>
@@ -1986,7 +2208,6 @@
                       <w:rFonts w:ascii="Times New Roman" w:hAnsi="Times New Roman" w:cs="Times New Roman"/>
                       <w:b/>
                       <w:color w:val="FFFFFF"/>
-                      <w:sz w:val="20"/>
                     </w:rPr>
                     <w:t>C-M</w:t>
                   </w:r>
@@ -1997,17 +2218,22 @@
           <w:p>
             <w:pPr>
               <w:spacing w:before="40" w:after="40"/>
+              <w:rPr>
+                <w:rFonts w:ascii="Times New Roman" w:hAnsi="Times New Roman" w:cs="Times New Roman"/>
+              </w:rPr>
             </w:pPr>
           </w:p>
           <w:p>
             <w:pPr>
               <w:spacing w:before="60" w:after="20"/>
-            </w:pPr>
-            <w:r>
-              <w:rPr>
-                <w:rFonts w:ascii="Times New Roman" w:hAnsi="Times New Roman"/>
-                <w:b/>
-                <w:sz w:val="20"/>
+              <w:rPr>
+                <w:rFonts w:ascii="Times New Roman" w:hAnsi="Times New Roman" w:cs="Times New Roman"/>
+              </w:rPr>
+            </w:pPr>
+            <w:r>
+              <w:rPr>
+                <w:rFonts w:ascii="Times New Roman" w:hAnsi="Times New Roman" w:cs="Times New Roman"/>
+                <w:b/>
               </w:rPr>
               <w:t>Fase 3: Aplicación – “El Gran Código Criptográfico de los Escribas”</w:t>
             </w:r>
@@ -2015,44 +2241,73 @@
           <w:p>
             <w:pPr>
               <w:spacing w:after="20"/>
-            </w:pPr>
-            <w:r>
-              <w:rPr>
-                <w:rFonts w:ascii="Times New Roman" w:hAnsi="Times New Roman"/>
-                <w:b/>
-                <w:sz w:val="19"/>
+              <w:rPr>
+                <w:rFonts w:ascii="Times New Roman" w:hAnsi="Times New Roman" w:cs="Times New Roman"/>
+              </w:rPr>
+            </w:pPr>
+            <w:r>
+              <w:rPr>
+                <w:rFonts w:ascii="Times New Roman" w:hAnsi="Times New Roman" w:cs="Times New Roman"/>
+                <w:b/>
               </w:rPr>
               <w:t xml:space="preserve">Actividad: </w:t>
             </w:r>
             <w:r>
               <w:rPr>
-                <w:rFonts w:ascii="Times New Roman" w:hAnsi="Times New Roman"/>
-                <w:sz w:val="19"/>
-              </w:rPr>
-              <w:t>Los estudiantes asumen el reto de la página 18 del texto escolar: descifrar el mensaje secreto utilizando el código de sustitución alfabética. Luego, responden a situaciones reales: ¿Por qué la palabra escrita ofrece mayor seguridad jurídica y personal que un acuerdo verbal?</w:t>
+                <w:rFonts w:ascii="Times New Roman" w:hAnsi="Times New Roman" w:cs="Times New Roman"/>
+              </w:rPr>
+              <w:t>Los estudiantes asumen el reto de la página 1</w:t>
+            </w:r>
+            <w:r>
+              <w:rPr>
+                <w:rFonts w:ascii="Times New Roman" w:hAnsi="Times New Roman" w:cs="Times New Roman"/>
+              </w:rPr>
+              <w:t>7</w:t>
+            </w:r>
+            <w:r>
+              <w:rPr>
+                <w:rFonts w:ascii="Times New Roman" w:hAnsi="Times New Roman" w:cs="Times New Roman"/>
+              </w:rPr>
+              <w:t xml:space="preserve"> del texto escolar: descifrar el mensaje secreto</w:t>
+            </w:r>
+            <w:r>
+              <w:rPr>
+                <w:rFonts w:ascii="Times New Roman" w:hAnsi="Times New Roman" w:cs="Times New Roman"/>
+              </w:rPr>
+              <w:t xml:space="preserve"> utilizando el código de sustitución alfabética. Luego, responden a situaciones reales: ¿Por qué la palabra escrita ofrece mayor seguridad jurídica y personal que un acuerdo verbal?</w:t>
             </w:r>
           </w:p>
           <w:p>
             <w:pPr>
               <w:spacing w:after="40"/>
-            </w:pPr>
-            <w:r>
-              <w:rPr>
-                <w:rFonts w:ascii="Times New Roman" w:hAnsi="Times New Roman"/>
-                <w:sz w:val="19"/>
-              </w:rPr>
-              <w:t>Gamificación: Los equipos que decodifican el mensaje en tiempo récord ganan 'Estrellas de Criptografía' y se convierten en 'Descifradores Maestros'.</w:t>
+              <w:rPr>
+                <w:rFonts w:ascii="Times New Roman" w:hAnsi="Times New Roman" w:cs="Times New Roman"/>
+              </w:rPr>
+            </w:pPr>
+            <w:r>
+              <w:rPr>
+                <w:rFonts w:ascii="Times New Roman" w:hAnsi="Times New Roman" w:cs="Times New Roman"/>
+              </w:rPr>
+              <w:t>Gamificación: Los equipos que decodifican el mensaje en tiempo récord gana</w:t>
+            </w:r>
+            <w:r>
+              <w:rPr>
+                <w:rFonts w:ascii="Times New Roman" w:hAnsi="Times New Roman" w:cs="Times New Roman"/>
+              </w:rPr>
+              <w:t>n 'Estrellas de Criptografía' y se convierten en 'Descifradores Maestros'.</w:t>
             </w:r>
           </w:p>
           <w:p>
             <w:pPr>
               <w:spacing w:after="20"/>
-            </w:pPr>
-            <w:r>
-              <w:rPr>
-                <w:rFonts w:ascii="Times New Roman" w:hAnsi="Times New Roman"/>
-                <w:b/>
-                <w:sz w:val="19"/>
+              <w:rPr>
+                <w:rFonts w:ascii="Times New Roman" w:hAnsi="Times New Roman" w:cs="Times New Roman"/>
+              </w:rPr>
+            </w:pPr>
+            <w:r>
+              <w:rPr>
+                <w:rFonts w:ascii="Times New Roman" w:hAnsi="Times New Roman" w:cs="Times New Roman"/>
+                <w:b/>
               </w:rPr>
               <w:t>DUA aplicado:</w:t>
             </w:r>
@@ -2060,59 +2315,80 @@
           <w:p>
             <w:pPr>
               <w:spacing w:after="20"/>
-            </w:pPr>
-            <w:r>
-              <w:rPr>
-                <w:rFonts w:ascii="Times New Roman" w:hAnsi="Times New Roman"/>
-                <w:b/>
-                <w:sz w:val="18"/>
+              <w:rPr>
+                <w:rFonts w:ascii="Times New Roman" w:hAnsi="Times New Roman" w:cs="Times New Roman"/>
+              </w:rPr>
+            </w:pPr>
+            <w:r>
+              <w:rPr>
+                <w:rFonts w:ascii="Times New Roman" w:hAnsi="Times New Roman" w:cs="Times New Roman"/>
+                <w:b/>
               </w:rPr>
               <w:t xml:space="preserve">Representación: </w:t>
             </w:r>
             <w:r>
               <w:rPr>
-                <w:rFonts w:ascii="Times New Roman" w:hAnsi="Times New Roman"/>
-                <w:sz w:val="18"/>
-              </w:rPr>
-              <w:t>Clave criptográfica visual de la pág. 18 proyectada y en hojas de trabajo.</w:t>
+                <w:rFonts w:ascii="Times New Roman" w:hAnsi="Times New Roman" w:cs="Times New Roman"/>
+              </w:rPr>
+              <w:t>Clave criptográfica visual de la pág. 1</w:t>
+            </w:r>
+            <w:r>
+              <w:rPr>
+                <w:rFonts w:ascii="Times New Roman" w:hAnsi="Times New Roman" w:cs="Times New Roman"/>
+              </w:rPr>
+              <w:t>7</w:t>
+            </w:r>
+            <w:r>
+              <w:rPr>
+                <w:rFonts w:ascii="Times New Roman" w:hAnsi="Times New Roman" w:cs="Times New Roman"/>
+              </w:rPr>
+              <w:t xml:space="preserve"> proyectada y en hojas de trabajo.</w:t>
             </w:r>
           </w:p>
           <w:p>
             <w:pPr>
               <w:spacing w:after="20"/>
-            </w:pPr>
-            <w:r>
-              <w:rPr>
-                <w:rFonts w:ascii="Times New Roman" w:hAnsi="Times New Roman"/>
-                <w:b/>
-                <w:sz w:val="18"/>
+              <w:rPr>
+                <w:rFonts w:ascii="Times New Roman" w:hAnsi="Times New Roman" w:cs="Times New Roman"/>
+              </w:rPr>
+            </w:pPr>
+            <w:r>
+              <w:rPr>
+                <w:rFonts w:ascii="Times New Roman" w:hAnsi="Times New Roman" w:cs="Times New Roman"/>
+                <w:b/>
               </w:rPr>
               <w:t xml:space="preserve">Acción y expresión: </w:t>
             </w:r>
             <w:r>
               <w:rPr>
-                <w:rFonts w:ascii="Times New Roman" w:hAnsi="Times New Roman"/>
-                <w:sz w:val="18"/>
-              </w:rPr>
-              <w:t>Resolución escrita individual o en parejas; opción de verbalizar o graficar el mensaje.</w:t>
+                <w:rFonts w:ascii="Times New Roman" w:hAnsi="Times New Roman" w:cs="Times New Roman"/>
+              </w:rPr>
+              <w:t>Resolución escrita individual o en parejas; opción de ve</w:t>
+            </w:r>
+            <w:r>
+              <w:rPr>
+                <w:rFonts w:ascii="Times New Roman" w:hAnsi="Times New Roman" w:cs="Times New Roman"/>
+              </w:rPr>
+              <w:t>rbalizar o graficar el mensaje.</w:t>
             </w:r>
           </w:p>
           <w:p>
             <w:pPr>
               <w:spacing w:after="20"/>
-            </w:pPr>
-            <w:r>
-              <w:rPr>
-                <w:rFonts w:ascii="Times New Roman" w:hAnsi="Times New Roman"/>
-                <w:b/>
-                <w:sz w:val="18"/>
+              <w:rPr>
+                <w:rFonts w:ascii="Times New Roman" w:hAnsi="Times New Roman" w:cs="Times New Roman"/>
+              </w:rPr>
+            </w:pPr>
+            <w:r>
+              <w:rPr>
+                <w:rFonts w:ascii="Times New Roman" w:hAnsi="Times New Roman" w:cs="Times New Roman"/>
+                <w:b/>
               </w:rPr>
               <w:t xml:space="preserve">Compromiso-Motivación: </w:t>
             </w:r>
             <w:r>
               <w:rPr>
-                <w:rFonts w:ascii="Times New Roman" w:hAnsi="Times New Roman"/>
-                <w:sz w:val="18"/>
+                <w:rFonts w:ascii="Times New Roman" w:hAnsi="Times New Roman" w:cs="Times New Roman"/>
               </w:rPr>
               <w:t>Reto de resolución lógica de acertijos con retroalimentación formativa y lúdica.</w:t>
             </w:r>
@@ -2123,6 +2399,7 @@
               <w:tblW w:w="0" w:type="auto"/>
               <w:jc w:val="center"/>
               <w:tblLayout w:type="fixed"/>
+              <w:tblLook w:val="04A0" w:firstRow="1" w:lastRow="0" w:firstColumn="1" w:lastColumn="0" w:noHBand="0" w:noVBand="1"/>
             </w:tblPr>
             <w:tblGrid>
               <w:gridCol w:w="683"/>
@@ -2142,12 +2419,12 @@
                 <w:p>
                   <w:pPr>
                     <w:pStyle w:val="Sinespaciado"/>
+                    <w:framePr w:hSpace="141" w:wrap="around" w:vAnchor="text" w:hAnchor="margin" w:y="-138"/>
                     <w:jc w:val="center"/>
                     <w:rPr>
                       <w:rFonts w:ascii="Times New Roman" w:hAnsi="Times New Roman" w:cs="Times New Roman"/>
                       <w:b/>
                       <w:color w:val="FFFFFF"/>
-                      <w:sz w:val="20"/>
                     </w:rPr>
                   </w:pPr>
                   <w:r>
@@ -2155,7 +2432,6 @@
                       <w:rFonts w:ascii="Times New Roman" w:hAnsi="Times New Roman" w:cs="Times New Roman"/>
                       <w:b/>
                       <w:color w:val="FFFFFF"/>
-                      <w:sz w:val="20"/>
                     </w:rPr>
                     <w:t>R</w:t>
                   </w:r>
@@ -2169,12 +2445,12 @@
                 <w:p>
                   <w:pPr>
                     <w:pStyle w:val="Sinespaciado"/>
+                    <w:framePr w:hSpace="141" w:wrap="around" w:vAnchor="text" w:hAnchor="margin" w:y="-138"/>
                     <w:jc w:val="center"/>
                     <w:rPr>
                       <w:rFonts w:ascii="Times New Roman" w:hAnsi="Times New Roman" w:cs="Times New Roman"/>
                       <w:b/>
                       <w:color w:val="FFFFFF"/>
-                      <w:sz w:val="20"/>
                     </w:rPr>
                   </w:pPr>
                   <w:r>
@@ -2182,7 +2458,6 @@
                       <w:rFonts w:ascii="Times New Roman" w:hAnsi="Times New Roman" w:cs="Times New Roman"/>
                       <w:b/>
                       <w:color w:val="FFFFFF"/>
-                      <w:sz w:val="20"/>
                     </w:rPr>
                     <w:t>A-E</w:t>
                   </w:r>
@@ -2196,12 +2471,12 @@
                 <w:p>
                   <w:pPr>
                     <w:pStyle w:val="Sinespaciado"/>
+                    <w:framePr w:hSpace="141" w:wrap="around" w:vAnchor="text" w:hAnchor="margin" w:y="-138"/>
                     <w:jc w:val="center"/>
                     <w:rPr>
                       <w:rFonts w:ascii="Times New Roman" w:hAnsi="Times New Roman" w:cs="Times New Roman"/>
                       <w:b/>
                       <w:color w:val="FFFFFF"/>
-                      <w:sz w:val="20"/>
                     </w:rPr>
                   </w:pPr>
                   <w:r>
@@ -2209,7 +2484,6 @@
                       <w:rFonts w:ascii="Times New Roman" w:hAnsi="Times New Roman" w:cs="Times New Roman"/>
                       <w:b/>
                       <w:color w:val="FFFFFF"/>
-                      <w:sz w:val="20"/>
                     </w:rPr>
                     <w:t>C-M</w:t>
                   </w:r>
@@ -2220,17 +2494,22 @@
           <w:p>
             <w:pPr>
               <w:spacing w:before="40" w:after="40"/>
+              <w:rPr>
+                <w:rFonts w:ascii="Times New Roman" w:hAnsi="Times New Roman" w:cs="Times New Roman"/>
+              </w:rPr>
             </w:pPr>
           </w:p>
           <w:p>
             <w:pPr>
               <w:spacing w:before="60" w:after="20"/>
-            </w:pPr>
-            <w:r>
-              <w:rPr>
-                <w:rFonts w:ascii="Times New Roman" w:hAnsi="Times New Roman"/>
-                <w:b/>
-                <w:sz w:val="20"/>
+              <w:rPr>
+                <w:rFonts w:ascii="Times New Roman" w:hAnsi="Times New Roman" w:cs="Times New Roman"/>
+              </w:rPr>
+            </w:pPr>
+            <w:r>
+              <w:rPr>
+                <w:rFonts w:ascii="Times New Roman" w:hAnsi="Times New Roman" w:cs="Times New Roman"/>
+                <w:b/>
               </w:rPr>
               <w:t>Fase 4: Cierre – “El Papiro de la Identidad y la Cultura Escrita”</w:t>
             </w:r>
@@ -2238,44 +2517,75 @@
           <w:p>
             <w:pPr>
               <w:spacing w:after="20"/>
-            </w:pPr>
-            <w:r>
-              <w:rPr>
-                <w:rFonts w:ascii="Times New Roman" w:hAnsi="Times New Roman"/>
-                <w:b/>
-                <w:sz w:val="19"/>
+              <w:rPr>
+                <w:rFonts w:ascii="Times New Roman" w:hAnsi="Times New Roman" w:cs="Times New Roman"/>
+              </w:rPr>
+            </w:pPr>
+            <w:r>
+              <w:rPr>
+                <w:rFonts w:ascii="Times New Roman" w:hAnsi="Times New Roman" w:cs="Times New Roman"/>
+                <w:b/>
               </w:rPr>
               <w:t xml:space="preserve">Actividad: </w:t>
             </w:r>
             <w:r>
               <w:rPr>
-                <w:rFonts w:ascii="Times New Roman" w:hAnsi="Times New Roman"/>
-                <w:sz w:val="19"/>
-              </w:rPr>
-              <w:t>Cada estudiante redacta un breve manifiesto personal en su bitácora: '¿Por qué la lengua escrita es una herramienta cultural imprescindible en mi vida cotidiana?' Se pegan en el gran 'Muro de los Escribas de 7mo'. (Viernes 09/10: Feriado Independencia de Guayaquil).</w:t>
+                <w:rFonts w:ascii="Times New Roman" w:hAnsi="Times New Roman" w:cs="Times New Roman"/>
+              </w:rPr>
+              <w:t xml:space="preserve">Cada estudiante redacta un </w:t>
+            </w:r>
+            <w:r>
+              <w:rPr>
+                <w:rFonts w:ascii="Times New Roman" w:hAnsi="Times New Roman" w:cs="Times New Roman"/>
+              </w:rPr>
+              <w:t>breve manifiesto personal en su bitácora: '¿Por qué la lengua escrita es una herramienta cultural imprescindible en mi vida cotidiana?' Se pegan en el gran 'Muro de los Escribas de 7mo'. (</w:t>
+            </w:r>
+            <w:proofErr w:type="gramStart"/>
+            <w:r>
+              <w:rPr>
+                <w:rFonts w:ascii="Times New Roman" w:hAnsi="Times New Roman" w:cs="Times New Roman"/>
+              </w:rPr>
+              <w:t>Viernes</w:t>
+            </w:r>
+            <w:proofErr w:type="gramEnd"/>
+            <w:r>
+              <w:rPr>
+                <w:rFonts w:ascii="Times New Roman" w:hAnsi="Times New Roman" w:cs="Times New Roman"/>
+              </w:rPr>
+              <w:t xml:space="preserve"> 09/10: Feriado Independencia de Guayaquil).</w:t>
             </w:r>
           </w:p>
           <w:p>
             <w:pPr>
               <w:spacing w:after="40"/>
-            </w:pPr>
-            <w:r>
-              <w:rPr>
-                <w:rFonts w:ascii="Times New Roman" w:hAnsi="Times New Roman"/>
-                <w:sz w:val="19"/>
-              </w:rPr>
-              <w:t>Gamificación: Condecoración colectiva con el diploma y título de 'Guardianes de la Memoria Humana'.</w:t>
+              <w:rPr>
+                <w:rFonts w:ascii="Times New Roman" w:hAnsi="Times New Roman" w:cs="Times New Roman"/>
+              </w:rPr>
+            </w:pPr>
+            <w:r>
+              <w:rPr>
+                <w:rFonts w:ascii="Times New Roman" w:hAnsi="Times New Roman" w:cs="Times New Roman"/>
+              </w:rPr>
+              <w:t>Gamificación: Co</w:t>
+            </w:r>
+            <w:r>
+              <w:rPr>
+                <w:rFonts w:ascii="Times New Roman" w:hAnsi="Times New Roman" w:cs="Times New Roman"/>
+              </w:rPr>
+              <w:t>ndecoración colectiva con el diploma y título de 'Guardianes de la Memoria Humana'.</w:t>
             </w:r>
           </w:p>
           <w:p>
             <w:pPr>
               <w:spacing w:after="20"/>
-            </w:pPr>
-            <w:r>
-              <w:rPr>
-                <w:rFonts w:ascii="Times New Roman" w:hAnsi="Times New Roman"/>
-                <w:b/>
-                <w:sz w:val="19"/>
+              <w:rPr>
+                <w:rFonts w:ascii="Times New Roman" w:hAnsi="Times New Roman" w:cs="Times New Roman"/>
+              </w:rPr>
+            </w:pPr>
+            <w:r>
+              <w:rPr>
+                <w:rFonts w:ascii="Times New Roman" w:hAnsi="Times New Roman" w:cs="Times New Roman"/>
+                <w:b/>
               </w:rPr>
               <w:t>DUA aplicado:</w:t>
             </w:r>
@@ -2283,19 +2593,20 @@
           <w:p>
             <w:pPr>
               <w:spacing w:after="20"/>
-            </w:pPr>
-            <w:r>
-              <w:rPr>
-                <w:rFonts w:ascii="Times New Roman" w:hAnsi="Times New Roman"/>
-                <w:b/>
-                <w:sz w:val="18"/>
+              <w:rPr>
+                <w:rFonts w:ascii="Times New Roman" w:hAnsi="Times New Roman" w:cs="Times New Roman"/>
+              </w:rPr>
+            </w:pPr>
+            <w:r>
+              <w:rPr>
+                <w:rFonts w:ascii="Times New Roman" w:hAnsi="Times New Roman" w:cs="Times New Roman"/>
+                <w:b/>
               </w:rPr>
               <w:t xml:space="preserve">Representación: </w:t>
             </w:r>
             <w:r>
               <w:rPr>
-                <w:rFonts w:ascii="Times New Roman" w:hAnsi="Times New Roman"/>
-                <w:sz w:val="18"/>
+                <w:rFonts w:ascii="Times New Roman" w:hAnsi="Times New Roman" w:cs="Times New Roman"/>
               </w:rPr>
               <w:t>Formatos variados en tarjetas pergamino impresas o cuadernos.</w:t>
             </w:r>
@@ -2303,39 +2614,47 @@
           <w:p>
             <w:pPr>
               <w:spacing w:after="20"/>
-            </w:pPr>
-            <w:r>
-              <w:rPr>
-                <w:rFonts w:ascii="Times New Roman" w:hAnsi="Times New Roman"/>
-                <w:b/>
-                <w:sz w:val="18"/>
+              <w:rPr>
+                <w:rFonts w:ascii="Times New Roman" w:hAnsi="Times New Roman" w:cs="Times New Roman"/>
+              </w:rPr>
+            </w:pPr>
+            <w:r>
+              <w:rPr>
+                <w:rFonts w:ascii="Times New Roman" w:hAnsi="Times New Roman" w:cs="Times New Roman"/>
+                <w:b/>
               </w:rPr>
               <w:t xml:space="preserve">Acción y expresión: </w:t>
             </w:r>
             <w:r>
               <w:rPr>
-                <w:rFonts w:ascii="Times New Roman" w:hAnsi="Times New Roman"/>
-                <w:sz w:val="18"/>
-              </w:rPr>
-              <w:t>Libertad de plasmar la conclusión en prosa, verso o cartel ilustrado.</w:t>
+                <w:rFonts w:ascii="Times New Roman" w:hAnsi="Times New Roman" w:cs="Times New Roman"/>
+              </w:rPr>
+              <w:t>Libertad de plasmar la conclusión en prosa, verso o cartel i</w:t>
+            </w:r>
+            <w:r>
+              <w:rPr>
+                <w:rFonts w:ascii="Times New Roman" w:hAnsi="Times New Roman" w:cs="Times New Roman"/>
+              </w:rPr>
+              <w:t>lustrado.</w:t>
             </w:r>
           </w:p>
           <w:p>
             <w:pPr>
               <w:spacing w:after="20"/>
-            </w:pPr>
-            <w:r>
-              <w:rPr>
-                <w:rFonts w:ascii="Times New Roman" w:hAnsi="Times New Roman"/>
-                <w:b/>
-                <w:sz w:val="18"/>
+              <w:rPr>
+                <w:rFonts w:ascii="Times New Roman" w:hAnsi="Times New Roman" w:cs="Times New Roman"/>
+              </w:rPr>
+            </w:pPr>
+            <w:r>
+              <w:rPr>
+                <w:rFonts w:ascii="Times New Roman" w:hAnsi="Times New Roman" w:cs="Times New Roman"/>
+                <w:b/>
               </w:rPr>
               <w:t xml:space="preserve">Compromiso-Motivación: </w:t>
             </w:r>
             <w:r>
               <w:rPr>
-                <w:rFonts w:ascii="Times New Roman" w:hAnsi="Times New Roman"/>
-                <w:sz w:val="18"/>
+                <w:rFonts w:ascii="Times New Roman" w:hAnsi="Times New Roman" w:cs="Times New Roman"/>
               </w:rPr>
               <w:t>Reconocimiento del logro individual dentro de la producción colectiva del aula.</w:t>
             </w:r>
@@ -2346,6 +2665,7 @@
               <w:tblW w:w="0" w:type="auto"/>
               <w:jc w:val="center"/>
               <w:tblLayout w:type="fixed"/>
+              <w:tblLook w:val="04A0" w:firstRow="1" w:lastRow="0" w:firstColumn="1" w:lastColumn="0" w:noHBand="0" w:noVBand="1"/>
             </w:tblPr>
             <w:tblGrid>
               <w:gridCol w:w="683"/>
@@ -2365,12 +2685,12 @@
                 <w:p>
                   <w:pPr>
                     <w:pStyle w:val="Sinespaciado"/>
+                    <w:framePr w:hSpace="141" w:wrap="around" w:vAnchor="text" w:hAnchor="margin" w:y="-138"/>
                     <w:jc w:val="center"/>
                     <w:rPr>
                       <w:rFonts w:ascii="Times New Roman" w:hAnsi="Times New Roman" w:cs="Times New Roman"/>
                       <w:b/>
                       <w:color w:val="FFFFFF"/>
-                      <w:sz w:val="20"/>
                     </w:rPr>
                   </w:pPr>
                   <w:r>
@@ -2378,7 +2698,6 @@
                       <w:rFonts w:ascii="Times New Roman" w:hAnsi="Times New Roman" w:cs="Times New Roman"/>
                       <w:b/>
                       <w:color w:val="FFFFFF"/>
-                      <w:sz w:val="20"/>
                     </w:rPr>
                     <w:t>R</w:t>
                   </w:r>
@@ -2392,12 +2711,12 @@
                 <w:p>
                   <w:pPr>
                     <w:pStyle w:val="Sinespaciado"/>
+                    <w:framePr w:hSpace="141" w:wrap="around" w:vAnchor="text" w:hAnchor="margin" w:y="-138"/>
                     <w:jc w:val="center"/>
                     <w:rPr>
                       <w:rFonts w:ascii="Times New Roman" w:hAnsi="Times New Roman" w:cs="Times New Roman"/>
                       <w:b/>
                       <w:color w:val="FFFFFF"/>
-                      <w:sz w:val="20"/>
                     </w:rPr>
                   </w:pPr>
                   <w:r>
@@ -2405,7 +2724,6 @@
                       <w:rFonts w:ascii="Times New Roman" w:hAnsi="Times New Roman" w:cs="Times New Roman"/>
                       <w:b/>
                       <w:color w:val="FFFFFF"/>
-                      <w:sz w:val="20"/>
                     </w:rPr>
                     <w:t>A-E</w:t>
                   </w:r>
@@ -2419,12 +2737,12 @@
                 <w:p>
                   <w:pPr>
                     <w:pStyle w:val="Sinespaciado"/>
+                    <w:framePr w:hSpace="141" w:wrap="around" w:vAnchor="text" w:hAnchor="margin" w:y="-138"/>
                     <w:jc w:val="center"/>
                     <w:rPr>
                       <w:rFonts w:ascii="Times New Roman" w:hAnsi="Times New Roman" w:cs="Times New Roman"/>
                       <w:b/>
                       <w:color w:val="FFFFFF"/>
-                      <w:sz w:val="20"/>
                     </w:rPr>
                   </w:pPr>
                   <w:r>
@@ -2432,7 +2750,6 @@
                       <w:rFonts w:ascii="Times New Roman" w:hAnsi="Times New Roman" w:cs="Times New Roman"/>
                       <w:b/>
                       <w:color w:val="FFFFFF"/>
-                      <w:sz w:val="20"/>
                     </w:rPr>
                     <w:t>C-M</w:t>
                   </w:r>
@@ -2443,6 +2760,9 @@
           <w:p>
             <w:pPr>
               <w:spacing w:before="40" w:after="40"/>
+              <w:rPr>
+                <w:rFonts w:ascii="Times New Roman" w:hAnsi="Times New Roman" w:cs="Times New Roman"/>
+              </w:rPr>
             </w:pPr>
           </w:p>
         </w:tc>
@@ -2457,8 +2777,22 @@
             <w:shd w:val="clear" w:color="auto" w:fill="auto"/>
           </w:tcPr>
           <w:p>
-            <w:r>
-              <w:t>Reconoce la funcionalidad de la lengua escrita como manifestación cultural y de identidad en diferentes contextos y situaciones, atendiendo a la diversidad lingüística del Ecuador. I.LL.3.1.1.</w:t>
+            <w:pPr>
+              <w:rPr>
+                <w:rFonts w:ascii="Times New Roman" w:hAnsi="Times New Roman" w:cs="Times New Roman"/>
+              </w:rPr>
+            </w:pPr>
+            <w:r>
+              <w:rPr>
+                <w:rFonts w:ascii="Times New Roman" w:hAnsi="Times New Roman" w:cs="Times New Roman"/>
+              </w:rPr>
+              <w:t xml:space="preserve">Reconoce la funcionalidad de la lengua escrita como manifestación cultural y de identidad en diferentes contextos y </w:t>
+            </w:r>
+            <w:r>
+              <w:rPr>
+                <w:rFonts w:ascii="Times New Roman" w:hAnsi="Times New Roman" w:cs="Times New Roman"/>
+              </w:rPr>
+              <w:t>situaciones, atendiendo a la diversidad lingüística del Ecuador. I.LL.3.1.1.</w:t>
             </w:r>
           </w:p>
         </w:tc>
@@ -2472,10 +2806,41 @@
             <w:shd w:val="clear" w:color="auto" w:fill="auto"/>
           </w:tcPr>
           <w:p>
-            <w:r>
-              <w:t>• Instrumentos: Rúbrica de participación oral y taller de aplicación del texto (pág. 18).</w:t>
+            <w:pPr>
+              <w:rPr>
+                <w:rFonts w:ascii="Times New Roman" w:hAnsi="Times New Roman" w:cs="Times New Roman"/>
+              </w:rPr>
+            </w:pPr>
+            <w:r>
+              <w:rPr>
+                <w:rFonts w:ascii="Times New Roman" w:hAnsi="Times New Roman" w:cs="Times New Roman"/>
+              </w:rPr>
+              <w:t>• Instrumentos: Rúbrica de participación oral y taller de aplicación del texto (pág. 1</w:t>
+            </w:r>
+            <w:r>
+              <w:rPr>
+                <w:rFonts w:ascii="Times New Roman" w:hAnsi="Times New Roman" w:cs="Times New Roman"/>
+              </w:rPr>
+              <w:t>7</w:t>
+            </w:r>
+            <w:r>
+              <w:rPr>
+                <w:rFonts w:ascii="Times New Roman" w:hAnsi="Times New Roman" w:cs="Times New Roman"/>
+              </w:rPr>
+              <w:t>).</w:t>
+            </w:r>
+            <w:r>
+              <w:rPr>
+                <w:rFonts w:ascii="Times New Roman" w:hAnsi="Times New Roman" w:cs="Times New Roman"/>
+              </w:rPr>
               <w:br/>
-              <w:t>• Actividades: Descifrado de códigos de sustitución alfabética, línea de tiempo en el cuaderno y respuestas a preguntas reflexivas.</w:t>
+              <w:t>• Actividades: Descifrado de códigos de sustitución alfabética, línea de tiempo en el cua</w:t>
+            </w:r>
+            <w:r>
+              <w:rPr>
+                <w:rFonts w:ascii="Times New Roman" w:hAnsi="Times New Roman" w:cs="Times New Roman"/>
+              </w:rPr>
+              <w:t>derno y respuestas a preguntas reflexivas.</w:t>
             </w:r>
           </w:p>
         </w:tc>
@@ -2504,16 +2869,31 @@
           </w:tcPr>
           <w:p>
             <w:r>
-              <w:t>Tema: Discursos y juicios de valor / Taller de Comunicación Oral: “Hoy me convertiré en vendedor de sueños”</w:t>
+              <w:t xml:space="preserve">Tema: Discursos y juicios de </w:t>
+            </w:r>
+            <w:r>
+              <w:t>valor / Taller de Comunicación Oral: “Hoy me convertiré en vendedor de sueños”</w:t>
+            </w:r>
+            <w:r>
               <w:br/>
+            </w:r>
+            <w:r>
               <w:br/>
               <w:t>Materiales:</w:t>
+            </w:r>
+            <w:r>
               <w:br/>
               <w:t>Texto de Lengua 7mo (Páginas 19 a 25)</w:t>
+            </w:r>
+            <w:r>
               <w:br/>
               <w:t>Pizarra y marcadores de colores</w:t>
+            </w:r>
+            <w:r>
               <w:br/>
               <w:t>Guía Docente pág. 13</w:t>
+            </w:r>
+            <w:r>
               <w:br/>
               <w:t>Cuadernos</w:t>
             </w:r>
@@ -2528,9 +2908,7 @@
             </w:tcBorders>
             <w:shd w:val="clear" w:color="auto" w:fill="auto"/>
           </w:tcPr>
-          <w:p>
-            <w:r/>
-          </w:p>
+          <w:p/>
           <w:p>
             <w:pPr>
               <w:spacing w:before="40" w:after="40"/>
@@ -2539,7 +2917,6 @@
               <w:rPr>
                 <w:rFonts w:ascii="Times New Roman" w:hAnsi="Times New Roman"/>
                 <w:b/>
-                <w:sz w:val="22"/>
               </w:rPr>
               <w:t>SEMANA 7 (12/10 al 16/10/2026) · COMUNICACIÓN ORAL</w:t>
             </w:r>
@@ -2554,7 +2931,22 @@
                 <w:b/>
                 <w:sz w:val="21"/>
               </w:rPr>
-              <w:t>AULA INVERTIDA &amp; GAMIFICACIÓN</w:t>
+              <w:t>AULA INVERT</w:t>
+            </w:r>
+            <w:r>
+              <w:rPr>
+                <w:rFonts w:ascii="Times New Roman" w:hAnsi="Times New Roman"/>
+                <w:b/>
+                <w:sz w:val="21"/>
+              </w:rPr>
+              <w:t>IDA &amp; GAMIFICACIÓN</w:t>
+            </w:r>
+            <w:r>
+              <w:rPr>
+                <w:rFonts w:ascii="Times New Roman" w:hAnsi="Times New Roman"/>
+                <w:b/>
+                <w:sz w:val="21"/>
+              </w:rPr>
               <w:br/>
             </w:r>
             <w:r>
@@ -2563,6 +2955,12 @@
                 <w:sz w:val="20"/>
               </w:rPr>
               <w:t>Nombre de la actividad:</w:t>
+            </w:r>
+            <w:r>
+              <w:rPr>
+                <w:rFonts w:ascii="Times New Roman" w:hAnsi="Times New Roman"/>
+                <w:sz w:val="20"/>
+              </w:rPr>
               <w:br/>
               <w:t>“El Gran Torneo de los Vendedores de Sueños y Maestros de la Oratoria” (Texto Pág. 19-25)</w:t>
             </w:r>
@@ -2597,7 +2995,21 @@
                 <w:rFonts w:ascii="Times New Roman" w:hAnsi="Times New Roman"/>
                 <w:sz w:val="19"/>
               </w:rPr>
-              <w:t>Apertura con la escena dialogada de la página 19 ('¿Prepararon ya su discurso para la Semana de la Expresión Oral?'). Audición de un fragmento del histórico discurso 'Yo tengo un sueño' de Martin Luther King. Preguntas de reflexión socioemocional: ¿Cómo te sientes al hablar frente al público? ¿Cómo podemos transformar los nervios en fuerza comunicativa?</w:t>
+              <w:t xml:space="preserve">Apertura con la escena dialogada de la página 19 </w:t>
+            </w:r>
+            <w:r>
+              <w:rPr>
+                <w:rFonts w:ascii="Times New Roman" w:hAnsi="Times New Roman"/>
+                <w:sz w:val="19"/>
+              </w:rPr>
+              <w:t>('¿Prepararon ya su discurso para la Semana de la Expresión Oral?'). Audición de un fragmento del histórico discurso 'Yo tengo un sueño' de Martin Luther King. Preguntas de reflexión socioemocional: ¿Cómo te sientes al hablar frente al público? ¿Cómo podem</w:t>
+            </w:r>
+            <w:r>
+              <w:rPr>
+                <w:rFonts w:ascii="Times New Roman" w:hAnsi="Times New Roman"/>
+                <w:sz w:val="19"/>
+              </w:rPr>
+              <w:t>os transformar los nervios en fuerza comunicativa?</w:t>
             </w:r>
           </w:p>
           <w:p>
@@ -2642,7 +3054,14 @@
                 <w:rFonts w:ascii="Times New Roman" w:hAnsi="Times New Roman"/>
                 <w:sz w:val="18"/>
               </w:rPr>
-              <w:t>Audio claro del discurso, viñeta gráfica del texto y preguntas guía en pizarra.</w:t>
+              <w:t xml:space="preserve">Audio claro del discurso, viñeta </w:t>
+            </w:r>
+            <w:r>
+              <w:rPr>
+                <w:rFonts w:ascii="Times New Roman" w:hAnsi="Times New Roman"/>
+                <w:sz w:val="18"/>
+              </w:rPr>
+              <w:t>gráfica del texto y preguntas guía en pizarra.</w:t>
             </w:r>
           </w:p>
           <w:p>
@@ -2691,6 +3110,7 @@
               <w:tblW w:w="0" w:type="auto"/>
               <w:jc w:val="center"/>
               <w:tblLayout w:type="fixed"/>
+              <w:tblLook w:val="04A0" w:firstRow="1" w:lastRow="0" w:firstColumn="1" w:lastColumn="0" w:noHBand="0" w:noVBand="1"/>
             </w:tblPr>
             <w:tblGrid>
               <w:gridCol w:w="683"/>
@@ -2710,6 +3130,7 @@
                 <w:p>
                   <w:pPr>
                     <w:pStyle w:val="Sinespaciado"/>
+                    <w:framePr w:hSpace="141" w:wrap="around" w:vAnchor="text" w:hAnchor="margin" w:y="-138"/>
                     <w:jc w:val="center"/>
                     <w:rPr>
                       <w:rFonts w:ascii="Times New Roman" w:hAnsi="Times New Roman" w:cs="Times New Roman"/>
@@ -2737,6 +3158,7 @@
                 <w:p>
                   <w:pPr>
                     <w:pStyle w:val="Sinespaciado"/>
+                    <w:framePr w:hSpace="141" w:wrap="around" w:vAnchor="text" w:hAnchor="margin" w:y="-138"/>
                     <w:jc w:val="center"/>
                     <w:rPr>
                       <w:rFonts w:ascii="Times New Roman" w:hAnsi="Times New Roman" w:cs="Times New Roman"/>
@@ -2764,6 +3186,7 @@
                 <w:p>
                   <w:pPr>
                     <w:pStyle w:val="Sinespaciado"/>
+                    <w:framePr w:hSpace="141" w:wrap="around" w:vAnchor="text" w:hAnchor="margin" w:y="-138"/>
                     <w:jc w:val="center"/>
                     <w:rPr>
                       <w:rFonts w:ascii="Times New Roman" w:hAnsi="Times New Roman" w:cs="Times New Roman"/>
@@ -2820,7 +3243,14 @@
                 <w:rFonts w:ascii="Times New Roman" w:hAnsi="Times New Roman"/>
                 <w:sz w:val="19"/>
               </w:rPr>
-              <w:t>Lectura comentada de 'Discurso de un niño' (págs. 20-21). En equipos cooperativos, los estudiantes desarman y reconstruyen la estructura formal del discurso oral: Introducción (saludo y captura de atención), Desarrollo (argumentos fundamentados) y Conclusión (llamado a la acción). Análisis de cómo emitir juicios de valor asertivos sin agredir.</w:t>
+              <w:t>Lectura comentada de 'Discurso de un niño' (págs. 20-21). En equipos cooperativos, los estudiantes desarman y reconstruyen la estructura formal del discurso oral: Introducc</w:t>
+            </w:r>
+            <w:r>
+              <w:rPr>
+                <w:rFonts w:ascii="Times New Roman" w:hAnsi="Times New Roman"/>
+                <w:sz w:val="19"/>
+              </w:rPr>
+              <w:t>ión (saludo y captura de atención), Desarrollo (argumentos fundamentados) y Conclusión (llamado a la acción). Análisis de cómo emitir juicios de valor asertivos sin agredir.</w:t>
             </w:r>
           </w:p>
           <w:p>
@@ -2832,7 +3262,14 @@
                 <w:rFonts w:ascii="Times New Roman" w:hAnsi="Times New Roman"/>
                 <w:sz w:val="19"/>
               </w:rPr>
-              <w:t>Gamificación: Dinámica 'Detectives de Argumentos': Ganan 15 puntos quienes identifiquen la idea principal y separen opiniones de hechos comprobables.</w:t>
+              <w:t>Gamificación: Dinámica 'Detectives de Argumentos': Ganan 15 puntos quienes identif</w:t>
+            </w:r>
+            <w:r>
+              <w:rPr>
+                <w:rFonts w:ascii="Times New Roman" w:hAnsi="Times New Roman"/>
+                <w:sz w:val="19"/>
+              </w:rPr>
+              <w:t>iquen la idea principal y separen opiniones de hechos comprobables.</w:t>
             </w:r>
           </w:p>
           <w:p>
@@ -2885,7 +3322,14 @@
                 <w:rFonts w:ascii="Times New Roman" w:hAnsi="Times New Roman"/>
                 <w:sz w:val="18"/>
               </w:rPr>
-              <w:t>Ordenamiento físico de tarjetas en pizarra y resumen esquemático en cuaderno.</w:t>
+              <w:t xml:space="preserve">Ordenamiento físico de </w:t>
+            </w:r>
+            <w:r>
+              <w:rPr>
+                <w:rFonts w:ascii="Times New Roman" w:hAnsi="Times New Roman"/>
+                <w:sz w:val="18"/>
+              </w:rPr>
+              <w:t>tarjetas en pizarra y resumen esquemático en cuaderno.</w:t>
             </w:r>
           </w:p>
           <w:p>
@@ -2914,6 +3358,7 @@
               <w:tblW w:w="0" w:type="auto"/>
               <w:jc w:val="center"/>
               <w:tblLayout w:type="fixed"/>
+              <w:tblLook w:val="04A0" w:firstRow="1" w:lastRow="0" w:firstColumn="1" w:lastColumn="0" w:noHBand="0" w:noVBand="1"/>
             </w:tblPr>
             <w:tblGrid>
               <w:gridCol w:w="683"/>
@@ -2933,6 +3378,7 @@
                 <w:p>
                   <w:pPr>
                     <w:pStyle w:val="Sinespaciado"/>
+                    <w:framePr w:hSpace="141" w:wrap="around" w:vAnchor="text" w:hAnchor="margin" w:y="-138"/>
                     <w:jc w:val="center"/>
                     <w:rPr>
                       <w:rFonts w:ascii="Times New Roman" w:hAnsi="Times New Roman" w:cs="Times New Roman"/>
@@ -2960,6 +3406,7 @@
                 <w:p>
                   <w:pPr>
                     <w:pStyle w:val="Sinespaciado"/>
+                    <w:framePr w:hSpace="141" w:wrap="around" w:vAnchor="text" w:hAnchor="margin" w:y="-138"/>
                     <w:jc w:val="center"/>
                     <w:rPr>
                       <w:rFonts w:ascii="Times New Roman" w:hAnsi="Times New Roman" w:cs="Times New Roman"/>
@@ -2987,6 +3434,7 @@
                 <w:p>
                   <w:pPr>
                     <w:pStyle w:val="Sinespaciado"/>
+                    <w:framePr w:hSpace="141" w:wrap="around" w:vAnchor="text" w:hAnchor="margin" w:y="-138"/>
                     <w:jc w:val="center"/>
                     <w:rPr>
                       <w:rFonts w:ascii="Times New Roman" w:hAnsi="Times New Roman" w:cs="Times New Roman"/>
@@ -3043,7 +3491,21 @@
                 <w:rFonts w:ascii="Times New Roman" w:hAnsi="Times New Roman"/>
                 <w:sz w:val="19"/>
               </w:rPr>
-              <w:t>Puesta en práctica del Taller de Comunicación Oral de la página 25: en parejas, eligen una temática de impacto social o ecológico, redactan su guion en 3 partes y presentan una disertación de 2 minutos ante la clase aplicando modulación vocal, contacto visual y pausas efectivas.</w:t>
+              <w:t>Puesta en práctica del</w:t>
+            </w:r>
+            <w:r>
+              <w:rPr>
+                <w:rFonts w:ascii="Times New Roman" w:hAnsi="Times New Roman"/>
+                <w:sz w:val="19"/>
+              </w:rPr>
+              <w:t xml:space="preserve"> Taller de Comunicación Oral de la página 25: en parejas, eligen una temática de impacto social o ecológico, redactan su guion en 3 partes y presentan una disertación de 2 minutos ante la clase aplicando modulación vocal, contacto visual y pausas efectivas</w:t>
+            </w:r>
+            <w:r>
+              <w:rPr>
+                <w:rFonts w:ascii="Times New Roman" w:hAnsi="Times New Roman"/>
+                <w:sz w:val="19"/>
+              </w:rPr>
+              <w:t>.</w:t>
             </w:r>
           </w:p>
           <w:p>
@@ -3101,7 +3563,15 @@
                 <w:b/>
                 <w:sz w:val="18"/>
               </w:rPr>
-              <w:t xml:space="preserve">Acción y expresión: </w:t>
+              <w:t>Acción y ex</w:t>
+            </w:r>
+            <w:r>
+              <w:rPr>
+                <w:rFonts w:ascii="Times New Roman" w:hAnsi="Times New Roman"/>
+                <w:b/>
+                <w:sz w:val="18"/>
+              </w:rPr>
+              <w:t xml:space="preserve">presión: </w:t>
             </w:r>
             <w:r>
               <w:rPr>
@@ -3137,6 +3607,7 @@
               <w:tblW w:w="0" w:type="auto"/>
               <w:jc w:val="center"/>
               <w:tblLayout w:type="fixed"/>
+              <w:tblLook w:val="04A0" w:firstRow="1" w:lastRow="0" w:firstColumn="1" w:lastColumn="0" w:noHBand="0" w:noVBand="1"/>
             </w:tblPr>
             <w:tblGrid>
               <w:gridCol w:w="683"/>
@@ -3156,6 +3627,7 @@
                 <w:p>
                   <w:pPr>
                     <w:pStyle w:val="Sinespaciado"/>
+                    <w:framePr w:hSpace="141" w:wrap="around" w:vAnchor="text" w:hAnchor="margin" w:y="-138"/>
                     <w:jc w:val="center"/>
                     <w:rPr>
                       <w:rFonts w:ascii="Times New Roman" w:hAnsi="Times New Roman" w:cs="Times New Roman"/>
@@ -3183,6 +3655,7 @@
                 <w:p>
                   <w:pPr>
                     <w:pStyle w:val="Sinespaciado"/>
+                    <w:framePr w:hSpace="141" w:wrap="around" w:vAnchor="text" w:hAnchor="margin" w:y="-138"/>
                     <w:jc w:val="center"/>
                     <w:rPr>
                       <w:rFonts w:ascii="Times New Roman" w:hAnsi="Times New Roman" w:cs="Times New Roman"/>
@@ -3210,6 +3683,7 @@
                 <w:p>
                   <w:pPr>
                     <w:pStyle w:val="Sinespaciado"/>
+                    <w:framePr w:hSpace="141" w:wrap="around" w:vAnchor="text" w:hAnchor="margin" w:y="-138"/>
                     <w:jc w:val="center"/>
                     <w:rPr>
                       <w:rFonts w:ascii="Times New Roman" w:hAnsi="Times New Roman" w:cs="Times New Roman"/>
@@ -3278,7 +3752,14 @@
                 <w:rFonts w:ascii="Times New Roman" w:hAnsi="Times New Roman"/>
                 <w:sz w:val="19"/>
               </w:rPr>
-              <w:t>Gamificación: Entrega de la insignia digital 'Maestro de la Elocuencia' a todos los participantes.</w:t>
+              <w:t xml:space="preserve">Gamificación: Entrega de la insignia digital 'Maestro de la Elocuencia' a todos los </w:t>
+            </w:r>
+            <w:r>
+              <w:rPr>
+                <w:rFonts w:ascii="Times New Roman" w:hAnsi="Times New Roman"/>
+                <w:sz w:val="19"/>
+              </w:rPr>
+              <w:t>participantes.</w:t>
             </w:r>
           </w:p>
           <w:p>
@@ -3351,7 +3832,14 @@
                 <w:rFonts w:ascii="Times New Roman" w:hAnsi="Times New Roman"/>
                 <w:sz w:val="18"/>
               </w:rPr>
-              <w:t>Celebración del crecimiento comunicativo grupal.</w:t>
+              <w:t xml:space="preserve">Celebración del </w:t>
+            </w:r>
+            <w:r>
+              <w:rPr>
+                <w:rFonts w:ascii="Times New Roman" w:hAnsi="Times New Roman"/>
+                <w:sz w:val="18"/>
+              </w:rPr>
+              <w:t>crecimiento comunicativo grupal.</w:t>
             </w:r>
           </w:p>
           <w:tbl>
@@ -3360,6 +3848,7 @@
               <w:tblW w:w="0" w:type="auto"/>
               <w:jc w:val="center"/>
               <w:tblLayout w:type="fixed"/>
+              <w:tblLook w:val="04A0" w:firstRow="1" w:lastRow="0" w:firstColumn="1" w:lastColumn="0" w:noHBand="0" w:noVBand="1"/>
             </w:tblPr>
             <w:tblGrid>
               <w:gridCol w:w="683"/>
@@ -3379,6 +3868,7 @@
                 <w:p>
                   <w:pPr>
                     <w:pStyle w:val="Sinespaciado"/>
+                    <w:framePr w:hSpace="141" w:wrap="around" w:vAnchor="text" w:hAnchor="margin" w:y="-138"/>
                     <w:jc w:val="center"/>
                     <w:rPr>
                       <w:rFonts w:ascii="Times New Roman" w:hAnsi="Times New Roman" w:cs="Times New Roman"/>
@@ -3406,6 +3896,7 @@
                 <w:p>
                   <w:pPr>
                     <w:pStyle w:val="Sinespaciado"/>
+                    <w:framePr w:hSpace="141" w:wrap="around" w:vAnchor="text" w:hAnchor="margin" w:y="-138"/>
                     <w:jc w:val="center"/>
                     <w:rPr>
                       <w:rFonts w:ascii="Times New Roman" w:hAnsi="Times New Roman" w:cs="Times New Roman"/>
@@ -3433,6 +3924,7 @@
                 <w:p>
                   <w:pPr>
                     <w:pStyle w:val="Sinespaciado"/>
+                    <w:framePr w:hSpace="141" w:wrap="around" w:vAnchor="text" w:hAnchor="margin" w:y="-138"/>
                     <w:jc w:val="center"/>
                     <w:rPr>
                       <w:rFonts w:ascii="Times New Roman" w:hAnsi="Times New Roman" w:cs="Times New Roman"/>
@@ -3487,7 +3979,12 @@
           </w:tcPr>
           <w:p>
             <w:r>
-              <w:t>• Instrumentos: Rúbrica de expresión oral y lista de cotejo de juicios de valor respetuosos.</w:t>
+              <w:t xml:space="preserve">• Instrumentos: Rúbrica de </w:t>
+            </w:r>
+            <w:r>
+              <w:t>expresión oral y lista de cotejo de juicios de valor respetuosos.</w:t>
+            </w:r>
+            <w:r>
               <w:br/>
               <w:t>• Actividades: Presentación del taller 'Vendedor de sueños' (pág. 25) y análisis crítico del discurso modelo.</w:t>
             </w:r>
@@ -3506,8 +4003,15 @@
           </w:tcPr>
           <w:p>
             <w:r>
-              <w:t>LL.3.3.5. Valorar los aspectos de forma y el contenido de un texto científico, a partir de criterios preestablecidos.</w:t>
+              <w:t xml:space="preserve">LL.3.3.5. Valorar los aspectos de forma y el contenido de un texto </w:t>
+            </w:r>
+            <w:r>
+              <w:t>científico, a partir de criterios preestablecidos.</w:t>
+            </w:r>
+            <w:r>
               <w:br/>
+            </w:r>
+            <w:r>
               <w:br/>
               <w:t>LL.3.3.8. Leer con fluidez y entonación en diversos contextos y con diferentes propósitos.</w:t>
             </w:r>
@@ -3522,15 +4026,30 @@
           <w:p>
             <w:r>
               <w:t>Tema: Leo para acercarme a la ciencia (textos de divulgación científica) y Uso de la biblioteca escolar</w:t>
+            </w:r>
+            <w:r>
               <w:br/>
+            </w:r>
+            <w:r>
               <w:br/>
-              <w:t>Materiales:</w:t>
+              <w:t>Material</w:t>
+            </w:r>
+            <w:r>
+              <w:t>es:</w:t>
+            </w:r>
+            <w:r>
               <w:br/>
               <w:t>Texto de Lengua 7mo (Páginas 26 a 37)</w:t>
+            </w:r>
+            <w:r>
               <w:br/>
               <w:t>Pizarra y marcadores de colores</w:t>
+            </w:r>
+            <w:r>
               <w:br/>
               <w:t>Cuadernos</w:t>
+            </w:r>
+            <w:r>
               <w:br/>
               <w:t>Fichas de biblioteca escolar</w:t>
             </w:r>
@@ -3545,9 +4064,7 @@
             </w:tcBorders>
             <w:shd w:val="clear" w:color="auto" w:fill="auto"/>
           </w:tcPr>
-          <w:p>
-            <w:r/>
-          </w:p>
+          <w:p/>
           <w:p>
             <w:pPr>
               <w:spacing w:before="40" w:after="40"/>
@@ -3556,7 +4073,6 @@
               <w:rPr>
                 <w:rFonts w:ascii="Times New Roman" w:hAnsi="Times New Roman"/>
                 <w:b/>
-                <w:sz w:val="22"/>
               </w:rPr>
               <w:t>SEMANA 8 (19/10 al 23/10/2026) · LECTURA</w:t>
             </w:r>
@@ -3572,6 +4088,13 @@
                 <w:sz w:val="21"/>
               </w:rPr>
               <w:t>APRENDIZAJE BASADO EN PROBLEMAS (ABP) &amp; COOPERATIVO</w:t>
+            </w:r>
+            <w:r>
+              <w:rPr>
+                <w:rFonts w:ascii="Times New Roman" w:hAnsi="Times New Roman"/>
+                <w:b/>
+                <w:sz w:val="21"/>
+              </w:rPr>
               <w:br/>
             </w:r>
             <w:r>
@@ -3580,8 +4103,21 @@
                 <w:sz w:val="20"/>
               </w:rPr>
               <w:t>Nombre de la actividad:</w:t>
+            </w:r>
+            <w:r>
+              <w:rPr>
+                <w:rFonts w:ascii="Times New Roman" w:hAnsi="Times New Roman"/>
+                <w:sz w:val="20"/>
+              </w:rPr>
               <w:br/>
-              <w:t>“Expedición Paleontológica: Cazadores de Fósiles y de la Verdad Científica” (Texto Pág. 26-37)</w:t>
+              <w:t>“Expedición Paleontológic</w:t>
+            </w:r>
+            <w:r>
+              <w:rPr>
+                <w:rFonts w:ascii="Times New Roman" w:hAnsi="Times New Roman"/>
+                <w:sz w:val="20"/>
+              </w:rPr>
+              <w:t>a: Cazadores de Fósiles y de la Verdad Científica” (Texto Pág. 26-37)</w:t>
             </w:r>
           </w:p>
           <w:p>
@@ -3614,7 +4150,21 @@
                 <w:rFonts w:ascii="Times New Roman" w:hAnsi="Times New Roman"/>
                 <w:sz w:val="19"/>
               </w:rPr>
-              <w:t>El docente plantea un reto de la vida real: 'En redes sociales se afirma que se encontró un dinosaurio vivo en la Amazonía ecuatoriana. ¿Cómo sabemos si una noticia científica es real o un engaño?' Apertura con la ilustración de la pág. 26 (paleontólogos y fósiles). Preguntas detonantes: ¿Dónde buscamos información científica verídica? ¿Qué es un artículo de divulgación?</w:t>
+              <w:t xml:space="preserve">El docente plantea un reto de la vida real: 'En redes sociales se afirma que se encontró un dinosaurio vivo en la </w:t>
+            </w:r>
+            <w:r>
+              <w:rPr>
+                <w:rFonts w:ascii="Times New Roman" w:hAnsi="Times New Roman"/>
+                <w:sz w:val="19"/>
+              </w:rPr>
+              <w:t>Amazonía ecuatoriana. ¿Cómo sabemos si una noticia científica es real o un engaño?' Apertura con la ilustración de la pág. 26 (paleontólogos y fósiles). Preguntas detonantes: ¿Dónde buscamos información científica verídica? ¿Qué es un artículo de divulgaci</w:t>
+            </w:r>
+            <w:r>
+              <w:rPr>
+                <w:rFonts w:ascii="Times New Roman" w:hAnsi="Times New Roman"/>
+                <w:sz w:val="19"/>
+              </w:rPr>
+              <w:t>ón?</w:t>
             </w:r>
           </w:p>
           <w:p>
@@ -3659,7 +4209,14 @@
                 <w:rFonts w:ascii="Times New Roman" w:hAnsi="Times New Roman"/>
                 <w:sz w:val="18"/>
               </w:rPr>
-              <w:t>Imágenes paratextuales de fósiles de la pág. 26 y comparación visual entre una noticia falsa y un artículo formal.</w:t>
+              <w:t xml:space="preserve">Imágenes paratextuales de fósiles de la pág. 26 y comparación visual entre una noticia falsa y </w:t>
+            </w:r>
+            <w:r>
+              <w:rPr>
+                <w:rFonts w:ascii="Times New Roman" w:hAnsi="Times New Roman"/>
+                <w:sz w:val="18"/>
+              </w:rPr>
+              <w:t>un artículo formal.</w:t>
             </w:r>
           </w:p>
           <w:p>
@@ -3708,6 +4265,7 @@
               <w:tblW w:w="0" w:type="auto"/>
               <w:jc w:val="center"/>
               <w:tblLayout w:type="fixed"/>
+              <w:tblLook w:val="04A0" w:firstRow="1" w:lastRow="0" w:firstColumn="1" w:lastColumn="0" w:noHBand="0" w:noVBand="1"/>
             </w:tblPr>
             <w:tblGrid>
               <w:gridCol w:w="683"/>
@@ -3727,6 +4285,7 @@
                 <w:p>
                   <w:pPr>
                     <w:pStyle w:val="Sinespaciado"/>
+                    <w:framePr w:hSpace="141" w:wrap="around" w:vAnchor="text" w:hAnchor="margin" w:y="-138"/>
                     <w:jc w:val="center"/>
                     <w:rPr>
                       <w:rFonts w:ascii="Times New Roman" w:hAnsi="Times New Roman" w:cs="Times New Roman"/>
@@ -3754,6 +4313,7 @@
                 <w:p>
                   <w:pPr>
                     <w:pStyle w:val="Sinespaciado"/>
+                    <w:framePr w:hSpace="141" w:wrap="around" w:vAnchor="text" w:hAnchor="margin" w:y="-138"/>
                     <w:jc w:val="center"/>
                     <w:rPr>
                       <w:rFonts w:ascii="Times New Roman" w:hAnsi="Times New Roman" w:cs="Times New Roman"/>
@@ -3781,6 +4341,7 @@
                 <w:p>
                   <w:pPr>
                     <w:pStyle w:val="Sinespaciado"/>
+                    <w:framePr w:hSpace="141" w:wrap="around" w:vAnchor="text" w:hAnchor="margin" w:y="-138"/>
                     <w:jc w:val="center"/>
                     <w:rPr>
                       <w:rFonts w:ascii="Times New Roman" w:hAnsi="Times New Roman" w:cs="Times New Roman"/>
@@ -3817,7 +4378,15 @@
                 <w:b/>
                 <w:sz w:val="20"/>
               </w:rPr>
-              <w:t>Fase 2: Comprensión – “Disección del Artículo Científico y la Biblioteca”</w:t>
+              <w:t>Fase 2: Comprensión – “Disección del Artículo Científico y la Bib</w:t>
+            </w:r>
+            <w:r>
+              <w:rPr>
+                <w:rFonts w:ascii="Times New Roman" w:hAnsi="Times New Roman"/>
+                <w:b/>
+                <w:sz w:val="20"/>
+              </w:rPr>
+              <w:t>lioteca”</w:t>
             </w:r>
           </w:p>
           <w:p>
@@ -3837,7 +4406,14 @@
                 <w:rFonts w:ascii="Times New Roman" w:hAnsi="Times New Roman"/>
                 <w:sz w:val="19"/>
               </w:rPr>
-              <w:t>Lectura secuencial y comentada del artículo de divulgación científica de las páginas 28 a 31 ('Huellas en el tiempo'). Análisis de su silueta textual: título atrayente, introducción, datos comprobables, glosario técnico y conclusiones. Exploración de las normas de la biblioteca escolar y fichas de préstamo (pág. 37).</w:t>
+              <w:t xml:space="preserve">Lectura secuencial y comentada del artículo de divulgación científica de las páginas 28 a 31 ('Huellas en el tiempo'). Análisis de su silueta textual: título atrayente, introducción, datos comprobables, glosario técnico y conclusiones. </w:t>
+            </w:r>
+            <w:r>
+              <w:rPr>
+                <w:rFonts w:ascii="Times New Roman" w:hAnsi="Times New Roman"/>
+                <w:sz w:val="19"/>
+              </w:rPr>
+              <w:t>Exploración de las normas de la biblioteca escolar y fichas de préstamo (pág. 37).</w:t>
             </w:r>
           </w:p>
           <w:p>
@@ -3922,7 +4498,14 @@
                 <w:rFonts w:ascii="Times New Roman" w:hAnsi="Times New Roman"/>
                 <w:sz w:val="18"/>
               </w:rPr>
-              <w:t>Familiarización con la biblioteca como espacio de investigación autónoma.</w:t>
+              <w:t xml:space="preserve">Familiarización con la biblioteca como </w:t>
+            </w:r>
+            <w:r>
+              <w:rPr>
+                <w:rFonts w:ascii="Times New Roman" w:hAnsi="Times New Roman"/>
+                <w:sz w:val="18"/>
+              </w:rPr>
+              <w:t>espacio de investigación autónoma.</w:t>
             </w:r>
           </w:p>
           <w:tbl>
@@ -3931,6 +4514,7 @@
               <w:tblW w:w="0" w:type="auto"/>
               <w:jc w:val="center"/>
               <w:tblLayout w:type="fixed"/>
+              <w:tblLook w:val="04A0" w:firstRow="1" w:lastRow="0" w:firstColumn="1" w:lastColumn="0" w:noHBand="0" w:noVBand="1"/>
             </w:tblPr>
             <w:tblGrid>
               <w:gridCol w:w="683"/>
@@ -3950,6 +4534,7 @@
                 <w:p>
                   <w:pPr>
                     <w:pStyle w:val="Sinespaciado"/>
+                    <w:framePr w:hSpace="141" w:wrap="around" w:vAnchor="text" w:hAnchor="margin" w:y="-138"/>
                     <w:jc w:val="center"/>
                     <w:rPr>
                       <w:rFonts w:ascii="Times New Roman" w:hAnsi="Times New Roman" w:cs="Times New Roman"/>
@@ -3977,6 +4562,7 @@
                 <w:p>
                   <w:pPr>
                     <w:pStyle w:val="Sinespaciado"/>
+                    <w:framePr w:hSpace="141" w:wrap="around" w:vAnchor="text" w:hAnchor="margin" w:y="-138"/>
                     <w:jc w:val="center"/>
                     <w:rPr>
                       <w:rFonts w:ascii="Times New Roman" w:hAnsi="Times New Roman" w:cs="Times New Roman"/>
@@ -4004,6 +4590,7 @@
                 <w:p>
                   <w:pPr>
                     <w:pStyle w:val="Sinespaciado"/>
+                    <w:framePr w:hSpace="141" w:wrap="around" w:vAnchor="text" w:hAnchor="margin" w:y="-138"/>
                     <w:jc w:val="center"/>
                     <w:rPr>
                       <w:rFonts w:ascii="Times New Roman" w:hAnsi="Times New Roman" w:cs="Times New Roman"/>
@@ -4060,7 +4647,14 @@
                 <w:rFonts w:ascii="Times New Roman" w:hAnsi="Times New Roman"/>
                 <w:sz w:val="19"/>
               </w:rPr>
-              <w:t>Resolución de las actividades de comprensión lectora, inferencias y valoración crítica de las páginas 34 a 36 del libro escolar. En parejas cooperativas, seleccionan un libro de ciencias de la biblioteca del aula y elaboran una ficha técnica de registro bibliográfico completa (pág. 37).</w:t>
+              <w:t>Resolución de las actividades de comprensión lectora, inferencias y valoración crítica de las páginas 34 a 36 del libro escolar</w:t>
+            </w:r>
+            <w:r>
+              <w:rPr>
+                <w:rFonts w:ascii="Times New Roman" w:hAnsi="Times New Roman"/>
+                <w:sz w:val="19"/>
+              </w:rPr>
+              <w:t>. En parejas cooperativas, seleccionan un libro de ciencias de la biblioteca del aula y elaboran una ficha técnica de registro bibliográfico completa (pág. 37).</w:t>
             </w:r>
           </w:p>
           <w:p>
@@ -4072,7 +4666,14 @@
                 <w:rFonts w:ascii="Times New Roman" w:hAnsi="Times New Roman"/>
                 <w:sz w:val="19"/>
               </w:rPr>
-              <w:t>Gamificación: Los equipos que completan el fichaje sin errores de formato reciben la 'Insignia de Curador Científico'.</w:t>
+              <w:t xml:space="preserve">Gamificación: Los equipos que completan el fichaje sin errores de formato reciben la 'Insignia </w:t>
+            </w:r>
+            <w:r>
+              <w:rPr>
+                <w:rFonts w:ascii="Times New Roman" w:hAnsi="Times New Roman"/>
+                <w:sz w:val="19"/>
+              </w:rPr>
+              <w:t>de Curador Científico'.</w:t>
             </w:r>
           </w:p>
           <w:p>
@@ -4145,7 +4746,14 @@
                 <w:rFonts w:ascii="Times New Roman" w:hAnsi="Times New Roman"/>
                 <w:sz w:val="18"/>
               </w:rPr>
-              <w:t>Aplicación directa de los métodos de búsqueda y archivo documental.</w:t>
+              <w:t xml:space="preserve">Aplicación directa de </w:t>
+            </w:r>
+            <w:r>
+              <w:rPr>
+                <w:rFonts w:ascii="Times New Roman" w:hAnsi="Times New Roman"/>
+                <w:sz w:val="18"/>
+              </w:rPr>
+              <w:t>los métodos de búsqueda y archivo documental.</w:t>
             </w:r>
           </w:p>
           <w:tbl>
@@ -4154,6 +4762,7 @@
               <w:tblW w:w="0" w:type="auto"/>
               <w:jc w:val="center"/>
               <w:tblLayout w:type="fixed"/>
+              <w:tblLook w:val="04A0" w:firstRow="1" w:lastRow="0" w:firstColumn="1" w:lastColumn="0" w:noHBand="0" w:noVBand="1"/>
             </w:tblPr>
             <w:tblGrid>
               <w:gridCol w:w="683"/>
@@ -4173,6 +4782,7 @@
                 <w:p>
                   <w:pPr>
                     <w:pStyle w:val="Sinespaciado"/>
+                    <w:framePr w:hSpace="141" w:wrap="around" w:vAnchor="text" w:hAnchor="margin" w:y="-138"/>
                     <w:jc w:val="center"/>
                     <w:rPr>
                       <w:rFonts w:ascii="Times New Roman" w:hAnsi="Times New Roman" w:cs="Times New Roman"/>
@@ -4200,6 +4810,7 @@
                 <w:p>
                   <w:pPr>
                     <w:pStyle w:val="Sinespaciado"/>
+                    <w:framePr w:hSpace="141" w:wrap="around" w:vAnchor="text" w:hAnchor="margin" w:y="-138"/>
                     <w:jc w:val="center"/>
                     <w:rPr>
                       <w:rFonts w:ascii="Times New Roman" w:hAnsi="Times New Roman" w:cs="Times New Roman"/>
@@ -4227,6 +4838,7 @@
                 <w:p>
                   <w:pPr>
                     <w:pStyle w:val="Sinespaciado"/>
+                    <w:framePr w:hSpace="141" w:wrap="around" w:vAnchor="text" w:hAnchor="margin" w:y="-138"/>
                     <w:jc w:val="center"/>
                     <w:rPr>
                       <w:rFonts w:ascii="Times New Roman" w:hAnsi="Times New Roman" w:cs="Times New Roman"/>
@@ -4283,7 +4895,14 @@
                 <w:rFonts w:ascii="Times New Roman" w:hAnsi="Times New Roman"/>
                 <w:sz w:val="19"/>
               </w:rPr>
-              <w:t>Socialización en plenaria: cada dupla presenta un dato científico curioso comprobado en su lectura. Registro del avance en el portafolio escolar.</w:t>
+              <w:t>Socialización en plenaria: cada dupla presenta un dato científico curioso comprobado en su lectura. Registro del avance en el p</w:t>
+            </w:r>
+            <w:r>
+              <w:rPr>
+                <w:rFonts w:ascii="Times New Roman" w:hAnsi="Times New Roman"/>
+                <w:sz w:val="19"/>
+              </w:rPr>
+              <w:t>ortafolio escolar.</w:t>
             </w:r>
           </w:p>
           <w:p>
@@ -4361,7 +4980,15 @@
                 <w:b/>
                 <w:sz w:val="18"/>
               </w:rPr>
-              <w:t xml:space="preserve">Compromiso-Motivación: </w:t>
+              <w:t>Compro</w:t>
+            </w:r>
+            <w:r>
+              <w:rPr>
+                <w:rFonts w:ascii="Times New Roman" w:hAnsi="Times New Roman"/>
+                <w:b/>
+                <w:sz w:val="18"/>
+              </w:rPr>
+              <w:t xml:space="preserve">miso-Motivación: </w:t>
             </w:r>
             <w:r>
               <w:rPr>
@@ -4377,6 +5004,7 @@
               <w:tblW w:w="0" w:type="auto"/>
               <w:jc w:val="center"/>
               <w:tblLayout w:type="fixed"/>
+              <w:tblLook w:val="04A0" w:firstRow="1" w:lastRow="0" w:firstColumn="1" w:lastColumn="0" w:noHBand="0" w:noVBand="1"/>
             </w:tblPr>
             <w:tblGrid>
               <w:gridCol w:w="683"/>
@@ -4396,6 +5024,7 @@
                 <w:p>
                   <w:pPr>
                     <w:pStyle w:val="Sinespaciado"/>
+                    <w:framePr w:hSpace="141" w:wrap="around" w:vAnchor="text" w:hAnchor="margin" w:y="-138"/>
                     <w:jc w:val="center"/>
                     <w:rPr>
                       <w:rFonts w:ascii="Times New Roman" w:hAnsi="Times New Roman" w:cs="Times New Roman"/>
@@ -4423,6 +5052,7 @@
                 <w:p>
                   <w:pPr>
                     <w:pStyle w:val="Sinespaciado"/>
+                    <w:framePr w:hSpace="141" w:wrap="around" w:vAnchor="text" w:hAnchor="margin" w:y="-138"/>
                     <w:jc w:val="center"/>
                     <w:rPr>
                       <w:rFonts w:ascii="Times New Roman" w:hAnsi="Times New Roman" w:cs="Times New Roman"/>
@@ -4450,6 +5080,7 @@
                 <w:p>
                   <w:pPr>
                     <w:pStyle w:val="Sinespaciado"/>
+                    <w:framePr w:hSpace="141" w:wrap="around" w:vAnchor="text" w:hAnchor="margin" w:y="-138"/>
                     <w:jc w:val="center"/>
                     <w:rPr>
                       <w:rFonts w:ascii="Times New Roman" w:hAnsi="Times New Roman" w:cs="Times New Roman"/>
@@ -4489,7 +5120,10 @@
           </w:tcPr>
           <w:p>
             <w:r>
-              <w:t>Realiza inferencias fundamentales y proyectivo-valorativas, valora los contenidos y aspectos de forma a partir de criterios preestablecidos, al monitorear su comprensión mediante el uso de estrategias cognitivas. I.LL.3.3.2.</w:t>
+              <w:t xml:space="preserve">Realiza inferencias fundamentales y proyectivo-valorativas, valora los contenidos y aspectos de forma a partir de criterios preestablecidos, al monitorear su </w:t>
+            </w:r>
+            <w:r>
+              <w:t>comprensión mediante el uso de estrategias cognitivas. I.LL.3.3.2.</w:t>
             </w:r>
           </w:p>
         </w:tc>
@@ -4505,6 +5139,8 @@
           <w:p>
             <w:r>
               <w:t>• Instrumentos: Cuestionario de comprensión lectora y ficha de préstamo bibliotecario evaluada.</w:t>
+            </w:r>
+            <w:r>
               <w:br/>
               <w:t>• Actividades: Resolución de actividades págs. 34-37 del texto de Lengua y Literatura.</w:t>
             </w:r>
@@ -4524,12 +5160,23 @@
           <w:p>
             <w:r>
               <w:t>LL.3.4.1. Relatar textos con secuencia lógica, manejo de conectores y coherencia en el uso de la persona y el tiempo verbal.</w:t>
+            </w:r>
+            <w:r>
               <w:br/>
+            </w:r>
+            <w:r>
               <w:br/>
               <w:t>LL.3.4.6. Autorregular la producción escrita mediante planificación, redacción y revisión.</w:t>
+            </w:r>
+            <w:r>
               <w:br/>
+            </w:r>
+            <w:r>
               <w:br/>
-              <w:t>LL.3.4.10. Integrar en las producciones escritas el verbo (accidentes, modos) y uso del punto y coma (;).</w:t>
+              <w:t>LL.3.4.10. Integrar en las produccione</w:t>
+            </w:r>
+            <w:r>
+              <w:t>s escritas el verbo (accidentes, modos) y uso del punto y coma (;).</w:t>
             </w:r>
           </w:p>
         </w:tc>
@@ -4542,15 +5189,30 @@
           <w:p>
             <w:r>
               <w:t>Tema: Escritura: Escribo una nota científica (planificación y redacción) y Gramática: El verbo (accidentes, modos) y Uso del punto y coma (;)</w:t>
+            </w:r>
+            <w:r>
               <w:br/>
+            </w:r>
+            <w:r>
               <w:br/>
               <w:t>Materiales:</w:t>
+            </w:r>
+            <w:r>
               <w:br/>
-              <w:t>Texto de Lengua 7mo (Páginas 38 a 53)</w:t>
+              <w:t>Texto de Lengua 7mo (Páginas 38 a</w:t>
+            </w:r>
+            <w:r>
+              <w:t xml:space="preserve"> 53)</w:t>
+            </w:r>
+            <w:r>
               <w:br/>
               <w:t>Pizarra y marcadores de colores</w:t>
+            </w:r>
+            <w:r>
               <w:br/>
               <w:t>Cuadernos de trabajo</w:t>
+            </w:r>
+            <w:r>
               <w:br/>
               <w:t>Plantilla de redacción</w:t>
             </w:r>
@@ -4565,9 +5227,7 @@
             </w:tcBorders>
             <w:shd w:val="clear" w:color="auto" w:fill="auto"/>
           </w:tcPr>
-          <w:p>
-            <w:r/>
-          </w:p>
+          <w:p/>
           <w:p>
             <w:pPr>
               <w:spacing w:before="40" w:after="40"/>
@@ -4576,7 +5236,6 @@
               <w:rPr>
                 <w:rFonts w:ascii="Times New Roman" w:hAnsi="Times New Roman"/>
                 <w:b/>
-                <w:sz w:val="22"/>
               </w:rPr>
               <w:t>SEMANA 9 (26/10 al 30/10/2026) · ESCRITURA &amp; GRAMÁTICA</w:t>
             </w:r>
@@ -4592,6 +5251,13 @@
                 <w:sz w:val="21"/>
               </w:rPr>
               <w:t>GAMIFICACIÓN &amp; APRENDIZAJE POR RETOS</w:t>
+            </w:r>
+            <w:r>
+              <w:rPr>
+                <w:rFonts w:ascii="Times New Roman" w:hAnsi="Times New Roman"/>
+                <w:b/>
+                <w:sz w:val="21"/>
+              </w:rPr>
               <w:br/>
             </w:r>
             <w:r>
@@ -4600,8 +5266,21 @@
                 <w:sz w:val="20"/>
               </w:rPr>
               <w:t>Nombre de la actividad:</w:t>
+            </w:r>
+            <w:r>
+              <w:rPr>
+                <w:rFonts w:ascii="Times New Roman" w:hAnsi="Times New Roman"/>
+                <w:sz w:val="20"/>
+              </w:rPr>
               <w:br/>
-              <w:t>“Sala de Redacción: Los Detectives del Verbo y el Punto y Coma” (Texto Pág. 38-53)</w:t>
+              <w:t xml:space="preserve">“Sala de Redacción: Los Detectives del Verbo y el Punto y </w:t>
+            </w:r>
+            <w:r>
+              <w:rPr>
+                <w:rFonts w:ascii="Times New Roman" w:hAnsi="Times New Roman"/>
+                <w:sz w:val="20"/>
+              </w:rPr>
+              <w:t>Coma” (Texto Pág. 38-53)</w:t>
             </w:r>
           </w:p>
           <w:p>
@@ -4634,7 +5313,14 @@
                 <w:rFonts w:ascii="Times New Roman" w:hAnsi="Times New Roman"/>
                 <w:sz w:val="19"/>
               </w:rPr>
-              <w:t>El docente transforma el aula en una Sala de Prensa Científica: 'La revista escolar necesita redactores para publicar notas sobre innovaciones sostenibles y movilidad activa (pág. 38)'. Preguntas: ¿Cómo redactar con exactitud? ¿Por qué los verbos son el motor de las oraciones en una investigación científica?</w:t>
+              <w:t xml:space="preserve">El docente transforma el aula en una Sala de Prensa Científica: 'La revista escolar necesita redactores para publicar notas sobre innovaciones sostenibles y </w:t>
+            </w:r>
+            <w:r>
+              <w:rPr>
+                <w:rFonts w:ascii="Times New Roman" w:hAnsi="Times New Roman"/>
+                <w:sz w:val="19"/>
+              </w:rPr>
+              <w:t>movilidad activa (pág. 38)'. Preguntas: ¿Cómo redactar con exactitud? ¿Por qué los verbos son el motor de las oraciones en una investigación científica?</w:t>
             </w:r>
           </w:p>
           <w:p>
@@ -4646,7 +5332,14 @@
                 <w:rFonts w:ascii="Times New Roman" w:hAnsi="Times New Roman"/>
                 <w:sz w:val="19"/>
               </w:rPr>
-              <w:t>Gamificación: Cada estudiante recibe su credencial de 'Periodista Científico' y un tablero de retos gramaticales.</w:t>
+              <w:t>Gamificación: Cada estudiante recibe su credencial de 'Periodista Científico' y un tablero de retos gra</w:t>
+            </w:r>
+            <w:r>
+              <w:rPr>
+                <w:rFonts w:ascii="Times New Roman" w:hAnsi="Times New Roman"/>
+                <w:sz w:val="19"/>
+              </w:rPr>
+              <w:t>maticales.</w:t>
             </w:r>
           </w:p>
           <w:p>
@@ -4719,7 +5412,14 @@
                 <w:rFonts w:ascii="Times New Roman" w:hAnsi="Times New Roman"/>
                 <w:sz w:val="18"/>
               </w:rPr>
-              <w:t>Sentido de propósito real: escribir para ser leídos por la comunidad escolar.</w:t>
+              <w:t>Sentido d</w:t>
+            </w:r>
+            <w:r>
+              <w:rPr>
+                <w:rFonts w:ascii="Times New Roman" w:hAnsi="Times New Roman"/>
+                <w:sz w:val="18"/>
+              </w:rPr>
+              <w:t>e propósito real: escribir para ser leídos por la comunidad escolar.</w:t>
             </w:r>
           </w:p>
           <w:tbl>
@@ -4728,6 +5428,7 @@
               <w:tblW w:w="0" w:type="auto"/>
               <w:jc w:val="center"/>
               <w:tblLayout w:type="fixed"/>
+              <w:tblLook w:val="04A0" w:firstRow="1" w:lastRow="0" w:firstColumn="1" w:lastColumn="0" w:noHBand="0" w:noVBand="1"/>
             </w:tblPr>
             <w:tblGrid>
               <w:gridCol w:w="683"/>
@@ -4747,6 +5448,7 @@
                 <w:p>
                   <w:pPr>
                     <w:pStyle w:val="Sinespaciado"/>
+                    <w:framePr w:hSpace="141" w:wrap="around" w:vAnchor="text" w:hAnchor="margin" w:y="-138"/>
                     <w:jc w:val="center"/>
                     <w:rPr>
                       <w:rFonts w:ascii="Times New Roman" w:hAnsi="Times New Roman" w:cs="Times New Roman"/>
@@ -4774,6 +5476,7 @@
                 <w:p>
                   <w:pPr>
                     <w:pStyle w:val="Sinespaciado"/>
+                    <w:framePr w:hSpace="141" w:wrap="around" w:vAnchor="text" w:hAnchor="margin" w:y="-138"/>
                     <w:jc w:val="center"/>
                     <w:rPr>
                       <w:rFonts w:ascii="Times New Roman" w:hAnsi="Times New Roman" w:cs="Times New Roman"/>
@@ -4801,6 +5504,7 @@
                 <w:p>
                   <w:pPr>
                     <w:pStyle w:val="Sinespaciado"/>
+                    <w:framePr w:hSpace="141" w:wrap="around" w:vAnchor="text" w:hAnchor="margin" w:y="-138"/>
                     <w:jc w:val="center"/>
                     <w:rPr>
                       <w:rFonts w:ascii="Times New Roman" w:hAnsi="Times New Roman" w:cs="Times New Roman"/>
@@ -4857,7 +5561,21 @@
                 <w:rFonts w:ascii="Times New Roman" w:hAnsi="Times New Roman"/>
                 <w:sz w:val="19"/>
               </w:rPr>
-              <w:t>Planificación textual con la matriz de la página 40 (propósito, destinatario y fuentes). Análisis de los accidentes verbales (persona, número, tiempo) y de los Modos Verbales: indicativo (hechos reales), subjuntivo (deseos/dudas) e imperativo (instrucciones) págs. 42-45. Reglas del uso del punto y coma (;) en enumeraciones complejas (pág. 52).</w:t>
+              <w:t>Planificación textual con la matriz de la página 40 (propósito, destinatario y fuentes</w:t>
+            </w:r>
+            <w:r>
+              <w:rPr>
+                <w:rFonts w:ascii="Times New Roman" w:hAnsi="Times New Roman"/>
+                <w:sz w:val="19"/>
+              </w:rPr>
+              <w:t>). Análisis de los accidentes verbales (persona, número, tiempo) y de los Modos Verbales: indicativo (hechos reales), subjuntivo (deseos/dudas) e imperativo (instrucciones) págs. 42-45. Reglas del uso del punto y coma (;) en enumeraciones complejas (pág. 5</w:t>
+            </w:r>
+            <w:r>
+              <w:rPr>
+                <w:rFonts w:ascii="Times New Roman" w:hAnsi="Times New Roman"/>
+                <w:sz w:val="19"/>
+              </w:rPr>
+              <w:t>2).</w:t>
             </w:r>
           </w:p>
           <w:p>
@@ -4902,7 +5620,14 @@
                 <w:rFonts w:ascii="Times New Roman" w:hAnsi="Times New Roman"/>
                 <w:sz w:val="18"/>
               </w:rPr>
-              <w:t>Tablas cromáticas de conjugación y esquemas sinópticos de modos verbales.</w:t>
+              <w:t xml:space="preserve">Tablas cromáticas de conjugación y esquemas sinópticos de modos </w:t>
+            </w:r>
+            <w:r>
+              <w:rPr>
+                <w:rFonts w:ascii="Times New Roman" w:hAnsi="Times New Roman"/>
+                <w:sz w:val="18"/>
+              </w:rPr>
+              <w:t>verbales.</w:t>
             </w:r>
           </w:p>
           <w:p>
@@ -4951,6 +5676,7 @@
               <w:tblW w:w="0" w:type="auto"/>
               <w:jc w:val="center"/>
               <w:tblLayout w:type="fixed"/>
+              <w:tblLook w:val="04A0" w:firstRow="1" w:lastRow="0" w:firstColumn="1" w:lastColumn="0" w:noHBand="0" w:noVBand="1"/>
             </w:tblPr>
             <w:tblGrid>
               <w:gridCol w:w="683"/>
@@ -4970,6 +5696,7 @@
                 <w:p>
                   <w:pPr>
                     <w:pStyle w:val="Sinespaciado"/>
+                    <w:framePr w:hSpace="141" w:wrap="around" w:vAnchor="text" w:hAnchor="margin" w:y="-138"/>
                     <w:jc w:val="center"/>
                     <w:rPr>
                       <w:rFonts w:ascii="Times New Roman" w:hAnsi="Times New Roman" w:cs="Times New Roman"/>
@@ -4997,6 +5724,7 @@
                 <w:p>
                   <w:pPr>
                     <w:pStyle w:val="Sinespaciado"/>
+                    <w:framePr w:hSpace="141" w:wrap="around" w:vAnchor="text" w:hAnchor="margin" w:y="-138"/>
                     <w:jc w:val="center"/>
                     <w:rPr>
                       <w:rFonts w:ascii="Times New Roman" w:hAnsi="Times New Roman" w:cs="Times New Roman"/>
@@ -5024,6 +5752,7 @@
                 <w:p>
                   <w:pPr>
                     <w:pStyle w:val="Sinespaciado"/>
+                    <w:framePr w:hSpace="141" w:wrap="around" w:vAnchor="text" w:hAnchor="margin" w:y="-138"/>
                     <w:jc w:val="center"/>
                     <w:rPr>
                       <w:rFonts w:ascii="Times New Roman" w:hAnsi="Times New Roman" w:cs="Times New Roman"/>
@@ -5060,7 +5789,15 @@
                 <w:b/>
                 <w:sz w:val="20"/>
               </w:rPr>
-              <w:t>Fase 3: Aplicación – “Redacción en Cabina y Laboratorio de Corrección”</w:t>
+              <w:t>Fase 3: Aplicación – “Redacción en Cabina y</w:t>
+            </w:r>
+            <w:r>
+              <w:rPr>
+                <w:rFonts w:ascii="Times New Roman" w:hAnsi="Times New Roman"/>
+                <w:b/>
+                <w:sz w:val="20"/>
+              </w:rPr>
+              <w:t xml:space="preserve"> Laboratorio de Corrección”</w:t>
             </w:r>
           </w:p>
           <w:p>
@@ -5080,7 +5817,14 @@
                 <w:rFonts w:ascii="Times New Roman" w:hAnsi="Times New Roman"/>
                 <w:sz w:val="19"/>
               </w:rPr>
-              <w:t>Redacción del primer borrador de la nota científica (páginas 46-47) estructurada en 3 párrafos coherentes, empleando verbos precisos y conectores de causa-efecto. Revisión cruzada en parejas aplicando la lista de cotejo del texto escolar.</w:t>
+              <w:t xml:space="preserve">Redacción del primer borrador de la nota científica (páginas 46-47) estructurada en 3 párrafos coherentes, empleando verbos precisos y conectores de causa-efecto. Revisión cruzada en parejas aplicando la lista de </w:t>
+            </w:r>
+            <w:r>
+              <w:rPr>
+                <w:rFonts w:ascii="Times New Roman" w:hAnsi="Times New Roman"/>
+                <w:sz w:val="19"/>
+              </w:rPr>
+              <w:t>cotejo del texto escolar.</w:t>
             </w:r>
           </w:p>
           <w:p>
@@ -5125,7 +5869,14 @@
                 <w:rFonts w:ascii="Times New Roman" w:hAnsi="Times New Roman"/>
                 <w:sz w:val="18"/>
               </w:rPr>
-              <w:t>Plantilla guía de redacción estructurada y rúbrica de autoevaluación pág. 47.</w:t>
+              <w:t xml:space="preserve">Plantilla guía de redacción estructurada y rúbrica de autoevaluación pág. </w:t>
+            </w:r>
+            <w:r>
+              <w:rPr>
+                <w:rFonts w:ascii="Times New Roman" w:hAnsi="Times New Roman"/>
+                <w:sz w:val="18"/>
+              </w:rPr>
+              <w:t>47.</w:t>
             </w:r>
           </w:p>
           <w:p>
@@ -5174,6 +5925,7 @@
               <w:tblW w:w="0" w:type="auto"/>
               <w:jc w:val="center"/>
               <w:tblLayout w:type="fixed"/>
+              <w:tblLook w:val="04A0" w:firstRow="1" w:lastRow="0" w:firstColumn="1" w:lastColumn="0" w:noHBand="0" w:noVBand="1"/>
             </w:tblPr>
             <w:tblGrid>
               <w:gridCol w:w="683"/>
@@ -5193,6 +5945,7 @@
                 <w:p>
                   <w:pPr>
                     <w:pStyle w:val="Sinespaciado"/>
+                    <w:framePr w:hSpace="141" w:wrap="around" w:vAnchor="text" w:hAnchor="margin" w:y="-138"/>
                     <w:jc w:val="center"/>
                     <w:rPr>
                       <w:rFonts w:ascii="Times New Roman" w:hAnsi="Times New Roman" w:cs="Times New Roman"/>
@@ -5220,6 +5973,7 @@
                 <w:p>
                   <w:pPr>
                     <w:pStyle w:val="Sinespaciado"/>
+                    <w:framePr w:hSpace="141" w:wrap="around" w:vAnchor="text" w:hAnchor="margin" w:y="-138"/>
                     <w:jc w:val="center"/>
                     <w:rPr>
                       <w:rFonts w:ascii="Times New Roman" w:hAnsi="Times New Roman" w:cs="Times New Roman"/>
@@ -5247,6 +6001,7 @@
                 <w:p>
                   <w:pPr>
                     <w:pStyle w:val="Sinespaciado"/>
+                    <w:framePr w:hSpace="141" w:wrap="around" w:vAnchor="text" w:hAnchor="margin" w:y="-138"/>
                     <w:jc w:val="center"/>
                     <w:rPr>
                       <w:rFonts w:ascii="Times New Roman" w:hAnsi="Times New Roman" w:cs="Times New Roman"/>
@@ -5315,7 +6070,14 @@
                 <w:rFonts w:ascii="Times New Roman" w:hAnsi="Times New Roman"/>
                 <w:sz w:val="19"/>
               </w:rPr>
-              <w:t>Gamificación: Publicación oficial de artículos y premiación con la medalla 'Pluma de Oro'.</w:t>
+              <w:t>Gamificación: Publicación oficial de artículos y premiación con la m</w:t>
+            </w:r>
+            <w:r>
+              <w:rPr>
+                <w:rFonts w:ascii="Times New Roman" w:hAnsi="Times New Roman"/>
+                <w:sz w:val="19"/>
+              </w:rPr>
+              <w:t>edalla 'Pluma de Oro'.</w:t>
             </w:r>
           </w:p>
           <w:p>
@@ -5397,6 +6159,7 @@
               <w:tblW w:w="0" w:type="auto"/>
               <w:jc w:val="center"/>
               <w:tblLayout w:type="fixed"/>
+              <w:tblLook w:val="04A0" w:firstRow="1" w:lastRow="0" w:firstColumn="1" w:lastColumn="0" w:noHBand="0" w:noVBand="1"/>
             </w:tblPr>
             <w:tblGrid>
               <w:gridCol w:w="683"/>
@@ -5416,6 +6179,7 @@
                 <w:p>
                   <w:pPr>
                     <w:pStyle w:val="Sinespaciado"/>
+                    <w:framePr w:hSpace="141" w:wrap="around" w:vAnchor="text" w:hAnchor="margin" w:y="-138"/>
                     <w:jc w:val="center"/>
                     <w:rPr>
                       <w:rFonts w:ascii="Times New Roman" w:hAnsi="Times New Roman" w:cs="Times New Roman"/>
@@ -5443,6 +6207,7 @@
                 <w:p>
                   <w:pPr>
                     <w:pStyle w:val="Sinespaciado"/>
+                    <w:framePr w:hSpace="141" w:wrap="around" w:vAnchor="text" w:hAnchor="margin" w:y="-138"/>
                     <w:jc w:val="center"/>
                     <w:rPr>
                       <w:rFonts w:ascii="Times New Roman" w:hAnsi="Times New Roman" w:cs="Times New Roman"/>
@@ -5470,6 +6235,7 @@
                 <w:p>
                   <w:pPr>
                     <w:pStyle w:val="Sinespaciado"/>
+                    <w:framePr w:hSpace="141" w:wrap="around" w:vAnchor="text" w:hAnchor="margin" w:y="-138"/>
                     <w:jc w:val="center"/>
                     <w:rPr>
                       <w:rFonts w:ascii="Times New Roman" w:hAnsi="Times New Roman" w:cs="Times New Roman"/>
@@ -5524,7 +6290,12 @@
           </w:tcPr>
           <w:p>
             <w:r>
-              <w:t>• Instrumentos: Rúbrica de producción escrita y prueba de aplicación gramatical.</w:t>
+              <w:t>• Instrumentos: Rúbrica de producción escrita y prueba de aplicació</w:t>
+            </w:r>
+            <w:r>
+              <w:t>n gramatical.</w:t>
+            </w:r>
+            <w:r>
               <w:br/>
               <w:t>• Actividades: Redacción de la nota científica y resolución de talleres págs. 46-53 del texto.</w:t>
             </w:r>
@@ -5543,7 +6314,10 @@
           </w:tcPr>
           <w:p>
             <w:r>
-              <w:t>LL.3.5.1. Reconocer en un texto literario los elementos característicos que le dan sentido (personajes míticos, orígenes del mundo, cosmovisión).</w:t>
+              <w:t xml:space="preserve">LL.3.5.1. Reconocer en un texto literario los elementos característicos que le dan sentido (personajes míticos, orígenes del mundo, </w:t>
+            </w:r>
+            <w:r>
+              <w:t>cosmovisión).</w:t>
             </w:r>
           </w:p>
         </w:tc>
@@ -5556,17 +6330,32 @@
           <w:p>
             <w:r>
               <w:t>Tema: Literatura: Disfruto de los mitos (concepto, características, mitos de creación, dioses y héroes griegos y andinos)</w:t>
+            </w:r>
+            <w:r>
               <w:br/>
+            </w:r>
+            <w:r>
               <w:br/>
               <w:t>Materiales:</w:t>
+            </w:r>
+            <w:r>
               <w:br/>
               <w:t>Texto de Lengua 7mo (Páginas 54 a 65)</w:t>
+            </w:r>
+            <w:r>
               <w:br/>
               <w:t>Pizarra y marcadores</w:t>
+            </w:r>
+            <w:r>
               <w:br/>
               <w:t>Cuadernos</w:t>
+            </w:r>
+            <w:r>
               <w:br/>
-              <w:t>Antología de mitos andinos y universales</w:t>
+              <w:t>Antología de mitos andinos y universal</w:t>
+            </w:r>
+            <w:r>
+              <w:t>es</w:t>
             </w:r>
           </w:p>
         </w:tc>
@@ -5579,9 +6368,7 @@
             </w:tcBorders>
             <w:shd w:val="clear" w:color="auto" w:fill="auto"/>
           </w:tcPr>
-          <w:p>
-            <w:r/>
-          </w:p>
+          <w:p/>
           <w:p>
             <w:pPr>
               <w:spacing w:before="40" w:after="40"/>
@@ -5590,7 +6377,6 @@
               <w:rPr>
                 <w:rFonts w:ascii="Times New Roman" w:hAnsi="Times New Roman"/>
                 <w:b/>
-                <w:sz w:val="22"/>
               </w:rPr>
               <w:t>SEMANA 10 (02/11 al 06/11/2026) · LITERATURA</w:t>
             </w:r>
@@ -5606,6 +6392,13 @@
                 <w:sz w:val="21"/>
               </w:rPr>
               <w:t>PEDAGOGÍA CRÍTICA &amp; GAMIFICACIÓN</w:t>
+            </w:r>
+            <w:r>
+              <w:rPr>
+                <w:rFonts w:ascii="Times New Roman" w:hAnsi="Times New Roman"/>
+                <w:b/>
+                <w:sz w:val="21"/>
+              </w:rPr>
               <w:br/>
             </w:r>
             <w:r>
@@ -5614,6 +6407,12 @@
                 <w:sz w:val="20"/>
               </w:rPr>
               <w:t>Nombre de la actividad:</w:t>
+            </w:r>
+            <w:r>
+              <w:rPr>
+                <w:rFonts w:ascii="Times New Roman" w:hAnsi="Times New Roman"/>
+                <w:sz w:val="20"/>
+              </w:rPr>
               <w:br/>
               <w:t>“La Liga Mitológica: El Despertar de los Dioses y la Cosmovisión Ancestral” (Texto Pág. 54-65)</w:t>
             </w:r>
@@ -5628,7 +6427,15 @@
                 <w:b/>
                 <w:sz w:val="20"/>
               </w:rPr>
-              <w:t>Fase 1: Motivación – “El Llamado de los Dioses y el Origen del Fuego”</w:t>
+              <w:t xml:space="preserve">Fase 1: Motivación – “El Llamado de los Dioses y el </w:t>
+            </w:r>
+            <w:r>
+              <w:rPr>
+                <w:rFonts w:ascii="Times New Roman" w:hAnsi="Times New Roman"/>
+                <w:b/>
+                <w:sz w:val="20"/>
+              </w:rPr>
+              <w:t>Origen del Fuego”</w:t>
             </w:r>
           </w:p>
           <w:p>
@@ -5648,7 +6455,14 @@
                 <w:rFonts w:ascii="Times New Roman" w:hAnsi="Times New Roman"/>
                 <w:sz w:val="19"/>
               </w:rPr>
-              <w:t>Narración dramatizada del mito de la creación del Sol y la Luna (pág. 54). Preguntas detonantes: ¿Por qué los pueblos antiguos crearon relatos sagrados sobre seres sobrenaturales? ¿Qué explicaciones buscaban ante los truenos, volcanes o la muerte? ¿Qué mitos ecuatorianos conocen (Chimborazo y Tungurahua, el mito Cañari)?</w:t>
+              <w:t>Narración dramatizada del mito de la creación del Sol y la Luna (pág. 54). Preguntas detonantes: ¿Por qué los pueblos antiguos crearon relatos sagrados sobre seres sobrenaturales? ¿Qué explicaciones buscaban ante los truenos, v</w:t>
+            </w:r>
+            <w:r>
+              <w:rPr>
+                <w:rFonts w:ascii="Times New Roman" w:hAnsi="Times New Roman"/>
+                <w:sz w:val="19"/>
+              </w:rPr>
+              <w:t>olcanes o la muerte? ¿Qué mitos ecuatorianos conocen (Chimborazo y Tungurahua, el mito Cañari)?</w:t>
             </w:r>
           </w:p>
           <w:p>
@@ -5686,7 +6500,15 @@
                 <w:b/>
                 <w:sz w:val="18"/>
               </w:rPr>
-              <w:t xml:space="preserve">Representación: </w:t>
+              <w:t>Represe</w:t>
+            </w:r>
+            <w:r>
+              <w:rPr>
+                <w:rFonts w:ascii="Times New Roman" w:hAnsi="Times New Roman"/>
+                <w:b/>
+                <w:sz w:val="18"/>
+              </w:rPr>
+              <w:t xml:space="preserve">ntación: </w:t>
             </w:r>
             <w:r>
               <w:rPr>
@@ -5733,7 +6555,14 @@
                 <w:rFonts w:ascii="Times New Roman" w:hAnsi="Times New Roman"/>
                 <w:sz w:val="18"/>
               </w:rPr>
-              <w:t>Conexión con lo sagrado, la fantasía y la identidad intercultural.</w:t>
+              <w:t>Conexión con lo sagrado, la fantasía y la ident</w:t>
+            </w:r>
+            <w:r>
+              <w:rPr>
+                <w:rFonts w:ascii="Times New Roman" w:hAnsi="Times New Roman"/>
+                <w:sz w:val="18"/>
+              </w:rPr>
+              <w:t>idad intercultural.</w:t>
             </w:r>
           </w:p>
           <w:tbl>
@@ -5742,6 +6571,7 @@
               <w:tblW w:w="0" w:type="auto"/>
               <w:jc w:val="center"/>
               <w:tblLayout w:type="fixed"/>
+              <w:tblLook w:val="04A0" w:firstRow="1" w:lastRow="0" w:firstColumn="1" w:lastColumn="0" w:noHBand="0" w:noVBand="1"/>
             </w:tblPr>
             <w:tblGrid>
               <w:gridCol w:w="683"/>
@@ -5761,6 +6591,7 @@
                 <w:p>
                   <w:pPr>
                     <w:pStyle w:val="Sinespaciado"/>
+                    <w:framePr w:hSpace="141" w:wrap="around" w:vAnchor="text" w:hAnchor="margin" w:y="-138"/>
                     <w:jc w:val="center"/>
                     <w:rPr>
                       <w:rFonts w:ascii="Times New Roman" w:hAnsi="Times New Roman" w:cs="Times New Roman"/>
@@ -5788,6 +6619,7 @@
                 <w:p>
                   <w:pPr>
                     <w:pStyle w:val="Sinespaciado"/>
+                    <w:framePr w:hSpace="141" w:wrap="around" w:vAnchor="text" w:hAnchor="margin" w:y="-138"/>
                     <w:jc w:val="center"/>
                     <w:rPr>
                       <w:rFonts w:ascii="Times New Roman" w:hAnsi="Times New Roman" w:cs="Times New Roman"/>
@@ -5815,6 +6647,7 @@
                 <w:p>
                   <w:pPr>
                     <w:pStyle w:val="Sinespaciado"/>
+                    <w:framePr w:hSpace="141" w:wrap="around" w:vAnchor="text" w:hAnchor="margin" w:y="-138"/>
                     <w:jc w:val="center"/>
                     <w:rPr>
                       <w:rFonts w:ascii="Times New Roman" w:hAnsi="Times New Roman" w:cs="Times New Roman"/>
@@ -5871,7 +6704,14 @@
                 <w:rFonts w:ascii="Times New Roman" w:hAnsi="Times New Roman"/>
                 <w:sz w:val="19"/>
               </w:rPr>
-              <w:t>Lectura dialogada de los mitos seleccionados en las páginas 56 a 61. Sistematización de la diferencia entre mito (relato sagrado cosmogónico), leyenda (tradición popular local) y cuento común. Clasificación: mitos cosmogónicos, teogónicos y etiológicos. Análisis de los valores éticos de los héroes y dioses.</w:t>
+              <w:t>Lectura dialogada de los mitos seleccionados en las páginas 56 a 61. Sistematización de la diferencia entre mito (relato sagrado cosmogónico), leyenda</w:t>
+            </w:r>
+            <w:r>
+              <w:rPr>
+                <w:rFonts w:ascii="Times New Roman" w:hAnsi="Times New Roman"/>
+                <w:sz w:val="19"/>
+              </w:rPr>
+              <w:t xml:space="preserve"> (tradición popular local) y cuento común. Clasificación: mitos cosmogónicos, teogónicos y etiológicos. Análisis de los valores éticos de los héroes y dioses.</w:t>
             </w:r>
           </w:p>
           <w:p>
@@ -5883,7 +6723,14 @@
                 <w:rFonts w:ascii="Times New Roman" w:hAnsi="Times New Roman"/>
                 <w:sz w:val="19"/>
               </w:rPr>
-              <w:t>Gamificación: 'El Oráculo de la Sabiduría': Desafíos de preguntas inferenciales sobre símbolos y enseñanzas éticas que otorgan gemas de sabiduría.</w:t>
+              <w:t xml:space="preserve">Gamificación: 'El Oráculo de la Sabiduría': Desafíos de preguntas inferenciales sobre símbolos y </w:t>
+            </w:r>
+            <w:r>
+              <w:rPr>
+                <w:rFonts w:ascii="Times New Roman" w:hAnsi="Times New Roman"/>
+                <w:sz w:val="19"/>
+              </w:rPr>
+              <w:t>enseñanzas éticas que otorgan gemas de sabiduría.</w:t>
             </w:r>
           </w:p>
           <w:p>
@@ -5936,7 +6783,14 @@
                 <w:rFonts w:ascii="Times New Roman" w:hAnsi="Times New Roman"/>
                 <w:sz w:val="18"/>
               </w:rPr>
-              <w:t>Lectura por roles y transcripción creativa del mapa mental en cuaderno.</w:t>
+              <w:t xml:space="preserve">Lectura por roles y transcripción creativa del mapa mental en </w:t>
+            </w:r>
+            <w:r>
+              <w:rPr>
+                <w:rFonts w:ascii="Times New Roman" w:hAnsi="Times New Roman"/>
+                <w:sz w:val="18"/>
+              </w:rPr>
+              <w:t>cuaderno.</w:t>
             </w:r>
           </w:p>
           <w:p>
@@ -5965,6 +6819,7 @@
               <w:tblW w:w="0" w:type="auto"/>
               <w:jc w:val="center"/>
               <w:tblLayout w:type="fixed"/>
+              <w:tblLook w:val="04A0" w:firstRow="1" w:lastRow="0" w:firstColumn="1" w:lastColumn="0" w:noHBand="0" w:noVBand="1"/>
             </w:tblPr>
             <w:tblGrid>
               <w:gridCol w:w="683"/>
@@ -5984,6 +6839,7 @@
                 <w:p>
                   <w:pPr>
                     <w:pStyle w:val="Sinespaciado"/>
+                    <w:framePr w:hSpace="141" w:wrap="around" w:vAnchor="text" w:hAnchor="margin" w:y="-138"/>
                     <w:jc w:val="center"/>
                     <w:rPr>
                       <w:rFonts w:ascii="Times New Roman" w:hAnsi="Times New Roman" w:cs="Times New Roman"/>
@@ -6011,6 +6867,7 @@
                 <w:p>
                   <w:pPr>
                     <w:pStyle w:val="Sinespaciado"/>
+                    <w:framePr w:hSpace="141" w:wrap="around" w:vAnchor="text" w:hAnchor="margin" w:y="-138"/>
                     <w:jc w:val="center"/>
                     <w:rPr>
                       <w:rFonts w:ascii="Times New Roman" w:hAnsi="Times New Roman" w:cs="Times New Roman"/>
@@ -6038,6 +6895,7 @@
                 <w:p>
                   <w:pPr>
                     <w:pStyle w:val="Sinespaciado"/>
+                    <w:framePr w:hSpace="141" w:wrap="around" w:vAnchor="text" w:hAnchor="margin" w:y="-138"/>
                     <w:jc w:val="center"/>
                     <w:rPr>
                       <w:rFonts w:ascii="Times New Roman" w:hAnsi="Times New Roman" w:cs="Times New Roman"/>
@@ -6094,7 +6952,14 @@
                 <w:rFonts w:ascii="Times New Roman" w:hAnsi="Times New Roman"/>
                 <w:sz w:val="19"/>
               </w:rPr>
-              <w:t>Resolución de los talleres de comprensión, interpretación de personajes y análisis de símbolos de las páginas 62 a 65 del texto. Creación de una ficha de personaje mítico (poderes, debilidades, enseñanza moral y dibujo simbólico).</w:t>
+              <w:t>Resolución de los talleres de comprensión, interpretación d</w:t>
+            </w:r>
+            <w:r>
+              <w:rPr>
+                <w:rFonts w:ascii="Times New Roman" w:hAnsi="Times New Roman"/>
+                <w:sz w:val="19"/>
+              </w:rPr>
+              <w:t>e personajes y análisis de símbolos de las páginas 62 a 65 del texto. Creación de una ficha de personaje mítico (poderes, debilidades, enseñanza moral y dibujo simbólico).</w:t>
             </w:r>
           </w:p>
           <w:p>
@@ -6106,7 +6971,14 @@
                 <w:rFonts w:ascii="Times New Roman" w:hAnsi="Times New Roman"/>
                 <w:sz w:val="19"/>
               </w:rPr>
-              <w:t>Gamificación: Duelo de Panteones: Presentación breve del personaje mítico para ganar 'Puntos de Honor'.</w:t>
+              <w:t>Gamificación: Duelo de Panteones: Presentación breve del personaje mítico para ganar</w:t>
+            </w:r>
+            <w:r>
+              <w:rPr>
+                <w:rFonts w:ascii="Times New Roman" w:hAnsi="Times New Roman"/>
+                <w:sz w:val="19"/>
+              </w:rPr>
+              <w:t xml:space="preserve"> 'Puntos de Honor'.</w:t>
             </w:r>
           </w:p>
           <w:p>
@@ -6179,7 +7051,14 @@
                 <w:rFonts w:ascii="Times New Roman" w:hAnsi="Times New Roman"/>
                 <w:sz w:val="18"/>
               </w:rPr>
-              <w:t>Disfrute estético y recreación de la literatura tradicional.</w:t>
+              <w:t xml:space="preserve">Disfrute estético y </w:t>
+            </w:r>
+            <w:r>
+              <w:rPr>
+                <w:rFonts w:ascii="Times New Roman" w:hAnsi="Times New Roman"/>
+                <w:sz w:val="18"/>
+              </w:rPr>
+              <w:t>recreación de la literatura tradicional.</w:t>
             </w:r>
           </w:p>
           <w:tbl>
@@ -6188,6 +7067,7 @@
               <w:tblW w:w="0" w:type="auto"/>
               <w:jc w:val="center"/>
               <w:tblLayout w:type="fixed"/>
+              <w:tblLook w:val="04A0" w:firstRow="1" w:lastRow="0" w:firstColumn="1" w:lastColumn="0" w:noHBand="0" w:noVBand="1"/>
             </w:tblPr>
             <w:tblGrid>
               <w:gridCol w:w="683"/>
@@ -6207,6 +7087,7 @@
                 <w:p>
                   <w:pPr>
                     <w:pStyle w:val="Sinespaciado"/>
+                    <w:framePr w:hSpace="141" w:wrap="around" w:vAnchor="text" w:hAnchor="margin" w:y="-138"/>
                     <w:jc w:val="center"/>
                     <w:rPr>
                       <w:rFonts w:ascii="Times New Roman" w:hAnsi="Times New Roman" w:cs="Times New Roman"/>
@@ -6234,6 +7115,7 @@
                 <w:p>
                   <w:pPr>
                     <w:pStyle w:val="Sinespaciado"/>
+                    <w:framePr w:hSpace="141" w:wrap="around" w:vAnchor="text" w:hAnchor="margin" w:y="-138"/>
                     <w:jc w:val="center"/>
                     <w:rPr>
                       <w:rFonts w:ascii="Times New Roman" w:hAnsi="Times New Roman" w:cs="Times New Roman"/>
@@ -6261,6 +7143,7 @@
                 <w:p>
                   <w:pPr>
                     <w:pStyle w:val="Sinespaciado"/>
+                    <w:framePr w:hSpace="141" w:wrap="around" w:vAnchor="text" w:hAnchor="margin" w:y="-138"/>
                     <w:jc w:val="center"/>
                     <w:rPr>
                       <w:rFonts w:ascii="Times New Roman" w:hAnsi="Times New Roman" w:cs="Times New Roman"/>
@@ -6317,7 +7200,14 @@
                 <w:rFonts w:ascii="Times New Roman" w:hAnsi="Times New Roman"/>
                 <w:sz w:val="19"/>
               </w:rPr>
-              <w:t>Plenaria y asamblea de aula: reflexión sobre la importancia de cuidar las narraciones orales de nuestras nacionalidades indígenas. (Lunes 02 y Martes 03/11: Feriados Día de Difuntos e Independencia de Cuenca).</w:t>
+              <w:t xml:space="preserve">Plenaria y asamblea de aula: reflexión sobre la importancia de cuidar las narraciones orales de nuestras nacionalidades </w:t>
+            </w:r>
+            <w:r>
+              <w:rPr>
+                <w:rFonts w:ascii="Times New Roman" w:hAnsi="Times New Roman"/>
+                <w:sz w:val="19"/>
+              </w:rPr>
+              <w:t>indígenas. (Lunes 02 y Martes 03/11: Feriados Día de Difuntos e Independencia de Cuenca).</w:t>
             </w:r>
           </w:p>
           <w:p>
@@ -6362,7 +7252,14 @@
                 <w:rFonts w:ascii="Times New Roman" w:hAnsi="Times New Roman"/>
                 <w:sz w:val="18"/>
               </w:rPr>
-              <w:t>Mural colectivo de personajes mitológicos.</w:t>
+              <w:t>Mural colectivo de personajes mit</w:t>
+            </w:r>
+            <w:r>
+              <w:rPr>
+                <w:rFonts w:ascii="Times New Roman" w:hAnsi="Times New Roman"/>
+                <w:sz w:val="18"/>
+              </w:rPr>
+              <w:t>ológicos.</w:t>
             </w:r>
           </w:p>
           <w:p>
@@ -6411,6 +7308,7 @@
               <w:tblW w:w="0" w:type="auto"/>
               <w:jc w:val="center"/>
               <w:tblLayout w:type="fixed"/>
+              <w:tblLook w:val="04A0" w:firstRow="1" w:lastRow="0" w:firstColumn="1" w:lastColumn="0" w:noHBand="0" w:noVBand="1"/>
             </w:tblPr>
             <w:tblGrid>
               <w:gridCol w:w="683"/>
@@ -6430,6 +7328,7 @@
                 <w:p>
                   <w:pPr>
                     <w:pStyle w:val="Sinespaciado"/>
+                    <w:framePr w:hSpace="141" w:wrap="around" w:vAnchor="text" w:hAnchor="margin" w:y="-138"/>
                     <w:jc w:val="center"/>
                     <w:rPr>
                       <w:rFonts w:ascii="Times New Roman" w:hAnsi="Times New Roman" w:cs="Times New Roman"/>
@@ -6457,6 +7356,7 @@
                 <w:p>
                   <w:pPr>
                     <w:pStyle w:val="Sinespaciado"/>
+                    <w:framePr w:hSpace="141" w:wrap="around" w:vAnchor="text" w:hAnchor="margin" w:y="-138"/>
                     <w:jc w:val="center"/>
                     <w:rPr>
                       <w:rFonts w:ascii="Times New Roman" w:hAnsi="Times New Roman" w:cs="Times New Roman"/>
@@ -6484,6 +7384,7 @@
                 <w:p>
                   <w:pPr>
                     <w:pStyle w:val="Sinespaciado"/>
+                    <w:framePr w:hSpace="141" w:wrap="around" w:vAnchor="text" w:hAnchor="margin" w:y="-138"/>
                     <w:jc w:val="center"/>
                     <w:rPr>
                       <w:rFonts w:ascii="Times New Roman" w:hAnsi="Times New Roman" w:cs="Times New Roman"/>
@@ -6523,7 +7424,10 @@
           </w:tcPr>
           <w:p>
             <w:r>
-              <w:t>Reconoce en textos de la literatura oral y escrita (mitos) los elementos característicos que les dan sentido; participa en discusiones sobre textos literarios aportando interpretaciones personales. I.LL.3.7.1.</w:t>
+              <w:t xml:space="preserve">Reconoce en textos de la literatura oral y escrita (mitos) los </w:t>
+            </w:r>
+            <w:r>
+              <w:t>elementos característicos que les dan sentido; participa en discusiones sobre textos literarios aportando interpretaciones personales. I.LL.3.7.1.</w:t>
             </w:r>
           </w:p>
         </w:tc>
@@ -6539,8 +7443,13 @@
           <w:p>
             <w:r>
               <w:t>• Instrumentos: Rúbrica de análisis literario y cuadro comparativo de mitos.</w:t>
+            </w:r>
+            <w:r>
               <w:br/>
-              <w:t>• Actividades: Resolución de actividades págs. 62-65 del libro y participación en debates literarios. (Feriados 02 y 03 Noviembre).</w:t>
+              <w:t>• Actividades: Resolución de act</w:t>
+            </w:r>
+            <w:r>
+              <w:t>ividades págs. 62-65 del libro y participación en debates literarios. (Feriados 02 y 03 Noviembre).</w:t>
             </w:r>
           </w:p>
         </w:tc>
@@ -6558,9 +7467,16 @@
           <w:p>
             <w:r>
               <w:t>LL.3.5.1. Recrear textos literarios leídos o escuchados mediante el uso de diversos formatos.</w:t>
+            </w:r>
+            <w:r>
               <w:br/>
+            </w:r>
+            <w:r>
               <w:br/>
-              <w:t>LL.3.4.13. Producir textos de acuerdo con la situación comunicativa en formatos variados (historieta mitológica).</w:t>
+              <w:t xml:space="preserve">LL.3.4.13. Producir textos de acuerdo con la </w:t>
+            </w:r>
+            <w:r>
+              <w:t>situación comunicativa en formatos variados (historieta mitológica).</w:t>
             </w:r>
           </w:p>
         </w:tc>
@@ -6573,15 +7489,30 @@
           <w:p>
             <w:r>
               <w:t>Tema: Escritura creativa: Historieta mitológica y Evaluación sumativa de la Unidad 1</w:t>
+            </w:r>
+            <w:r>
               <w:br/>
+            </w:r>
+            <w:r>
               <w:br/>
               <w:t>Materiales:</w:t>
+            </w:r>
+            <w:r>
               <w:br/>
               <w:t>Texto de Lengua 7mo (Páginas 66 a 71)</w:t>
+            </w:r>
+            <w:r>
               <w:br/>
               <w:t>Cartulinas, reglas y lápices de colores</w:t>
+            </w:r>
+            <w:r>
               <w:br/>
-              <w:t>Pizarra y marcadores</w:t>
+              <w:t>Pizarra y m</w:t>
+            </w:r>
+            <w:r>
+              <w:t>arcadores</w:t>
+            </w:r>
+            <w:r>
               <w:br/>
               <w:t>Cuestionario sumativo de Unidad 1</w:t>
             </w:r>
@@ -6596,9 +7527,7 @@
             </w:tcBorders>
             <w:shd w:val="clear" w:color="auto" w:fill="auto"/>
           </w:tcPr>
-          <w:p>
-            <w:r/>
-          </w:p>
+          <w:p/>
           <w:p>
             <w:pPr>
               <w:spacing w:before="40" w:after="40"/>
@@ -6607,7 +7536,6 @@
               <w:rPr>
                 <w:rFonts w:ascii="Times New Roman" w:hAnsi="Times New Roman"/>
                 <w:b/>
-                <w:sz w:val="22"/>
               </w:rPr>
               <w:t>SEMANA 11 (09/11 al 13/11/2026) · ESCRITURA CREATIVA &amp; CIERRE UNIDAD 1</w:t>
             </w:r>
@@ -6623,6 +7551,13 @@
                 <w:sz w:val="21"/>
               </w:rPr>
               <w:t>JUEGO-TRABAJO &amp; APRENDIZAJE COLABORATIVO</w:t>
+            </w:r>
+            <w:r>
+              <w:rPr>
+                <w:rFonts w:ascii="Times New Roman" w:hAnsi="Times New Roman"/>
+                <w:b/>
+                <w:sz w:val="21"/>
+              </w:rPr>
               <w:br/>
             </w:r>
             <w:r>
@@ -6631,8 +7566,21 @@
                 <w:sz w:val="20"/>
               </w:rPr>
               <w:t>Nombre de la actividad:</w:t>
+            </w:r>
+            <w:r>
+              <w:rPr>
+                <w:rFonts w:ascii="Times New Roman" w:hAnsi="Times New Roman"/>
+                <w:sz w:val="20"/>
+              </w:rPr>
               <w:br/>
-              <w:t>“Estudio Creativo de Cómics y Gran Desafío Sumativo de Unidad 1” (Texto Pág. 66-71)</w:t>
+              <w:t>“Estudio Creativo de Cómics y Gran Desafío Sumativo de Unidad 1” (Texto Pág</w:t>
+            </w:r>
+            <w:r>
+              <w:rPr>
+                <w:rFonts w:ascii="Times New Roman" w:hAnsi="Times New Roman"/>
+                <w:sz w:val="20"/>
+              </w:rPr>
+              <w:t>. 66-71)</w:t>
             </w:r>
           </w:p>
           <w:p>
@@ -6665,7 +7613,14 @@
                 <w:rFonts w:ascii="Times New Roman" w:hAnsi="Times New Roman"/>
                 <w:sz w:val="19"/>
               </w:rPr>
-              <w:t>El docente transforma el aula en un estudio de diseño gráfico y cómic: exposición de muestras de historietas (pág. 66). Exploración de saberes previos: ¿Cómo cuenta una historia la combinación de imagen y texto? ¿Qué tipos de globos de diálogo conocen?</w:t>
+              <w:t xml:space="preserve">El docente transforma el aula en un estudio de diseño gráfico y cómic: exposición de muestras de historietas (pág. 66). Exploración de saberes previos: ¿Cómo cuenta una </w:t>
+            </w:r>
+            <w:r>
+              <w:rPr>
+                <w:rFonts w:ascii="Times New Roman" w:hAnsi="Times New Roman"/>
+                <w:sz w:val="19"/>
+              </w:rPr>
+              <w:t>historia la combinación de imagen y texto? ¿Qué tipos de globos de diálogo conocen?</w:t>
             </w:r>
           </w:p>
           <w:p>
@@ -6710,7 +7665,14 @@
                 <w:rFonts w:ascii="Times New Roman" w:hAnsi="Times New Roman"/>
                 <w:sz w:val="18"/>
               </w:rPr>
-              <w:t>Modelos visuales de tiras cómicas e historietas míticas en págs. 66-67.</w:t>
+              <w:t>Modelos visuales de tiras cómicas e his</w:t>
+            </w:r>
+            <w:r>
+              <w:rPr>
+                <w:rFonts w:ascii="Times New Roman" w:hAnsi="Times New Roman"/>
+                <w:sz w:val="18"/>
+              </w:rPr>
+              <w:t>torietas míticas en págs. 66-67.</w:t>
             </w:r>
           </w:p>
           <w:p>
@@ -6759,6 +7721,7 @@
               <w:tblW w:w="0" w:type="auto"/>
               <w:jc w:val="center"/>
               <w:tblLayout w:type="fixed"/>
+              <w:tblLook w:val="04A0" w:firstRow="1" w:lastRow="0" w:firstColumn="1" w:lastColumn="0" w:noHBand="0" w:noVBand="1"/>
             </w:tblPr>
             <w:tblGrid>
               <w:gridCol w:w="683"/>
@@ -6778,6 +7741,7 @@
                 <w:p>
                   <w:pPr>
                     <w:pStyle w:val="Sinespaciado"/>
+                    <w:framePr w:hSpace="141" w:wrap="around" w:vAnchor="text" w:hAnchor="margin" w:y="-138"/>
                     <w:jc w:val="center"/>
                     <w:rPr>
                       <w:rFonts w:ascii="Times New Roman" w:hAnsi="Times New Roman" w:cs="Times New Roman"/>
@@ -6805,6 +7769,7 @@
                 <w:p>
                   <w:pPr>
                     <w:pStyle w:val="Sinespaciado"/>
+                    <w:framePr w:hSpace="141" w:wrap="around" w:vAnchor="text" w:hAnchor="margin" w:y="-138"/>
                     <w:jc w:val="center"/>
                     <w:rPr>
                       <w:rFonts w:ascii="Times New Roman" w:hAnsi="Times New Roman" w:cs="Times New Roman"/>
@@ -6832,6 +7797,7 @@
                 <w:p>
                   <w:pPr>
                     <w:pStyle w:val="Sinespaciado"/>
+                    <w:framePr w:hSpace="141" w:wrap="around" w:vAnchor="text" w:hAnchor="margin" w:y="-138"/>
                     <w:jc w:val="center"/>
                     <w:rPr>
                       <w:rFonts w:ascii="Times New Roman" w:hAnsi="Times New Roman" w:cs="Times New Roman"/>
@@ -6868,7 +7834,15 @@
                 <w:b/>
                 <w:sz w:val="20"/>
               </w:rPr>
-              <w:t>Fase 2: Comprensión – “El Laboratorio del Cómic y Repaso Conceptual”</w:t>
+              <w:t xml:space="preserve">Fase 2: Comprensión – “El </w:t>
+            </w:r>
+            <w:r>
+              <w:rPr>
+                <w:rFonts w:ascii="Times New Roman" w:hAnsi="Times New Roman"/>
+                <w:b/>
+                <w:sz w:val="20"/>
+              </w:rPr>
+              <w:t>Laboratorio del Cómic y Repaso Conceptual”</w:t>
             </w:r>
           </w:p>
           <w:p>
@@ -6888,7 +7862,14 @@
                 <w:rFonts w:ascii="Times New Roman" w:hAnsi="Times New Roman"/>
                 <w:sz w:val="19"/>
               </w:rPr>
-              <w:t>Análisis técnico de los elementos de la historieta (págs. 67-68): planos visuales, viñetas, globos de diálogo (habla, susurro, pensamiento, grito), cartelas del narrador y onomatopeyas. Repaso de los conceptos nodales de la Unidad 1 (lengua y cultura, discursos, divulgación científica, gramática del verbo y mitos).</w:t>
+              <w:t>Análisis técnico de los elementos de la historieta (págs. 67-68): planos visuales, viñetas, globos de diálogo (habla, susurro, pensamiento, grito), cartelas del narrador y onomatopeyas. Repaso de los co</w:t>
+            </w:r>
+            <w:r>
+              <w:rPr>
+                <w:rFonts w:ascii="Times New Roman" w:hAnsi="Times New Roman"/>
+                <w:sz w:val="19"/>
+              </w:rPr>
+              <w:t>nceptos nodales de la Unidad 1 (lengua y cultura, discursos, divulgación científica, gramática del verbo y mitos).</w:t>
             </w:r>
           </w:p>
           <w:p>
@@ -6973,7 +7954,14 @@
                 <w:rFonts w:ascii="Times New Roman" w:hAnsi="Times New Roman"/>
                 <w:sz w:val="18"/>
               </w:rPr>
-              <w:t>Seguridad y preparación integral para el cierre de la unidad.</w:t>
+              <w:t>Seguridad y preparación integral para el cierre de la unida</w:t>
+            </w:r>
+            <w:r>
+              <w:rPr>
+                <w:rFonts w:ascii="Times New Roman" w:hAnsi="Times New Roman"/>
+                <w:sz w:val="18"/>
+              </w:rPr>
+              <w:t>d.</w:t>
             </w:r>
           </w:p>
           <w:tbl>
@@ -6982,6 +7970,7 @@
               <w:tblW w:w="0" w:type="auto"/>
               <w:jc w:val="center"/>
               <w:tblLayout w:type="fixed"/>
+              <w:tblLook w:val="04A0" w:firstRow="1" w:lastRow="0" w:firstColumn="1" w:lastColumn="0" w:noHBand="0" w:noVBand="1"/>
             </w:tblPr>
             <w:tblGrid>
               <w:gridCol w:w="683"/>
@@ -7001,6 +7990,7 @@
                 <w:p>
                   <w:pPr>
                     <w:pStyle w:val="Sinespaciado"/>
+                    <w:framePr w:hSpace="141" w:wrap="around" w:vAnchor="text" w:hAnchor="margin" w:y="-138"/>
                     <w:jc w:val="center"/>
                     <w:rPr>
                       <w:rFonts w:ascii="Times New Roman" w:hAnsi="Times New Roman" w:cs="Times New Roman"/>
@@ -7028,6 +8018,7 @@
                 <w:p>
                   <w:pPr>
                     <w:pStyle w:val="Sinespaciado"/>
+                    <w:framePr w:hSpace="141" w:wrap="around" w:vAnchor="text" w:hAnchor="margin" w:y="-138"/>
                     <w:jc w:val="center"/>
                     <w:rPr>
                       <w:rFonts w:ascii="Times New Roman" w:hAnsi="Times New Roman" w:cs="Times New Roman"/>
@@ -7055,6 +8046,7 @@
                 <w:p>
                   <w:pPr>
                     <w:pStyle w:val="Sinespaciado"/>
+                    <w:framePr w:hSpace="141" w:wrap="around" w:vAnchor="text" w:hAnchor="margin" w:y="-138"/>
                     <w:jc w:val="center"/>
                     <w:rPr>
                       <w:rFonts w:ascii="Times New Roman" w:hAnsi="Times New Roman" w:cs="Times New Roman"/>
@@ -7111,7 +8103,14 @@
                 <w:rFonts w:ascii="Times New Roman" w:hAnsi="Times New Roman"/>
                 <w:sz w:val="19"/>
               </w:rPr>
-              <w:t>En duplas, los estudiantes adaptan un mito leído a una historieta ilustrada de 4 a 6 viñetas (págs. 68-69) en cartulina. Aplicación individual de la Evaluación Sumativa estructurada de la Unidad 1 (págs. 70-71) para evidenciar el dominio de las destrezas con criterio de desempeño.</w:t>
+              <w:t xml:space="preserve">En duplas, los estudiantes adaptan un mito leído a una historieta ilustrada de 4 a 6 viñetas (págs. 68-69) en cartulina. Aplicación individual de la Evaluación Sumativa </w:t>
+            </w:r>
+            <w:r>
+              <w:rPr>
+                <w:rFonts w:ascii="Times New Roman" w:hAnsi="Times New Roman"/>
+                <w:sz w:val="19"/>
+              </w:rPr>
+              <w:t>estructurada de la Unidad 1 (págs. 70-71) para evidenciar el dominio de las destrezas con criterio de desempeño.</w:t>
             </w:r>
           </w:p>
           <w:p>
@@ -7149,7 +8148,15 @@
                 <w:b/>
                 <w:sz w:val="18"/>
               </w:rPr>
-              <w:t xml:space="preserve">Representación: </w:t>
+              <w:t>Representación</w:t>
+            </w:r>
+            <w:r>
+              <w:rPr>
+                <w:rFonts w:ascii="Times New Roman" w:hAnsi="Times New Roman"/>
+                <w:b/>
+                <w:sz w:val="18"/>
+              </w:rPr>
+              <w:t xml:space="preserve">: </w:t>
             </w:r>
             <w:r>
               <w:rPr>
@@ -7196,7 +8203,14 @@
                 <w:rFonts w:ascii="Times New Roman" w:hAnsi="Times New Roman"/>
                 <w:sz w:val="18"/>
               </w:rPr>
-              <w:t>Demostración tangible de las competencias adquiridas en el ciclo.</w:t>
+              <w:t xml:space="preserve">Demostración tangible de las competencias </w:t>
+            </w:r>
+            <w:r>
+              <w:rPr>
+                <w:rFonts w:ascii="Times New Roman" w:hAnsi="Times New Roman"/>
+                <w:sz w:val="18"/>
+              </w:rPr>
+              <w:t>adquiridas en el ciclo.</w:t>
             </w:r>
           </w:p>
           <w:tbl>
@@ -7205,6 +8219,7 @@
               <w:tblW w:w="0" w:type="auto"/>
               <w:jc w:val="center"/>
               <w:tblLayout w:type="fixed"/>
+              <w:tblLook w:val="04A0" w:firstRow="1" w:lastRow="0" w:firstColumn="1" w:lastColumn="0" w:noHBand="0" w:noVBand="1"/>
             </w:tblPr>
             <w:tblGrid>
               <w:gridCol w:w="683"/>
@@ -7224,6 +8239,7 @@
                 <w:p>
                   <w:pPr>
                     <w:pStyle w:val="Sinespaciado"/>
+                    <w:framePr w:hSpace="141" w:wrap="around" w:vAnchor="text" w:hAnchor="margin" w:y="-138"/>
                     <w:jc w:val="center"/>
                     <w:rPr>
                       <w:rFonts w:ascii="Times New Roman" w:hAnsi="Times New Roman" w:cs="Times New Roman"/>
@@ -7251,6 +8267,7 @@
                 <w:p>
                   <w:pPr>
                     <w:pStyle w:val="Sinespaciado"/>
+                    <w:framePr w:hSpace="141" w:wrap="around" w:vAnchor="text" w:hAnchor="margin" w:y="-138"/>
                     <w:jc w:val="center"/>
                     <w:rPr>
                       <w:rFonts w:ascii="Times New Roman" w:hAnsi="Times New Roman" w:cs="Times New Roman"/>
@@ -7278,6 +8295,7 @@
                 <w:p>
                   <w:pPr>
                     <w:pStyle w:val="Sinespaciado"/>
+                    <w:framePr w:hSpace="141" w:wrap="around" w:vAnchor="text" w:hAnchor="margin" w:y="-138"/>
                     <w:jc w:val="center"/>
                     <w:rPr>
                       <w:rFonts w:ascii="Times New Roman" w:hAnsi="Times New Roman" w:cs="Times New Roman"/>
@@ -7334,7 +8352,14 @@
                 <w:rFonts w:ascii="Times New Roman" w:hAnsi="Times New Roman"/>
                 <w:sz w:val="19"/>
               </w:rPr>
-              <w:t>Exposición pública de las historietas en el mural del pasillo ('Galería Mitológica de Séptimo'). Retroalimentación y felicitación colectiva. (Cierre oficial de las 6 semanas de Planificación Microcurricular al 13 de Noviembre de 2026).</w:t>
+              <w:t>Exposición pública de las historietas en el mural del pasillo ('Galería Mitológica de Séptimo'). Retroalimentación y felicitación colectiva. (Cierre ofi</w:t>
+            </w:r>
+            <w:r>
+              <w:rPr>
+                <w:rFonts w:ascii="Times New Roman" w:hAnsi="Times New Roman"/>
+                <w:sz w:val="19"/>
+              </w:rPr>
+              <w:t>cial de las 6 semanas de Planificación Microcurricular al 13 de Noviembre de 2026).</w:t>
             </w:r>
           </w:p>
           <w:p>
@@ -7399,7 +8424,14 @@
                 <w:rFonts w:ascii="Times New Roman" w:hAnsi="Times New Roman"/>
                 <w:sz w:val="18"/>
               </w:rPr>
-              <w:t>Explicación oral de la historieta a los visitantes.</w:t>
+              <w:t>Ex</w:t>
+            </w:r>
+            <w:r>
+              <w:rPr>
+                <w:rFonts w:ascii="Times New Roman" w:hAnsi="Times New Roman"/>
+                <w:sz w:val="18"/>
+              </w:rPr>
+              <w:t>plicación oral de la historieta a los visitantes.</w:t>
             </w:r>
           </w:p>
           <w:p>
@@ -7428,6 +8460,7 @@
               <w:tblW w:w="0" w:type="auto"/>
               <w:jc w:val="center"/>
               <w:tblLayout w:type="fixed"/>
+              <w:tblLook w:val="04A0" w:firstRow="1" w:lastRow="0" w:firstColumn="1" w:lastColumn="0" w:noHBand="0" w:noVBand="1"/>
             </w:tblPr>
             <w:tblGrid>
               <w:gridCol w:w="683"/>
@@ -7447,6 +8480,7 @@
                 <w:p>
                   <w:pPr>
                     <w:pStyle w:val="Sinespaciado"/>
+                    <w:framePr w:hSpace="141" w:wrap="around" w:vAnchor="text" w:hAnchor="margin" w:y="-138"/>
                     <w:jc w:val="center"/>
                     <w:rPr>
                       <w:rFonts w:ascii="Times New Roman" w:hAnsi="Times New Roman" w:cs="Times New Roman"/>
@@ -7474,6 +8508,7 @@
                 <w:p>
                   <w:pPr>
                     <w:pStyle w:val="Sinespaciado"/>
+                    <w:framePr w:hSpace="141" w:wrap="around" w:vAnchor="text" w:hAnchor="margin" w:y="-138"/>
                     <w:jc w:val="center"/>
                     <w:rPr>
                       <w:rFonts w:ascii="Times New Roman" w:hAnsi="Times New Roman" w:cs="Times New Roman"/>
@@ -7501,6 +8536,7 @@
                 <w:p>
                   <w:pPr>
                     <w:pStyle w:val="Sinespaciado"/>
+                    <w:framePr w:hSpace="141" w:wrap="around" w:vAnchor="text" w:hAnchor="margin" w:y="-138"/>
                     <w:jc w:val="center"/>
                     <w:rPr>
                       <w:rFonts w:ascii="Times New Roman" w:hAnsi="Times New Roman" w:cs="Times New Roman"/>
@@ -7540,7 +8576,10 @@
           </w:tcPr>
           <w:p>
             <w:r>
-              <w:t>Recrea textos literarios leídos mediante adaptaciones creativas (historieta) y demuestra el dominio de destrezas comunicativas de la Unidad 1. I.LL.3.7.2. / I.LL.3.6.1.</w:t>
+              <w:t xml:space="preserve">Recrea textos literarios leídos mediante adaptaciones creativas (historieta) y demuestra el </w:t>
+            </w:r>
+            <w:r>
+              <w:t>dominio de destrezas comunicativas de la Unidad 1. I.LL.3.7.2. / I.LL.3.6.1.</w:t>
             </w:r>
           </w:p>
         </w:tc>
@@ -7556,8 +8595,13 @@
           <w:p>
             <w:r>
               <w:t>• Instrumentos: Rúbrica de la Historieta Mitológica y Evaluación sumativa de Unidad 1 (págs. 70-71).</w:t>
+            </w:r>
+            <w:r>
               <w:br/>
-              <w:t>• Actividades: Exposición de historietas en el mural y prueba escrita de base estructurada. (Cierre oficial de la Planificación Microcurricular: 13/11/2026).</w:t>
+              <w:t xml:space="preserve">• Actividades: Exposición de historietas en el mural y prueba escrita de base </w:t>
+            </w:r>
+            <w:r>
+              <w:t>estructurada. (Cierre oficial de la Planificación Microcurricular: 13/11/2026).</w:t>
             </w:r>
           </w:p>
         </w:tc>
@@ -7575,9 +8619,16 @@
           <w:p>
             <w:r>
               <w:t>LL.3.4.13. Producir textos de diversa índole de acuerdo con la situación comunicativa, mediante formatos y recursos diversos.</w:t>
+            </w:r>
+            <w:r>
               <w:br/>
+            </w:r>
+            <w:r>
               <w:br/>
-              <w:t>LL.3.2.2. Proponer intervenciones orales estructuradas para sustentar el producto del proyecto interdisciplinar.</w:t>
+              <w:t xml:space="preserve">LL.3.2.2. Proponer intervenciones orales </w:t>
+            </w:r>
+            <w:r>
+              <w:t>estructuradas para sustentar el producto del proyecto interdisciplinar.</w:t>
             </w:r>
           </w:p>
         </w:tc>
@@ -7590,13 +8641,26 @@
           <w:p>
             <w:r>
               <w:t>Tema: EJECUCIÓN, CONSOLIDACIÓN Y SOCIALIZACIÓN DEL PROYECTO INTEGRADOR DEL 1ER TRIMESTRE (1 SEMANA · FIN: 23 DE NOVIEMBRE DEL 2026)</w:t>
+            </w:r>
+            <w:r>
               <w:br/>
+            </w:r>
+            <w:r>
               <w:br/>
               <w:t>Materiales:</w:t>
+            </w:r>
+            <w:r>
               <w:br/>
-              <w:t>Guía oficial del Proyecto Interdisciplinario</w:t>
+              <w:t>Guía oficial del Proyecto Interdiscipli</w:t>
+            </w:r>
+            <w:r>
+              <w:t>nario</w:t>
+            </w:r>
+            <w:r>
               <w:br/>
               <w:t>Rúbricas ministeriales de evaluación</w:t>
+            </w:r>
+            <w:r>
               <w:br/>
               <w:t>Materiales para estands del aula, dípticos y carteles ilustrados</w:t>
             </w:r>
@@ -7611,9 +8675,7 @@
             </w:tcBorders>
             <w:shd w:val="clear" w:color="auto" w:fill="auto"/>
           </w:tcPr>
-          <w:p>
-            <w:r/>
-          </w:p>
+          <w:p/>
           <w:p>
             <w:pPr>
               <w:spacing w:before="40" w:after="40"/>
@@ -7622,7 +8684,6 @@
               <w:rPr>
                 <w:rFonts w:ascii="Times New Roman" w:hAnsi="Times New Roman"/>
                 <w:b/>
-                <w:sz w:val="22"/>
               </w:rPr>
               <w:t>SEMANA 12 (16/11 al 23/11/2026) · PROYECTO INTEGRADOR</w:t>
             </w:r>
@@ -7638,6 +8699,13 @@
                 <w:sz w:val="21"/>
               </w:rPr>
               <w:t>APRENDIZAJE BASADO EN PROYECTOS (ABP) &amp; COOPERATIVO</w:t>
+            </w:r>
+            <w:r>
+              <w:rPr>
+                <w:rFonts w:ascii="Times New Roman" w:hAnsi="Times New Roman"/>
+                <w:b/>
+                <w:sz w:val="21"/>
+              </w:rPr>
               <w:br/>
             </w:r>
             <w:r>
@@ -7646,8 +8714,21 @@
                 <w:sz w:val="20"/>
               </w:rPr>
               <w:t>Nombre de la actividad:</w:t>
+            </w:r>
+            <w:r>
+              <w:rPr>
+                <w:rFonts w:ascii="Times New Roman" w:hAnsi="Times New Roman"/>
+                <w:sz w:val="20"/>
+              </w:rPr>
               <w:br/>
-              <w:t>“Feria Interdisciplinar Comunitaria: Mi Huella Sostenible y Ciudadana” (Fin Oficial: 23 de Noviembre de 2026)</w:t>
+              <w:t>“Feria Interdisci</w:t>
+            </w:r>
+            <w:r>
+              <w:rPr>
+                <w:rFonts w:ascii="Times New Roman" w:hAnsi="Times New Roman"/>
+                <w:sz w:val="20"/>
+              </w:rPr>
+              <w:t>plinar Comunitaria: Mi Huella Sostenible y Ciudadana” (Fin Oficial: 23 de Noviembre de 2026)</w:t>
             </w:r>
           </w:p>
           <w:p>
@@ -7680,7 +8761,14 @@
                 <w:rFonts w:ascii="Times New Roman" w:hAnsi="Times New Roman"/>
                 <w:sz w:val="19"/>
               </w:rPr>
-              <w:t>El docente activa la semana culminante del Proyecto Integrador del 1er Trimestre: 'La comunidad de Calderón necesita soluciones prácticas e interdisciplinares para fomentar la lectura, la convivencia pacífica y el cuidado ambiental'. Revisión de las metas y articulación de Lengua y Literatura con Ciencias, Estudios Sociales y Matemática.</w:t>
+              <w:t xml:space="preserve">El docente activa la semana culminante del Proyecto Integrador del 1er Trimestre: 'La </w:t>
+            </w:r>
+            <w:r>
+              <w:rPr>
+                <w:rFonts w:ascii="Times New Roman" w:hAnsi="Times New Roman"/>
+                <w:sz w:val="19"/>
+              </w:rPr>
+              <w:t>comunidad de Calderón necesita soluciones prácticas e interdisciplinares para fomentar la lectura, la convivencia pacífica y el cuidado ambiental'. Revisión de las metas y articulación de Lengua y Literatura con Ciencias, Estudios Sociales y Matemática.</w:t>
             </w:r>
           </w:p>
           <w:p>
@@ -7692,7 +8780,14 @@
                 <w:rFonts w:ascii="Times New Roman" w:hAnsi="Times New Roman"/>
                 <w:sz w:val="19"/>
               </w:rPr>
-              <w:t>Gamificación: Cada equipo consolida su rango de 'Comité de Proyecto Interdisciplinar' y revisa su panel de hitos.</w:t>
+              <w:t>Ga</w:t>
+            </w:r>
+            <w:r>
+              <w:rPr>
+                <w:rFonts w:ascii="Times New Roman" w:hAnsi="Times New Roman"/>
+                <w:sz w:val="19"/>
+              </w:rPr>
+              <w:t>mificación: Cada equipo consolida su rango de 'Comité de Proyecto Interdisciplinar' y revisa su panel de hitos.</w:t>
             </w:r>
           </w:p>
           <w:p>
@@ -7745,7 +8840,14 @@
                 <w:rFonts w:ascii="Times New Roman" w:hAnsi="Times New Roman"/>
                 <w:sz w:val="18"/>
               </w:rPr>
-              <w:t>Asamblea de equipo y distribución equitativa de roles para la sustentación.</w:t>
+              <w:t>Asamblea de equipo y</w:t>
+            </w:r>
+            <w:r>
+              <w:rPr>
+                <w:rFonts w:ascii="Times New Roman" w:hAnsi="Times New Roman"/>
+                <w:sz w:val="18"/>
+              </w:rPr>
+              <w:t xml:space="preserve"> distribución equitativa de roles para la sustentación.</w:t>
             </w:r>
           </w:p>
           <w:p>
@@ -7774,6 +8876,7 @@
               <w:tblW w:w="0" w:type="auto"/>
               <w:jc w:val="center"/>
               <w:tblLayout w:type="fixed"/>
+              <w:tblLook w:val="04A0" w:firstRow="1" w:lastRow="0" w:firstColumn="1" w:lastColumn="0" w:noHBand="0" w:noVBand="1"/>
             </w:tblPr>
             <w:tblGrid>
               <w:gridCol w:w="683"/>
@@ -7793,6 +8896,7 @@
                 <w:p>
                   <w:pPr>
                     <w:pStyle w:val="Sinespaciado"/>
+                    <w:framePr w:hSpace="141" w:wrap="around" w:vAnchor="text" w:hAnchor="margin" w:y="-138"/>
                     <w:jc w:val="center"/>
                     <w:rPr>
                       <w:rFonts w:ascii="Times New Roman" w:hAnsi="Times New Roman" w:cs="Times New Roman"/>
@@ -7820,6 +8924,7 @@
                 <w:p>
                   <w:pPr>
                     <w:pStyle w:val="Sinespaciado"/>
+                    <w:framePr w:hSpace="141" w:wrap="around" w:vAnchor="text" w:hAnchor="margin" w:y="-138"/>
                     <w:jc w:val="center"/>
                     <w:rPr>
                       <w:rFonts w:ascii="Times New Roman" w:hAnsi="Times New Roman" w:cs="Times New Roman"/>
@@ -7847,6 +8952,7 @@
                 <w:p>
                   <w:pPr>
                     <w:pStyle w:val="Sinespaciado"/>
+                    <w:framePr w:hSpace="141" w:wrap="around" w:vAnchor="text" w:hAnchor="margin" w:y="-138"/>
                     <w:jc w:val="center"/>
                     <w:rPr>
                       <w:rFonts w:ascii="Times New Roman" w:hAnsi="Times New Roman" w:cs="Times New Roman"/>
@@ -7903,7 +9009,14 @@
                 <w:rFonts w:ascii="Times New Roman" w:hAnsi="Times New Roman"/>
                 <w:sz w:val="19"/>
               </w:rPr>
-              <w:t>Talleres de coevaluación y retroalimentación entre equipos de estudiantes: revisión del informe escrito, claridad de las conclusiones, ortografía y preparación del material de soporte (trípticos, carteles, maquetas o presentaciones digitales).</w:t>
+              <w:t>Taller</w:t>
+            </w:r>
+            <w:r>
+              <w:rPr>
+                <w:rFonts w:ascii="Times New Roman" w:hAnsi="Times New Roman"/>
+                <w:sz w:val="19"/>
+              </w:rPr>
+              <w:t>es de coevaluación y retroalimentación entre equipos de estudiantes: revisión del informe escrito, claridad de las conclusiones, ortografía y preparación del material de soporte (trípticos, carteles, maquetas o presentaciones digitales).</w:t>
             </w:r>
           </w:p>
           <w:p>
@@ -7915,7 +9028,14 @@
                 <w:rFonts w:ascii="Times New Roman" w:hAnsi="Times New Roman"/>
                 <w:sz w:val="19"/>
               </w:rPr>
-              <w:t>Gamificación: Dinámica 'Control de Calidad': Obtienen sellos de validación al solventar observaciones de mejora.</w:t>
+              <w:t>Gamificación: Diná</w:t>
+            </w:r>
+            <w:r>
+              <w:rPr>
+                <w:rFonts w:ascii="Times New Roman" w:hAnsi="Times New Roman"/>
+                <w:sz w:val="19"/>
+              </w:rPr>
+              <w:t>mica 'Control de Calidad': Obtienen sellos de validación al solventar observaciones de mejora.</w:t>
             </w:r>
           </w:p>
           <w:p>
@@ -7968,7 +9088,14 @@
                 <w:rFonts w:ascii="Times New Roman" w:hAnsi="Times New Roman"/>
                 <w:sz w:val="18"/>
               </w:rPr>
-              <w:t>Diálogo asertivo y sugerencias fundamentadas entre pares.</w:t>
+              <w:t xml:space="preserve">Diálogo asertivo y sugerencias </w:t>
+            </w:r>
+            <w:r>
+              <w:rPr>
+                <w:rFonts w:ascii="Times New Roman" w:hAnsi="Times New Roman"/>
+                <w:sz w:val="18"/>
+              </w:rPr>
+              <w:t>fundamentadas entre pares.</w:t>
             </w:r>
           </w:p>
           <w:p>
@@ -7997,6 +9124,7 @@
               <w:tblW w:w="0" w:type="auto"/>
               <w:jc w:val="center"/>
               <w:tblLayout w:type="fixed"/>
+              <w:tblLook w:val="04A0" w:firstRow="1" w:lastRow="0" w:firstColumn="1" w:lastColumn="0" w:noHBand="0" w:noVBand="1"/>
             </w:tblPr>
             <w:tblGrid>
               <w:gridCol w:w="683"/>
@@ -8016,6 +9144,7 @@
                 <w:p>
                   <w:pPr>
                     <w:pStyle w:val="Sinespaciado"/>
+                    <w:framePr w:hSpace="141" w:wrap="around" w:vAnchor="text" w:hAnchor="margin" w:y="-138"/>
                     <w:jc w:val="center"/>
                     <w:rPr>
                       <w:rFonts w:ascii="Times New Roman" w:hAnsi="Times New Roman" w:cs="Times New Roman"/>
@@ -8043,6 +9172,7 @@
                 <w:p>
                   <w:pPr>
                     <w:pStyle w:val="Sinespaciado"/>
+                    <w:framePr w:hSpace="141" w:wrap="around" w:vAnchor="text" w:hAnchor="margin" w:y="-138"/>
                     <w:jc w:val="center"/>
                     <w:rPr>
                       <w:rFonts w:ascii="Times New Roman" w:hAnsi="Times New Roman" w:cs="Times New Roman"/>
@@ -8070,6 +9200,7 @@
                 <w:p>
                   <w:pPr>
                     <w:pStyle w:val="Sinespaciado"/>
+                    <w:framePr w:hSpace="141" w:wrap="around" w:vAnchor="text" w:hAnchor="margin" w:y="-138"/>
                     <w:jc w:val="center"/>
                     <w:rPr>
                       <w:rFonts w:ascii="Times New Roman" w:hAnsi="Times New Roman" w:cs="Times New Roman"/>
@@ -8126,7 +9257,14 @@
                 <w:rFonts w:ascii="Times New Roman" w:hAnsi="Times New Roman"/>
                 <w:sz w:val="19"/>
               </w:rPr>
-              <w:t>Montaje de estands en el aula y presentación oficial del Proyecto Integrador ante la comunidad escolar (docentes, directivos y compañeros). Cada equipo realiza una sustentación oral aplicando las técnicas de oratoria aprendidas (contacto visual, modulación vocal, respuestas claras a preguntas del público).</w:t>
+              <w:t>Montaje de estands en el aula y presentación oficial del Proyecto Integ</w:t>
+            </w:r>
+            <w:r>
+              <w:rPr>
+                <w:rFonts w:ascii="Times New Roman" w:hAnsi="Times New Roman"/>
+                <w:sz w:val="19"/>
+              </w:rPr>
+              <w:t>rador ante la comunidad escolar (docentes, directivos y compañeros). Cada equipo realiza una sustentación oral aplicando las técnicas de oratoria aprendidas (contacto visual, modulación vocal, respuestas claras a preguntas del público).</w:t>
             </w:r>
           </w:p>
           <w:p>
@@ -8138,7 +9276,14 @@
                 <w:rFonts w:ascii="Times New Roman" w:hAnsi="Times New Roman"/>
                 <w:sz w:val="19"/>
               </w:rPr>
-              <w:t>Gamificación: Evaluación con rúbrica ministerial y entrega de insignias de 'Impacto Comunitario'.</w:t>
+              <w:t>Gamificación: Evalu</w:t>
+            </w:r>
+            <w:r>
+              <w:rPr>
+                <w:rFonts w:ascii="Times New Roman" w:hAnsi="Times New Roman"/>
+                <w:sz w:val="19"/>
+              </w:rPr>
+              <w:t>ación con rúbrica ministerial y entrega de insignias de 'Impacto Comunitario'.</w:t>
             </w:r>
           </w:p>
           <w:p>
@@ -8191,7 +9336,14 @@
                 <w:rFonts w:ascii="Times New Roman" w:hAnsi="Times New Roman"/>
                 <w:sz w:val="18"/>
               </w:rPr>
-              <w:t>Disertación oral fluida y demostración práctica del producto final.</w:t>
+              <w:t>Disertación oral fluida y demostración práctica del producto fi</w:t>
+            </w:r>
+            <w:r>
+              <w:rPr>
+                <w:rFonts w:ascii="Times New Roman" w:hAnsi="Times New Roman"/>
+                <w:sz w:val="18"/>
+              </w:rPr>
+              <w:t>nal.</w:t>
             </w:r>
           </w:p>
           <w:p>
@@ -8220,6 +9372,7 @@
               <w:tblW w:w="0" w:type="auto"/>
               <w:jc w:val="center"/>
               <w:tblLayout w:type="fixed"/>
+              <w:tblLook w:val="04A0" w:firstRow="1" w:lastRow="0" w:firstColumn="1" w:lastColumn="0" w:noHBand="0" w:noVBand="1"/>
             </w:tblPr>
             <w:tblGrid>
               <w:gridCol w:w="683"/>
@@ -8239,6 +9392,7 @@
                 <w:p>
                   <w:pPr>
                     <w:pStyle w:val="Sinespaciado"/>
+                    <w:framePr w:hSpace="141" w:wrap="around" w:vAnchor="text" w:hAnchor="margin" w:y="-138"/>
                     <w:jc w:val="center"/>
                     <w:rPr>
                       <w:rFonts w:ascii="Times New Roman" w:hAnsi="Times New Roman" w:cs="Times New Roman"/>
@@ -8266,6 +9420,7 @@
                 <w:p>
                   <w:pPr>
                     <w:pStyle w:val="Sinespaciado"/>
+                    <w:framePr w:hSpace="141" w:wrap="around" w:vAnchor="text" w:hAnchor="margin" w:y="-138"/>
                     <w:jc w:val="center"/>
                     <w:rPr>
                       <w:rFonts w:ascii="Times New Roman" w:hAnsi="Times New Roman" w:cs="Times New Roman"/>
@@ -8293,6 +9448,7 @@
                 <w:p>
                   <w:pPr>
                     <w:pStyle w:val="Sinespaciado"/>
+                    <w:framePr w:hSpace="141" w:wrap="around" w:vAnchor="text" w:hAnchor="margin" w:y="-138"/>
                     <w:jc w:val="center"/>
                     <w:rPr>
                       <w:rFonts w:ascii="Times New Roman" w:hAnsi="Times New Roman" w:cs="Times New Roman"/>
@@ -8349,7 +9505,14 @@
                 <w:rFonts w:ascii="Times New Roman" w:hAnsi="Times New Roman"/>
                 <w:sz w:val="19"/>
               </w:rPr>
-              <w:t>Evaluación sumativa oficial mediante la Rúbrica Ministerial del Proyecto Integrador (30% de la calificación sumativa trimestral). Registro y entrega del informe consolidado. Cierre de la etapa académica al **23 de Noviembre del 2026**.</w:t>
+              <w:t xml:space="preserve">Evaluación sumativa oficial mediante la Rúbrica </w:t>
+            </w:r>
+            <w:r>
+              <w:rPr>
+                <w:rFonts w:ascii="Times New Roman" w:hAnsi="Times New Roman"/>
+                <w:sz w:val="19"/>
+              </w:rPr>
+              <w:t>Ministerial del Proyecto Integrador (30% de la calificación sumativa trimestral). Registro y entrega del informe consolidado. Cierre de la etapa académica al **23 de Noviembre del 2026**.</w:t>
             </w:r>
           </w:p>
           <w:p>
@@ -8361,7 +9524,14 @@
                 <w:rFonts w:ascii="Times New Roman" w:hAnsi="Times New Roman"/>
                 <w:sz w:val="19"/>
               </w:rPr>
-              <w:t>Gamificación: Clausura institucional del proyecto con certificación de honor a los equipos destacados.</w:t>
+              <w:t xml:space="preserve">Gamificación: Clausura institucional del proyecto con certificación </w:t>
+            </w:r>
+            <w:r>
+              <w:rPr>
+                <w:rFonts w:ascii="Times New Roman" w:hAnsi="Times New Roman"/>
+                <w:sz w:val="19"/>
+              </w:rPr>
+              <w:t>de honor a los equipos destacados.</w:t>
             </w:r>
           </w:p>
           <w:p>
@@ -8434,7 +9604,14 @@
                 <w:rFonts w:ascii="Times New Roman" w:hAnsi="Times New Roman"/>
                 <w:sz w:val="18"/>
               </w:rPr>
-              <w:t>Coronación exitosa del Proyecto Integrador del Primer Trimestre.</w:t>
+              <w:t>Coro</w:t>
+            </w:r>
+            <w:r>
+              <w:rPr>
+                <w:rFonts w:ascii="Times New Roman" w:hAnsi="Times New Roman"/>
+                <w:sz w:val="18"/>
+              </w:rPr>
+              <w:t>nación exitosa del Proyecto Integrador del Primer Trimestre.</w:t>
             </w:r>
           </w:p>
           <w:tbl>
@@ -8443,6 +9620,7 @@
               <w:tblW w:w="0" w:type="auto"/>
               <w:jc w:val="center"/>
               <w:tblLayout w:type="fixed"/>
+              <w:tblLook w:val="04A0" w:firstRow="1" w:lastRow="0" w:firstColumn="1" w:lastColumn="0" w:noHBand="0" w:noVBand="1"/>
             </w:tblPr>
             <w:tblGrid>
               <w:gridCol w:w="683"/>
@@ -8462,6 +9640,7 @@
                 <w:p>
                   <w:pPr>
                     <w:pStyle w:val="Sinespaciado"/>
+                    <w:framePr w:hSpace="141" w:wrap="around" w:vAnchor="text" w:hAnchor="margin" w:y="-138"/>
                     <w:jc w:val="center"/>
                     <w:rPr>
                       <w:rFonts w:ascii="Times New Roman" w:hAnsi="Times New Roman" w:cs="Times New Roman"/>
@@ -8489,6 +9668,7 @@
                 <w:p>
                   <w:pPr>
                     <w:pStyle w:val="Sinespaciado"/>
+                    <w:framePr w:hSpace="141" w:wrap="around" w:vAnchor="text" w:hAnchor="margin" w:y="-138"/>
                     <w:jc w:val="center"/>
                     <w:rPr>
                       <w:rFonts w:ascii="Times New Roman" w:hAnsi="Times New Roman" w:cs="Times New Roman"/>
@@ -8516,6 +9696,7 @@
                 <w:p>
                   <w:pPr>
                     <w:pStyle w:val="Sinespaciado"/>
+                    <w:framePr w:hSpace="141" w:wrap="around" w:vAnchor="text" w:hAnchor="margin" w:y="-138"/>
                     <w:jc w:val="center"/>
                     <w:rPr>
                       <w:rFonts w:ascii="Times New Roman" w:hAnsi="Times New Roman" w:cs="Times New Roman"/>
@@ -8570,7 +9751,12 @@
           </w:tcPr>
           <w:p>
             <w:r>
-              <w:t>• Instrumentos: Rúbrica oficial ministerial del Proyecto Integrador (30% sumativo del proyecto).</w:t>
+              <w:t xml:space="preserve">• </w:t>
+            </w:r>
+            <w:r>
+              <w:t>Instrumentos: Rúbrica oficial ministerial del Proyecto Integrador (30% sumativo del proyecto).</w:t>
+            </w:r>
+            <w:r>
               <w:br/>
               <w:t>• Actividades: Sustentación oral del producto final y exposición en feria de aula interdisciplinar (FIN: 23 DE NOVIEMBRE DEL 2026).</w:t>
             </w:r>
@@ -8606,7 +9792,6 @@
                 <w:sz w:val="32"/>
                 <w:szCs w:val="20"/>
               </w:rPr>
-              <w:lastRenderedPageBreak/>
               <w:t>FIRMAS DE RESPONSABILIDAD</w:t>
             </w:r>
           </w:p>
@@ -8759,8 +9944,12 @@
           <w:p>
             <w:r>
               <w:t>Docente:</w:t>
+            </w:r>
+            <w:r>
               <w:br/>
               <w:t>Lic. Klever Yánez</w:t>
+            </w:r>
+            <w:r>
               <w:br/>
               <w:t>Docente de Lengua y Literatura</w:t>
             </w:r>
@@ -8779,6 +9968,8 @@
           <w:p>
             <w:r>
               <w:t>Coordinador/a del área/año:</w:t>
+            </w:r>
+            <w:r>
               <w:br/>
               <w:t>Lic. Rocío Chauca</w:t>
             </w:r>
@@ -8797,6 +9988,8 @@
           <w:p>
             <w:r>
               <w:t>Junta de Directores:</w:t>
+            </w:r>
+            <w:r>
               <w:br/>
               <w:t>Comisión Técnico Pedagógica</w:t>
             </w:r>
@@ -8814,6 +10007,8 @@
           <w:p>
             <w:r>
               <w:t>Vicerrector:</w:t>
+            </w:r>
+            <w:r>
               <w:br/>
               <w:t>MSc. Mauricio Guachamín</w:t>
             </w:r>
@@ -9024,7 +10219,7 @@
 </file>
 
 <file path=word/numbering.xml><?xml version="1.0" encoding="utf-8"?>
-<w:numbering xmlns:wpc="http://schemas.microsoft.com/office/word/2010/wordprocessingCanvas" xmlns:cx="http://schemas.microsoft.com/office/drawing/2014/chartex" xmlns:mc="http://schemas.openxmlformats.org/markup-compatibility/2006" xmlns:o="urn:schemas-microsoft-com:office:office" xmlns:r="http://schemas.openxmlformats.org/officeDocument/2006/relationships" xmlns:m="http://schemas.openxmlformats.org/officeDocument/2006/math" xmlns:v="urn:schemas-microsoft-com:vml" xmlns:wp14="http://schemas.microsoft.com/office/word/2010/wordprocessingDrawing" xmlns:wp="http://schemas.openxmlformats.org/drawingml/2006/wordprocessingDrawing" xmlns:w10="urn:schemas-microsoft-com:office:word" xmlns:w="http://schemas.openxmlformats.org/wordprocessingml/2006/main" xmlns:w14="http://schemas.microsoft.com/office/word/2010/wordml" xmlns:w15="http://schemas.microsoft.com/office/word/2012/wordml" xmlns:w16se="http://schemas.microsoft.com/office/word/2015/wordml/symex" xmlns:wpg="http://schemas.microsoft.com/office/word/2010/wordprocessingGroup" xmlns:wpi="http://schemas.microsoft.com/office/word/2010/wordprocessingInk" xmlns:wne="http://schemas.microsoft.com/office/word/2006/wordml" xmlns:wps="http://schemas.microsoft.com/office/word/2010/wordprocessingShape" mc:Ignorable="w14 w15 w16se wp14">
+<w:numbering xmlns:wpc="http://schemas.microsoft.com/office/word/2010/wordprocessingCanvas" xmlns:cx="http://schemas.microsoft.com/office/drawing/2014/chartex" xmlns:cx1="http://schemas.microsoft.com/office/drawing/2015/9/8/chartex" xmlns:cx2="http://schemas.microsoft.com/office/drawing/2015/10/21/chartex" xmlns:cx3="http://schemas.microsoft.com/office/drawing/2016/5/9/chartex" xmlns:cx4="http://schemas.microsoft.com/office/drawing/2016/5/10/chartex" xmlns:cx5="http://schemas.microsoft.com/office/drawing/2016/5/11/chartex" xmlns:cx6="http://schemas.microsoft.com/office/drawing/2016/5/12/chartex" xmlns:cx7="http://schemas.microsoft.com/office/drawing/2016/5/13/chartex" xmlns:cx8="http://schemas.microsoft.com/office/drawing/2016/5/14/chartex" xmlns:mc="http://schemas.openxmlformats.org/markup-compatibility/2006" xmlns:aink="http://schemas.microsoft.com/office/drawing/2016/ink" xmlns:am3d="http://schemas.microsoft.com/office/drawing/2017/model3d" xmlns:o="urn:schemas-microsoft-com:office:office" xmlns:r="http://schemas.openxmlformats.org/officeDocument/2006/relationships" xmlns:m="http://schemas.openxmlformats.org/officeDocument/2006/math" xmlns:v="urn:schemas-microsoft-com:vml" xmlns:wp14="http://schemas.microsoft.com/office/word/2010/wordprocessingDrawing" xmlns:wp="http://schemas.openxmlformats.org/drawingml/2006/wordprocessingDrawing" xmlns:w10="urn:schemas-microsoft-com:office:word" xmlns:w="http://schemas.openxmlformats.org/wordprocessingml/2006/main" xmlns:w14="http://schemas.microsoft.com/office/word/2010/wordml" xmlns:w15="http://schemas.microsoft.com/office/word/2012/wordml" xmlns:w16cex="http://schemas.microsoft.com/office/word/2018/wordml/cex" xmlns:w16cid="http://schemas.microsoft.com/office/word/2016/wordml/cid" xmlns:w16="http://schemas.microsoft.com/office/word/2018/wordml" xmlns:w16sdtdh="http://schemas.microsoft.com/office/word/2020/wordml/sdtdatahash" xmlns:w16se="http://schemas.microsoft.com/office/word/2015/wordml/symex" xmlns:wpg="http://schemas.microsoft.com/office/word/2010/wordprocessingGroup" xmlns:wpi="http://schemas.microsoft.com/office/word/2010/wordprocessingInk" xmlns:wne="http://schemas.microsoft.com/office/word/2006/wordml" xmlns:wps="http://schemas.microsoft.com/office/word/2010/wordprocessingShape" mc:Ignorable="w14 w15 w16se w16cid w16 w16cex w16sdtdh wp14">
   <w:abstractNum w:abstractNumId="0" w15:restartNumberingAfterBreak="0">
     <w:nsid w:val="01EB4031"/>
     <w:multiLevelType w:val="hybridMultilevel"/>
@@ -13082,7 +14277,7 @@
 </file>
 
 <file path=word/styles.xml><?xml version="1.0" encoding="utf-8"?>
-<w:styles xmlns:mc="http://schemas.openxmlformats.org/markup-compatibility/2006" xmlns:r="http://schemas.openxmlformats.org/officeDocument/2006/relationships" xmlns:w="http://schemas.openxmlformats.org/wordprocessingml/2006/main" xmlns:w14="http://schemas.microsoft.com/office/word/2010/wordml" xmlns:w15="http://schemas.microsoft.com/office/word/2012/wordml" xmlns:w16se="http://schemas.microsoft.com/office/word/2015/wordml/symex" mc:Ignorable="w14 w15 w16se">
+<w:styles xmlns:mc="http://schemas.openxmlformats.org/markup-compatibility/2006" xmlns:r="http://schemas.openxmlformats.org/officeDocument/2006/relationships" xmlns:w="http://schemas.openxmlformats.org/wordprocessingml/2006/main" xmlns:w14="http://schemas.microsoft.com/office/word/2010/wordml" xmlns:w15="http://schemas.microsoft.com/office/word/2012/wordml" xmlns:w16cex="http://schemas.microsoft.com/office/word/2018/wordml/cex" xmlns:w16cid="http://schemas.microsoft.com/office/word/2016/wordml/cid" xmlns:w16="http://schemas.microsoft.com/office/word/2018/wordml" xmlns:w16sdtdh="http://schemas.microsoft.com/office/word/2020/wordml/sdtdatahash" xmlns:w16se="http://schemas.microsoft.com/office/word/2015/wordml/symex" mc:Ignorable="w14 w15 w16se w16cid w16 w16cex w16sdtdh">
   <w:docDefaults>
     <w:rPrDefault>
       <w:rPr>
@@ -13098,7 +14293,7 @@
       </w:pPr>
     </w:pPrDefault>
   </w:docDefaults>
-  <w:latentStyles w:defLockedState="0" w:defUIPriority="99" w:defSemiHidden="0" w:defUnhideWhenUsed="0" w:defQFormat="0" w:count="371">
+  <w:latentStyles w:defLockedState="0" w:defUIPriority="99" w:defSemiHidden="0" w:defUnhideWhenUsed="0" w:defQFormat="0" w:count="376">
     <w:lsdException w:name="Normal" w:uiPriority="0" w:qFormat="1"/>
     <w:lsdException w:name="heading 1" w:uiPriority="9" w:qFormat="1"/>
     <w:lsdException w:name="heading 2" w:semiHidden="1" w:uiPriority="9" w:unhideWhenUsed="1" w:qFormat="1"/>
@@ -13204,7 +14399,6 @@
     <w:lsdException w:name="HTML Sample" w:semiHidden="1" w:unhideWhenUsed="1"/>
     <w:lsdException w:name="HTML Typewriter" w:semiHidden="1" w:unhideWhenUsed="1"/>
     <w:lsdException w:name="HTML Variable" w:semiHidden="1" w:unhideWhenUsed="1"/>
-    <w:lsdException w:name="Normal Table" w:semiHidden="1" w:unhideWhenUsed="1"/>
     <w:lsdException w:name="annotation subject" w:semiHidden="1" w:unhideWhenUsed="1"/>
     <w:lsdException w:name="No List" w:semiHidden="1" w:unhideWhenUsed="1"/>
     <w:lsdException w:name="Outline List 1" w:semiHidden="1" w:unhideWhenUsed="1"/>
@@ -13247,11 +14441,8 @@
     <w:lsdException w:name="Table Contemporary" w:semiHidden="1" w:unhideWhenUsed="1"/>
     <w:lsdException w:name="Table Elegant" w:semiHidden="1" w:unhideWhenUsed="1"/>
     <w:lsdException w:name="Table Professional" w:semiHidden="1" w:unhideWhenUsed="1"/>
-    <w:lsdException w:name="Table Subtle 1" w:semiHidden="1" w:unhideWhenUsed="1"/>
     <w:lsdException w:name="Table Subtle 2" w:semiHidden="1" w:unhideWhenUsed="1"/>
     <w:lsdException w:name="Table Web 1" w:semiHidden="1" w:unhideWhenUsed="1"/>
-    <w:lsdException w:name="Table Web 2" w:semiHidden="1" w:unhideWhenUsed="1"/>
-    <w:lsdException w:name="Table Web 3" w:semiHidden="1" w:unhideWhenUsed="1"/>
     <w:lsdException w:name="Balloon Text" w:semiHidden="1" w:unhideWhenUsed="1"/>
     <w:lsdException w:name="Table Grid" w:uiPriority="39"/>
     <w:lsdException w:name="Table Theme" w:semiHidden="1" w:unhideWhenUsed="1"/>
@@ -13470,6 +14661,11 @@
     <w:lsdException w:name="List Table 5 Dark Accent 6" w:uiPriority="50"/>
     <w:lsdException w:name="List Table 6 Colorful Accent 6" w:uiPriority="51"/>
     <w:lsdException w:name="List Table 7 Colorful Accent 6" w:uiPriority="52"/>
+    <w:lsdException w:name="Mention" w:semiHidden="1" w:unhideWhenUsed="1"/>
+    <w:lsdException w:name="Smart Hyperlink" w:semiHidden="1" w:unhideWhenUsed="1"/>
+    <w:lsdException w:name="Hashtag" w:semiHidden="1" w:unhideWhenUsed="1"/>
+    <w:lsdException w:name="Unresolved Mention" w:semiHidden="1" w:unhideWhenUsed="1"/>
+    <w:lsdException w:name="Smart Link" w:semiHidden="1" w:unhideWhenUsed="1"/>
   </w:latentStyles>
   <w:style w:type="paragraph" w:default="1" w:styleId="Normal">
     <w:name w:val="Normal"/>
@@ -14408,8 +15604,8 @@
       <w:iCs/>
     </w:rPr>
   </w:style>
-  <w:style w:type="character" w:customStyle="1" w:styleId="UnresolvedMention">
-    <w:name w:val="Unresolved Mention"/>
+  <w:style w:type="character" w:customStyle="1" w:styleId="Mencinsinresolver2">
+    <w:name w:val="Mención sin resolver2"/>
     <w:basedOn w:val="Fuentedeprrafopredeter"/>
     <w:uiPriority w:val="99"/>
     <w:semiHidden/>

</xml_diff>